<commit_message>
modified manuscript for revision
</commit_message>
<xml_diff>
--- a/docs/Reviewer response.docx
+++ b/docs/Reviewer response.docx
@@ -660,27 +660,7 @@
           <w:bCs/>
           <w:color w:val="4C94D8" w:themeColor="text2" w:themeTint="80"/>
         </w:rPr>
-        <w:t xml:space="preserve">Section 2. "Literature Review" is comprehensive and well referenced. However, the authors are strongly encouraged to include a comparative summary table that systematically lists the key features of each reviewed study (e.g., data source, temporal resolution of emission factors, emission metrics, geographic scope, treatment of on-site renewables, </w:t>
-      </w:r>
-      <w:proofErr w:type="spellStart"/>
-      <w:r>
-        <w:rPr>
-          <w:rFonts w:ascii="Calibri" w:eastAsia="Calibri" w:hAnsi="Calibri" w:cs="Calibri"/>
-          <w:b/>
-          <w:bCs/>
-          <w:color w:val="4C94D8" w:themeColor="text2" w:themeTint="80"/>
-        </w:rPr>
-        <w:t>etc</w:t>
-      </w:r>
-      <w:proofErr w:type="spellEnd"/>
-      <w:r>
-        <w:rPr>
-          <w:rFonts w:ascii="Calibri" w:eastAsia="Calibri" w:hAnsi="Calibri" w:cs="Calibri"/>
-          <w:b/>
-          <w:bCs/>
-          <w:color w:val="4C94D8" w:themeColor="text2" w:themeTint="80"/>
-        </w:rPr>
-        <w:t>), with checkmarks or indicators to show which features are addressed in each paper. Including the proposed study in the same table would clearly demonstrate its contribution and facilitate direct comparison with existing work.</w:t>
+        <w:t>Section 2. "Literature Review" is comprehensive and well referenced. However, the authors are strongly encouraged to include a comparative summary table that systematically lists the key features of each reviewed study (e.g., data source, temporal resolution of emission factors, emission metrics, geographic scope, treatment of on-site renewables, etc), with checkmarks or indicators to show which features are addressed in each paper. Including the proposed study in the same table would clearly demonstrate its contribution and facilitate direct comparison with existing work.</w:t>
       </w:r>
     </w:p>
     <w:p>
@@ -2512,10 +2492,6 @@
         <w:jc w:val="both"/>
         <w:rPr>
           <w:rFonts w:ascii="Calibri" w:eastAsia="Calibri" w:hAnsi="Calibri" w:cs="Calibri"/>
-          <w:i/>
-          <w:iCs/>
-          <w:u w:val="single"/>
-          <w:lang w:val="en-US"/>
         </w:rPr>
       </w:pPr>
       <w:r>
@@ -2528,17 +2504,87 @@
         <w:rPr>
           <w:rFonts w:ascii="Calibri" w:eastAsia="Calibri" w:hAnsi="Calibri" w:cs="Calibri"/>
         </w:rPr>
-        <w:t>: “</w:t>
-      </w:r>
-      <w:r>
-        <w:rPr>
-          <w:rFonts w:ascii="Calibri" w:eastAsia="Calibri" w:hAnsi="Calibri" w:cs="Calibri"/>
-          <w:i/>
-          <w:iCs/>
-          <w:u w:val="single"/>
-          <w:lang w:val="en-US"/>
-        </w:rPr>
-        <w:t>Additional results for other grid regions, along with avoided emissions assessed using long-run marginal emissions rates (LRMER), are provided in the supplementary material. Across all 18 grid regions, we observed consistent patterns: annual emission factors systematically oversimplify operational emission intensity. Figure 9 summarizes these by presenting the median fractional error of aggregated net operational emissions and avoided emissions across results from all regions. For the current and near-future conditions (2025), annual, seasonal, and time-of-day emission factors yield median errors of approximately 5%, which may be considered acceptable given their simplicity and limited sensitivity to grid development scenarios. However, these factors become unreliable under 2050 projections, whereas season-hour and month-hour emission factors consistently maintain median errors below 5%. Notably, the reported median fractional errors reflect deviations attributable solely to temporal resolution simplification, independent of uncertainty in the underlying emission intensity estimates.</w:t>
+        <w:t xml:space="preserve">: </w:t>
+      </w:r>
+    </w:p>
+    <w:p>
+      <w:pPr>
+        <w:spacing w:before="240" w:after="240"/>
+        <w:jc w:val="both"/>
+        <w:rPr>
+          <w:rFonts w:ascii="Calibri" w:eastAsia="Calibri" w:hAnsi="Calibri" w:cs="Calibri"/>
+          <w:i/>
+          <w:iCs/>
+          <w:u w:val="single"/>
+        </w:rPr>
+      </w:pPr>
+      <w:r>
+        <w:rPr>
+          <w:rFonts w:ascii="Calibri" w:eastAsia="Calibri" w:hAnsi="Calibri" w:cs="Calibri"/>
+        </w:rPr>
+        <w:t>“</w:t>
+      </w:r>
+      <w:r>
+        <w:rPr>
+          <w:rFonts w:ascii="Calibri" w:eastAsia="Calibri" w:hAnsi="Calibri" w:cs="Calibri"/>
+          <w:i/>
+          <w:iCs/>
+          <w:u w:val="single"/>
+        </w:rPr>
+        <w:t>4.4 Other grid regions</w:t>
+      </w:r>
+    </w:p>
+    <w:p>
+      <w:pPr>
+        <w:spacing w:before="240" w:after="240"/>
+        <w:jc w:val="both"/>
+        <w:rPr>
+          <w:rFonts w:ascii="Calibri" w:eastAsia="Calibri" w:hAnsi="Calibri" w:cs="Calibri"/>
+          <w:i/>
+          <w:iCs/>
+          <w:u w:val="single"/>
+          <w:lang w:val="en-US"/>
+        </w:rPr>
+      </w:pPr>
+      <w:r>
+        <w:rPr>
+          <w:rFonts w:ascii="Calibri" w:eastAsia="Calibri" w:hAnsi="Calibri" w:cs="Calibri"/>
+          <w:i/>
+          <w:iCs/>
+          <w:u w:val="single"/>
+          <w:lang w:val="en-US"/>
+        </w:rPr>
+        <w:t xml:space="preserve">Additional results for other grid regions, along with avoided emissions assessed using long-run marginal emissions rates (LRMER), are provided in the supplementary material. Across all 18 grid regions, we observed consistent patterns: annual emission factors systematically oversimplify operational emission intensity. Figure 9 summarizes these by presenting the median fractional error of aggregated net operational emissions and avoided emissions across results from all regions. For the current and near-future conditions (2025), annual, seasonal, and time-of-day emission factors yield median errors of approximately 5%, which may be considered acceptable given their simplicity and limited sensitivity to grid development scenarios. However, these factors become unreliable </w:t>
+      </w:r>
+      <w:r>
+        <w:rPr>
+          <w:rFonts w:ascii="Calibri" w:eastAsia="Calibri" w:hAnsi="Calibri" w:cs="Calibri"/>
+          <w:i/>
+          <w:iCs/>
+          <w:u w:val="single"/>
+          <w:lang w:val="en-US"/>
+        </w:rPr>
+        <w:t xml:space="preserve">when onsite solar generation continues to increase and gradually </w:t>
+      </w:r>
+      <w:r>
+        <w:rPr>
+          <w:rFonts w:ascii="Calibri" w:eastAsia="Calibri" w:hAnsi="Calibri" w:cs="Calibri"/>
+          <w:i/>
+          <w:iCs/>
+          <w:u w:val="single"/>
+          <w:lang w:val="en-US"/>
+        </w:rPr>
+        <w:t>offsets the energy usage of the building</w:t>
+      </w:r>
+      <w:r>
+        <w:rPr>
+          <w:rFonts w:ascii="Calibri" w:eastAsia="Calibri" w:hAnsi="Calibri" w:cs="Calibri"/>
+          <w:i/>
+          <w:iCs/>
+          <w:u w:val="single"/>
+          <w:lang w:val="en-US"/>
+        </w:rPr>
+        <w:t>, whereas season-hour and month-hour emission factors consistently maintain median errors below 5%. Notably, the reported median fractional errors reflect deviations attributable solely to temporal resolution simplification, independent of uncertainty in the underlying emission intensity estimates.</w:t>
       </w:r>
       <w:r>
         <w:rPr>
@@ -2575,10 +2621,10 @@
         </w:rPr>
         <w:lastRenderedPageBreak/>
         <w:drawing>
-          <wp:inline distT="0" distB="0" distL="0" distR="0" wp14:anchorId="2751A682" wp14:editId="6004A94B">
+          <wp:inline distT="0" distB="0" distL="0" distR="0" wp14:anchorId="59640199" wp14:editId="7D6A4278">
             <wp:extent cx="5943600" cy="5200650"/>
             <wp:effectExtent l="0" t="0" r="0" b="6350"/>
-            <wp:docPr id="1377324802" name="Picture 1" descr="A graph of the number of carbon emissions&#10;&#10;AI-generated content may be incorrect."/>
+            <wp:docPr id="354905300" name="Picture 1" descr="A graph of the number of carbon emissions&#10;&#10;AI-generated content may be incorrect."/>
             <wp:cNvGraphicFramePr>
               <a:graphicFrameLocks xmlns:a="http://schemas.openxmlformats.org/drawingml/2006/main" noChangeAspect="1"/>
             </wp:cNvGraphicFramePr>
@@ -2586,7 +2632,7 @@
               <a:graphicData uri="http://schemas.openxmlformats.org/drawingml/2006/picture">
                 <pic:pic xmlns:pic="http://schemas.openxmlformats.org/drawingml/2006/picture">
                   <pic:nvPicPr>
-                    <pic:cNvPr id="1377324802" name="Picture 1" descr="A graph of the number of carbon emissions&#10;&#10;AI-generated content may be incorrect."/>
+                    <pic:cNvPr id="354905300" name="Picture 1" descr="A graph of the number of carbon emissions&#10;&#10;AI-generated content may be incorrect."/>
                     <pic:cNvPicPr/>
                   </pic:nvPicPr>
                   <pic:blipFill>
@@ -2660,8 +2706,21 @@
           <w:u w:val="single"/>
           <w:lang w:val="en-US"/>
         </w:rPr>
-        <w:t>Figure 10 presents the aggregated median fractional error associated with quantifying avoided emissions from excess onsite solar generation exported to the grid. The results show that avoided emissions are substantially more difficult to assess, particularly under future grid projections. When static emission factors are used, absolute deviations frequently exceed 100%. If adopting a 5% error threshold as an acceptable trade-off for simplification (indicated by the red dashed line), only season-hour and month-hour emission factors consistently meet this criterion. These findings suggest that for near net-zero carbon buildings, grid emission factors should be resolved at least at the season-hour level to support credible avoided-emissions accounting</w:t>
-      </w:r>
+        <w:t>Figure 10 presents the aggregated median fractional error associated with quantifying avoided emissions from excess onsite solar generation exported to the grid. The results show that avoided emissions are substantially more difficult to assess, particularly under future grid projections. When static emission factors are used, absolute deviations can exceed 100%. If adopting a 10% error threshold as an acceptable trade-off for simplification (indicated by the red dashed line), only season-hour and month-hour emission factors mostly meet this criterion. The figure also shows substantially higher fractional errors at lower capacities of onsite generation (e.g., 25% PV offset). As observed in the CAISO results, when grid export opportunities are limited to only a few hours per year, simplifying temporal resolution can produce exceptionally large deviations in avoided emissions estimates.</w:t>
+      </w:r>
+    </w:p>
+    <w:p>
+      <w:pPr>
+        <w:spacing w:before="240" w:after="240"/>
+        <w:jc w:val="both"/>
+        <w:rPr>
+          <w:rFonts w:ascii="Calibri" w:eastAsia="Calibri" w:hAnsi="Calibri" w:cs="Calibri"/>
+          <w:i/>
+          <w:iCs/>
+          <w:u w:val="single"/>
+          <w:lang w:val="en-US"/>
+        </w:rPr>
+      </w:pPr>
       <w:r>
         <w:rPr>
           <w:rFonts w:ascii="Calibri" w:eastAsia="Calibri" w:hAnsi="Calibri" w:cs="Calibri"/>
@@ -2697,10 +2756,10 @@
         </w:rPr>
         <w:lastRenderedPageBreak/>
         <w:drawing>
-          <wp:inline distT="0" distB="0" distL="0" distR="0" wp14:anchorId="10D761EF" wp14:editId="66B59AE8">
-            <wp:extent cx="5943600" cy="5200650"/>
-            <wp:effectExtent l="0" t="0" r="0" b="6350"/>
-            <wp:docPr id="1912274297" name="Picture 2" descr="A graph of different colored bars&#10;&#10;AI-generated content may be incorrect."/>
+          <wp:inline distT="0" distB="0" distL="0" distR="0" wp14:anchorId="697FAC46" wp14:editId="4E6514B2">
+            <wp:extent cx="5943600" cy="5943600"/>
+            <wp:effectExtent l="0" t="0" r="0" b="0"/>
+            <wp:docPr id="82902227" name="Picture 4" descr="A graph of different types of carbon emissions&#10;&#10;AI-generated content may be incorrect."/>
             <wp:cNvGraphicFramePr>
               <a:graphicFrameLocks xmlns:a="http://schemas.openxmlformats.org/drawingml/2006/main" noChangeAspect="1"/>
             </wp:cNvGraphicFramePr>
@@ -2708,7 +2767,7 @@
               <a:graphicData uri="http://schemas.openxmlformats.org/drawingml/2006/picture">
                 <pic:pic xmlns:pic="http://schemas.openxmlformats.org/drawingml/2006/picture">
                   <pic:nvPicPr>
-                    <pic:cNvPr id="1912274297" name="Picture 2" descr="A graph of different colored bars&#10;&#10;AI-generated content may be incorrect."/>
+                    <pic:cNvPr id="82902227" name="Picture 4" descr="A graph of different types of carbon emissions&#10;&#10;AI-generated content may be incorrect."/>
                     <pic:cNvPicPr/>
                   </pic:nvPicPr>
                   <pic:blipFill>
@@ -2726,7 +2785,7 @@
                   <pic:spPr>
                     <a:xfrm>
                       <a:off x="0" y="0"/>
-                      <a:ext cx="5943600" cy="5200650"/>
+                      <a:ext cx="5943600" cy="5943600"/>
                     </a:xfrm>
                     <a:prstGeom prst="rect">
                       <a:avLst/>
@@ -2848,6 +2907,7 @@
         <w:rPr>
           <w:rFonts w:ascii="Calibri" w:eastAsia="Calibri" w:hAnsi="Calibri" w:cs="Calibri"/>
         </w:rPr>
+        <w:lastRenderedPageBreak/>
         <w:t xml:space="preserve">all 18 grid regions. </w:t>
       </w:r>
       <w:r>
@@ -2881,7 +2941,6 @@
           <w:bCs/>
           <w:color w:val="4C94D8" w:themeColor="text2" w:themeTint="80"/>
         </w:rPr>
-        <w:lastRenderedPageBreak/>
         <w:t>In section 5.2. "Grid generation mix impact," the discussion of grid generation mix is informative but highly region-specific, particularly for CAISO and ERCOT. Therefore, the authors are recommended to more clearly distinguish general insights from region-dependent observations.</w:t>
       </w:r>
     </w:p>
@@ -3063,6 +3122,7 @@
         <w:rPr>
           <w:rFonts w:ascii="Calibri" w:eastAsia="Calibri" w:hAnsi="Calibri" w:cs="Calibri"/>
         </w:rPr>
+        <w:lastRenderedPageBreak/>
         <w:t xml:space="preserve">The </w:t>
       </w:r>
       <w:r>
@@ -3085,18 +3145,7 @@
           <w:u w:val="single"/>
           <w:lang w:val="en-US"/>
         </w:rPr>
-        <w:t xml:space="preserve">Future work should incorporate dynamic building energy-use projections that account for climate change, evolving occupancy patterns, and behavioral shifts, which were treated as static in this analysis. In addition, this study applied the open-source dataset of measured building electricity as an aggregated group across all grid regions, potentially </w:t>
-      </w:r>
-      <w:r>
-        <w:rPr>
-          <w:rFonts w:ascii="Calibri" w:eastAsia="Calibri" w:hAnsi="Calibri" w:cs="Calibri"/>
-          <w:i/>
-          <w:iCs/>
-          <w:u w:val="single"/>
-          <w:lang w:val="en-US"/>
-        </w:rPr>
-        <w:lastRenderedPageBreak/>
-        <w:t>underrepresenting climate-specific construction and operational characteristics. Future analyses should therefore integrate regionally calibrated models to more accurately capture geographic variability in building performance and grid interactions.</w:t>
+        <w:t>Future work should incorporate dynamic building energy-use projections that account for climate change, evolving occupancy patterns, and behavioral shifts, which were treated as static in this analysis. In addition, this study applied the open-source dataset of measured building electricity as an aggregated group across all grid regions, potentially underrepresenting climate-specific construction and operational characteristics. Future analyses should therefore integrate regionally calibrated models to more accurately capture geographic variability in building performance and grid interactions.</w:t>
       </w:r>
       <w:r>
         <w:rPr>
@@ -3357,17 +3406,8 @@
           <w:bCs/>
           <w:color w:val="4C94D8" w:themeColor="text2" w:themeTint="80"/>
         </w:rPr>
-        <w:t xml:space="preserve">The rationale for exclusively using Long-Run Marginal Emission Rates (LRMER) and excluding Short-Run Marginal Emission Rates (SRMER) is inadequately justified. The argument that SRMER may "over-predict" emissions for future profiles is insufficient. Provide a more robust justification with citations, or alternatively, include a sensitivity </w:t>
-      </w:r>
-      <w:r>
-        <w:rPr>
-          <w:rFonts w:ascii="Calibri" w:eastAsia="Calibri" w:hAnsi="Calibri" w:cs="Calibri"/>
-          <w:b/>
-          <w:bCs/>
-          <w:color w:val="4C94D8" w:themeColor="text2" w:themeTint="80"/>
-        </w:rPr>
         <w:lastRenderedPageBreak/>
-        <w:t>analysis in the supplementary material showing why LRMER was chosen for this accounting-focused study, contrasting it with potential results using SRMER.</w:t>
+        <w:t>The rationale for exclusively using Long-Run Marginal Emission Rates (LRMER) and excluding Short-Run Marginal Emission Rates (SRMER) is inadequately justified. The argument that SRMER may "over-predict" emissions for future profiles is insufficient. Provide a more robust justification with citations, or alternatively, include a sensitivity analysis in the supplementary material showing why LRMER was chosen for this accounting-focused study, contrasting it with potential results using SRMER.</w:t>
       </w:r>
     </w:p>
     <w:p>
@@ -3479,21 +3519,7 @@
         <w:rPr>
           <w:rFonts w:ascii="Calibri" w:eastAsia="Calibri" w:hAnsi="Calibri" w:cs="Calibri"/>
         </w:rPr>
-        <w:t xml:space="preserve">vol. 119, Nov. 28, 2022. </w:t>
-      </w:r>
-      <w:proofErr w:type="spellStart"/>
-      <w:r>
-        <w:rPr>
-          <w:rFonts w:ascii="Calibri" w:eastAsia="Calibri" w:hAnsi="Calibri" w:cs="Calibri"/>
-        </w:rPr>
-        <w:t>doi</w:t>
-      </w:r>
-      <w:proofErr w:type="spellEnd"/>
-      <w:r>
-        <w:rPr>
-          <w:rFonts w:ascii="Calibri" w:eastAsia="Calibri" w:hAnsi="Calibri" w:cs="Calibri"/>
-        </w:rPr>
-        <w:t xml:space="preserve">: </w:t>
+        <w:t xml:space="preserve">vol. 119, Nov. 28, 2022. doi: </w:t>
       </w:r>
       <w:hyperlink r:id="rId7" w:history="1">
         <w:r>
@@ -3542,19 +3568,11 @@
         </w:rPr>
         <w:t xml:space="preserve"> </w:t>
       </w:r>
-      <w:proofErr w:type="spellStart"/>
-      <w:r>
-        <w:rPr>
-          <w:rFonts w:ascii="Calibri" w:eastAsia="Calibri" w:hAnsi="Calibri" w:cs="Calibri"/>
-        </w:rPr>
-        <w:t>doi</w:t>
-      </w:r>
-      <w:proofErr w:type="spellEnd"/>
-      <w:r>
-        <w:rPr>
-          <w:rFonts w:ascii="Calibri" w:eastAsia="Calibri" w:hAnsi="Calibri" w:cs="Calibri"/>
-        </w:rPr>
-        <w:t>:</w:t>
+      <w:r>
+        <w:rPr>
+          <w:rFonts w:ascii="Calibri" w:eastAsia="Calibri" w:hAnsi="Calibri" w:cs="Calibri"/>
+        </w:rPr>
+        <w:t>doi:</w:t>
       </w:r>
       <w:r>
         <w:rPr>
@@ -3602,21 +3620,7 @@
         <w:rPr>
           <w:rFonts w:ascii="Calibri" w:eastAsia="Calibri" w:hAnsi="Calibri" w:cs="Calibri"/>
         </w:rPr>
-        <w:t xml:space="preserve">Energy, vol. 125, Jul. 15, 2014. </w:t>
-      </w:r>
-      <w:proofErr w:type="spellStart"/>
-      <w:r>
-        <w:rPr>
-          <w:rFonts w:ascii="Calibri" w:eastAsia="Calibri" w:hAnsi="Calibri" w:cs="Calibri"/>
-        </w:rPr>
-        <w:t>doi</w:t>
-      </w:r>
-      <w:proofErr w:type="spellEnd"/>
-      <w:r>
-        <w:rPr>
-          <w:rFonts w:ascii="Calibri" w:eastAsia="Calibri" w:hAnsi="Calibri" w:cs="Calibri"/>
-        </w:rPr>
-        <w:t xml:space="preserve">: </w:t>
+        <w:t xml:space="preserve">Energy, vol. 125, Jul. 15, 2014. doi: </w:t>
       </w:r>
       <w:hyperlink r:id="rId9" w:history="1">
         <w:r>
@@ -3721,23 +3725,32 @@
           <w:bCs/>
           <w:color w:val="4C94D8" w:themeColor="text2" w:themeTint="80"/>
         </w:rPr>
-        <w:t>The description of the "ground truth" is confusing. The manuscript uses hourly emission factors as the reference but then admits these are themselves projections based on historical weather data (Section 5.1). This is a significant limitation that undermines the premise of a "ground truth." You must explicitly reframe this in the methodology. State clearly that the hourly projection is used as a *high-resolution reference benchmark* for comparing lower-resolution averages, while openly discussing its limitations regarding weather synchronicity in Section 5.1.</w:t>
-      </w:r>
-    </w:p>
-    <w:p>
-      <w:pPr>
-        <w:jc w:val="both"/>
-        <w:rPr>
-          <w:rFonts w:ascii="Calibri" w:eastAsia="Calibri" w:hAnsi="Calibri" w:cs="Calibri"/>
-        </w:rPr>
-      </w:pPr>
-      <w:r>
-        <w:rPr>
-          <w:rFonts w:ascii="Calibri" w:eastAsia="Calibri" w:hAnsi="Calibri" w:cs="Calibri"/>
-          <w:b/>
-          <w:bCs/>
+        <w:t xml:space="preserve">The description of the "ground truth" is confusing. The manuscript uses hourly emission factors as the reference but then admits these are themselves projections based on historical weather data (Section 5.1). This is a significant limitation that undermines the premise of a "ground truth." You must explicitly reframe this in the methodology. State </w:t>
+      </w:r>
+      <w:r>
+        <w:rPr>
+          <w:rFonts w:ascii="Calibri" w:eastAsia="Calibri" w:hAnsi="Calibri" w:cs="Calibri"/>
+          <w:b/>
+          <w:bCs/>
+          <w:color w:val="4C94D8" w:themeColor="text2" w:themeTint="80"/>
         </w:rPr>
         <w:lastRenderedPageBreak/>
+        <w:t>clearly that the hourly projection is used as a *high-resolution reference benchmark* for comparing lower-resolution averages, while openly discussing its limitations regarding weather synchronicity in Section 5.1.</w:t>
+      </w:r>
+    </w:p>
+    <w:p>
+      <w:pPr>
+        <w:jc w:val="both"/>
+        <w:rPr>
+          <w:rFonts w:ascii="Calibri" w:eastAsia="Calibri" w:hAnsi="Calibri" w:cs="Calibri"/>
+        </w:rPr>
+      </w:pPr>
+      <w:r>
+        <w:rPr>
+          <w:rFonts w:ascii="Calibri" w:eastAsia="Calibri" w:hAnsi="Calibri" w:cs="Calibri"/>
+          <w:b/>
+          <w:bCs/>
+        </w:rPr>
         <w:t xml:space="preserve">Response: </w:t>
       </w:r>
       <w:r>
@@ -4019,7 +4032,7 @@
           <w:u w:val="single"/>
           <w:lang w:val="en-US"/>
         </w:rPr>
-        <w:t xml:space="preserve"> constraint in applying hourly emission factors as the benchmark reference is their sensitivity to weather assumptions. Hourly grid emission rates are typically derived from production-cost or dispatch models calibrated using meteorological conditions from a specific historical year (or a limited set of years, such as those extracted from the Cambium dataset, which uses actual meteorological data from 2012). As a result, the temporal profile of renewable generation, load, and marginal unit dispatch embedded in these hourly factors reflects weather patterns that may not align with the actual weather experienced by buildings during the analysis period. This mismatch can introduce systematic discrepancies when hourly emission factors are paired with measured </w:t>
+        <w:t xml:space="preserve"> constraint in applying hourly emission factors as the benchmark reference is their sensitivity to weather assumptions. Hourly grid emission rates are typically derived from production-cost or dispatch models calibrated using meteorological conditions from </w:t>
       </w:r>
       <w:r>
         <w:rPr>
@@ -4030,7 +4043,7 @@
           <w:lang w:val="en-US"/>
         </w:rPr>
         <w:lastRenderedPageBreak/>
-        <w:t>building electricity consumption from a different year or region, particularly under extreme or anomalous weather conditions.</w:t>
+        <w:t>a specific historical year (or a limited set of years, such as those extracted from the Cambium dataset, which uses actual meteorological data from 2012). As a result, the temporal profile of renewable generation, load, and marginal unit dispatch embedded in these hourly factors reflects weather patterns that may not align with the actual weather experienced by buildings during the analysis period. This mismatch can introduce systematic discrepancies when hourly emission factors are paired with measured building electricity consumption from a different year or region, particularly under extreme or anomalous weather conditions.</w:t>
       </w:r>
       <w:r>
         <w:rPr>
@@ -4266,17 +4279,8 @@
           <w:bCs/>
           <w:color w:val="4C94D8" w:themeColor="text2" w:themeTint="80"/>
         </w:rPr>
-        <w:t xml:space="preserve">The limitation regarding Battery Energy Storage Systems (BESS) is correctly identified but handled too lightly. Given that BESS is a cornerstone for managing temporal grid variability and a key tool for NZCBs, its exclusion is significant. Expand this limitation section. Discuss how BESS integration would likely *increase* the error when using coarse emission factors, </w:t>
-      </w:r>
-      <w:r>
-        <w:rPr>
-          <w:rFonts w:ascii="Calibri" w:eastAsia="Calibri" w:hAnsi="Calibri" w:cs="Calibri"/>
-          <w:b/>
-          <w:bCs/>
-          <w:color w:val="4C94D8" w:themeColor="text2" w:themeTint="80"/>
-        </w:rPr>
         <w:lastRenderedPageBreak/>
-        <w:t>thereby strengthening your core argument for higher temporal resolution. Propose this as essential future work.</w:t>
+        <w:t>The limitation regarding Battery Energy Storage Systems (BESS) is correctly identified but handled too lightly. Given that BESS is a cornerstone for managing temporal grid variability and a key tool for NZCBs, its exclusion is significant. Expand this limitation section. Discuss how BESS integration would likely *increase* the error when using coarse emission factors, thereby strengthening your core argument for higher temporal resolution. Propose this as essential future work.</w:t>
       </w:r>
     </w:p>
     <w:p>
@@ -4389,19 +4393,11 @@
         </w:rPr>
         <w:t xml:space="preserve"> </w:t>
       </w:r>
-      <w:proofErr w:type="spellStart"/>
-      <w:r>
-        <w:rPr>
-          <w:rFonts w:ascii="Calibri" w:eastAsia="Calibri" w:hAnsi="Calibri" w:cs="Calibri"/>
-        </w:rPr>
-        <w:t>doi</w:t>
-      </w:r>
-      <w:proofErr w:type="spellEnd"/>
-      <w:r>
-        <w:rPr>
-          <w:rFonts w:ascii="Calibri" w:eastAsia="Calibri" w:hAnsi="Calibri" w:cs="Calibri"/>
-        </w:rPr>
-        <w:t>:</w:t>
+      <w:r>
+        <w:rPr>
+          <w:rFonts w:ascii="Calibri" w:eastAsia="Calibri" w:hAnsi="Calibri" w:cs="Calibri"/>
+        </w:rPr>
+        <w:t>doi:</w:t>
       </w:r>
       <w:r>
         <w:rPr>
@@ -4452,35 +4448,7 @@
         <w:rPr>
           <w:rFonts w:ascii="Calibri" w:eastAsia="Calibri" w:hAnsi="Calibri" w:cs="Calibri"/>
         </w:rPr>
-        <w:t xml:space="preserve">P. Grunewald, M. </w:t>
-      </w:r>
-      <w:proofErr w:type="spellStart"/>
-      <w:r>
-        <w:rPr>
-          <w:rFonts w:ascii="Calibri" w:eastAsia="Calibri" w:hAnsi="Calibri" w:cs="Calibri"/>
-        </w:rPr>
-        <w:t>Aunedi</w:t>
-      </w:r>
-      <w:proofErr w:type="spellEnd"/>
-      <w:r>
-        <w:rPr>
-          <w:rFonts w:ascii="Calibri" w:eastAsia="Calibri" w:hAnsi="Calibri" w:cs="Calibri"/>
-        </w:rPr>
-        <w:t xml:space="preserve">, S. M. </w:t>
-      </w:r>
-      <w:proofErr w:type="spellStart"/>
-      <w:r>
-        <w:rPr>
-          <w:rFonts w:ascii="Calibri" w:eastAsia="Calibri" w:hAnsi="Calibri" w:cs="Calibri"/>
-        </w:rPr>
-        <w:t>Nosratabadi</w:t>
-      </w:r>
-      <w:proofErr w:type="spellEnd"/>
-      <w:r>
-        <w:rPr>
-          <w:rFonts w:ascii="Calibri" w:eastAsia="Calibri" w:hAnsi="Calibri" w:cs="Calibri"/>
-        </w:rPr>
-        <w:t>, et al., “Taking the long view on short-run marginal</w:t>
+        <w:t>P. Grunewald, M. Aunedi, S. M. Nosratabadi, et al., “Taking the long view on short-run marginal</w:t>
       </w:r>
     </w:p>
     <w:p>
@@ -4508,21 +4476,7 @@
         <w:rPr>
           <w:rFonts w:ascii="Calibri" w:eastAsia="Calibri" w:hAnsi="Calibri" w:cs="Calibri"/>
         </w:rPr>
-        <w:t xml:space="preserve">Feb. 1, 2023. </w:t>
-      </w:r>
-      <w:proofErr w:type="spellStart"/>
-      <w:r>
-        <w:rPr>
-          <w:rFonts w:ascii="Calibri" w:eastAsia="Calibri" w:hAnsi="Calibri" w:cs="Calibri"/>
-        </w:rPr>
-        <w:t>doi</w:t>
-      </w:r>
-      <w:proofErr w:type="spellEnd"/>
-      <w:r>
-        <w:rPr>
-          <w:rFonts w:ascii="Calibri" w:eastAsia="Calibri" w:hAnsi="Calibri" w:cs="Calibri"/>
-        </w:rPr>
-        <w:t>: https://doi.org/10.1093/ooenergy/oiad008.</w:t>
+        <w:t>Feb. 1, 2023. doi: https://doi.org/10.1093/ooenergy/oiad008.</w:t>
       </w:r>
     </w:p>
     <w:p>
@@ -4549,27 +4503,7 @@
           <w:bCs/>
           <w:color w:val="4C94D8" w:themeColor="text2" w:themeTint="80"/>
         </w:rPr>
-        <w:t xml:space="preserve">The conclusion is largely a summary. It must be strengthened to articulate the novel contribution more clearly. Explicitly state what your study adds beyond the work of </w:t>
-      </w:r>
-      <w:proofErr w:type="spellStart"/>
-      <w:r>
-        <w:rPr>
-          <w:rFonts w:ascii="Calibri" w:eastAsia="Calibri" w:hAnsi="Calibri" w:cs="Calibri"/>
-          <w:b/>
-          <w:bCs/>
-          <w:color w:val="4C94D8" w:themeColor="text2" w:themeTint="80"/>
-        </w:rPr>
-        <w:t>Amaripadath</w:t>
-      </w:r>
-      <w:proofErr w:type="spellEnd"/>
-      <w:r>
-        <w:rPr>
-          <w:rFonts w:ascii="Calibri" w:eastAsia="Calibri" w:hAnsi="Calibri" w:cs="Calibri"/>
-          <w:b/>
-          <w:bCs/>
-          <w:color w:val="4C94D8" w:themeColor="text2" w:themeTint="80"/>
-        </w:rPr>
-        <w:t xml:space="preserve"> et al. (2025), which is cited. Emphasize the scale (600+ real buildings vs. simulated ones), the cross-regional analysis, and the explicit quantification of error thresholds that can inform policy. The final paragraph should powerfully restate the imperative for changing industry practice.</w:t>
+        <w:t>The conclusion is largely a summary. It must be strengthened to articulate the novel contribution more clearly. Explicitly state what your study adds beyond the work of Amaripadath et al. (2025), which is cited. Emphasize the scale (600+ real buildings vs. simulated ones), the cross-regional analysis, and the explicit quantification of error thresholds that can inform policy. The final paragraph should powerfully restate the imperative for changing industry practice.</w:t>
       </w:r>
     </w:p>
     <w:p>
@@ -4632,7 +4566,7 @@
           <w:u w:val="single"/>
           <w:lang w:val="en-US"/>
         </w:rPr>
-        <w:t xml:space="preserve">Practitioners often use annual or seasonal average emissions rates to estimate building operational and avoided carbon emissions, yet standards provide limited guidance on the accuracy of these simplifications. This study demonstrates that this gap can significantly impact net-zero carbon building assessment, retrofit valuation, utility export quantification. Distinct from prior work that relies largely on simulations or single-building case studies, our analysis integrates measured hourly electricity consumption from over 600 real commercial buildings and evaluates performance across all contiguous U.S. grid regions. Using hourly emissions rates as a high-resolution benchmark, we systematically quantified the deviation and uncertainty introduced by five </w:t>
+        <w:t xml:space="preserve">Practitioners often use annual or seasonal average emissions rates to estimate building operational and avoided carbon emissions, yet standards provide limited guidance on the accuracy of these simplifications. This study demonstrates that this gap can significantly impact net-zero carbon building assessment, retrofit valuation, utility export quantification. </w:t>
       </w:r>
       <w:r>
         <w:rPr>
@@ -4643,7 +4577,7 @@
           <w:lang w:val="en-US"/>
         </w:rPr>
         <w:lastRenderedPageBreak/>
-        <w:t xml:space="preserve">commonly used lower-resolution alternatives, from annual averages to month-hour averages. The results show that annual and seasonal averages substantially oversimplify grid dynamics, with median deviations exceeding 100% under projected 2050 grid scenarios. In contrast, season-hour and month-hour emission factors consistently achieve median deviations below 5%. Considering accuracy and practicality, we recommend that standards and guidelines formally adopt season-hour or month-hour emission factors as the minimum temporal resolution requirement for operational and avoided carbon emissions accounting. </w:t>
+        <w:t xml:space="preserve">Distinct from prior work that relies largely on simulations or single-building case studies, our analysis integrates measured hourly electricity consumption from over 600 real commercial buildings and evaluates performance across all contiguous U.S. grid regions. Using hourly emissions rates as a high-resolution benchmark, we systematically quantified the deviation and uncertainty introduced by five commonly used lower-resolution alternatives, from annual averages to month-hour averages. The results show that annual and seasonal averages substantially oversimplify grid dynamics, with median deviations exceeding 100% under projected 2050 grid scenarios. In contrast, season-hour and month-hour emission factors consistently achieve median deviations below 5%. Considering accuracy and practicality, we recommend that standards and guidelines formally adopt season-hour or month-hour emission factors as the minimum temporal resolution requirement for operational and avoided carbon emissions accounting. </w:t>
       </w:r>
     </w:p>
     <w:p>
@@ -4666,7 +4600,17 @@
           <w:u w:val="single"/>
           <w:lang w:val="en-US"/>
         </w:rPr>
-        <w:t xml:space="preserve">A profound implication of these findings is that with a growing trend of increasing onsite renewable generation in buildings as a retrofit measure, our study results highlight a critical discrepancy that net-zero energy buildings do not necessarily guarantee a building is net-zero carbon in operation. Especially in solar-dominant regions where grid emission rates vary significantly in time. The problem is especially pronounced when evaluating avoided emissions for grid exports, which needs to be assessed separately from operational impact. Due to the intermittency of the utility export, the use of temporally coarse emission factors introduces substantial uncertainty and can misrepresent environmental benefits. The same implication also applies when quantifying avoided emissions for efficiency retrofit and load shift retrofit measures where the intervention effect also varies in time. </w:t>
+        <w:t>A profound implication of these findings is that with a growing trend of increasing onsite renewable generation in buildings as a retrofit measure, our study results highlight a critical discrepancy that net-zero energy buildings do not necessarily guarantee a building is net-zero carbon in operation. Especially in solar-dominant regions where grid emission rates vary significantly in time. The problem is especially pronounced when evaluating avoided emissions for grid exports, which needs to be assessed separately from operational impact. Given that building retrofit impacts are inherently time-dependent, such as intermittent utility exports to the grid and targeted load shift interventions, the reliance on temporally coarse emission factors introduces significant uncertainty and can misrepresent true environmental benefits</w:t>
+      </w:r>
+      <w:r>
+        <w:rPr>
+          <w:rFonts w:ascii="Calibri" w:eastAsia="Calibri" w:hAnsi="Calibri" w:cs="Calibri"/>
+          <w:i/>
+          <w:iCs/>
+          <w:u w:val="single"/>
+          <w:lang w:val="en-US"/>
+        </w:rPr>
+        <w:t xml:space="preserve">. </w:t>
       </w:r>
     </w:p>
     <w:p>
@@ -4725,47 +4669,7 @@
           <w:bCs/>
           <w:color w:val="4C94D8" w:themeColor="text2" w:themeTint="80"/>
         </w:rPr>
-        <w:t>The manuscript requires thorough proofreading for grammatical errors, awkward phrasing, and typos. Examples include: "&lt;</w:t>
-      </w:r>
-      <w:proofErr w:type="spellStart"/>
-      <w:r>
-        <w:rPr>
-          <w:rFonts w:ascii="Calibri" w:eastAsia="Calibri" w:hAnsi="Calibri" w:cs="Calibri"/>
-          <w:b/>
-          <w:bCs/>
-          <w:color w:val="4C94D8" w:themeColor="text2" w:themeTint="80"/>
-        </w:rPr>
-        <w:t>indings</w:t>
-      </w:r>
-      <w:proofErr w:type="spellEnd"/>
-      <w:r>
-        <w:rPr>
-          <w:rFonts w:ascii="Calibri" w:eastAsia="Calibri" w:hAnsi="Calibri" w:cs="Calibri"/>
-          <w:b/>
-          <w:bCs/>
-          <w:color w:val="4C94D8" w:themeColor="text2" w:themeTint="80"/>
-        </w:rPr>
-        <w:t>" in the abstract, "</w:t>
-      </w:r>
-      <w:proofErr w:type="spellStart"/>
-      <w:r>
-        <w:rPr>
-          <w:rFonts w:ascii="Calibri" w:eastAsia="Calibri" w:hAnsi="Calibri" w:cs="Calibri"/>
-          <w:b/>
-          <w:bCs/>
-          <w:color w:val="4C94D8" w:themeColor="text2" w:themeTint="80"/>
-        </w:rPr>
-        <w:t>oversimplicied</w:t>
-      </w:r>
-      <w:proofErr w:type="spellEnd"/>
-      <w:r>
-        <w:rPr>
-          <w:rFonts w:ascii="Calibri" w:eastAsia="Calibri" w:hAnsi="Calibri" w:cs="Calibri"/>
-          <w:b/>
-          <w:bCs/>
-          <w:color w:val="4C94D8" w:themeColor="text2" w:themeTint="80"/>
-        </w:rPr>
-        <w:t>" (p.1), "strongly aligns the aim" (p.2), "deviations of 5-30% in operational emissions and over 100% in avoided emissions" (p.2 - is this median or range? Clarify). Such errors detract from scientific rigor and must be corrected.</w:t>
+        <w:t>The manuscript requires thorough proofreading for grammatical errors, awkward phrasing, and typos. Examples include: "&lt;indings" in the abstract, "oversimplicied" (p.1), "strongly aligns the aim" (p.2), "deviations of 5-30% in operational emissions and over 100% in avoided emissions" (p.2 - is this median or range? Clarify). Such errors detract from scientific rigor and must be corrected.</w:t>
       </w:r>
     </w:p>
     <w:p>
@@ -4858,6 +4762,7 @@
           <w:b/>
           <w:bCs/>
         </w:rPr>
+        <w:lastRenderedPageBreak/>
         <w:t xml:space="preserve">Response: </w:t>
       </w:r>
       <w:r>
@@ -4890,7 +4795,6 @@
           <w:noProof/>
           <w14:ligatures w14:val="standardContextual"/>
         </w:rPr>
-        <w:lastRenderedPageBreak/>
         <w:drawing>
           <wp:inline distT="0" distB="0" distL="0" distR="0" wp14:anchorId="3CBA4A72" wp14:editId="3AA70736">
             <wp:extent cx="5943600" cy="3343275"/>

</xml_diff>

<commit_message>
modified distribution plots for all grid regions
</commit_message>
<xml_diff>
--- a/docs/Reviewer response.docx
+++ b/docs/Reviewer response.docx
@@ -261,27 +261,7 @@
           <w:bCs/>
           <w:color w:val="4C94D8" w:themeColor="text2" w:themeTint="80"/>
         </w:rPr>
-        <w:t xml:space="preserve">The discussion of decarbonization pathways in section 1. "Introduction" is informative but descriptive. Therefore, a clearer link between background discussion and the specific </w:t>
-      </w:r>
-      <w:proofErr w:type="gramStart"/>
-      <w:r>
-        <w:rPr>
-          <w:rFonts w:ascii="Calibri" w:eastAsia="Calibri" w:hAnsi="Calibri" w:cs="Calibri"/>
-          <w:b/>
-          <w:bCs/>
-          <w:color w:val="4C94D8" w:themeColor="text2" w:themeTint="80"/>
-        </w:rPr>
-        <w:t>goals</w:t>
-      </w:r>
-      <w:proofErr w:type="gramEnd"/>
-      <w:r>
-        <w:rPr>
-          <w:rFonts w:ascii="Calibri" w:eastAsia="Calibri" w:hAnsi="Calibri" w:cs="Calibri"/>
-          <w:b/>
-          <w:bCs/>
-          <w:color w:val="4C94D8" w:themeColor="text2" w:themeTint="80"/>
-        </w:rPr>
-        <w:t xml:space="preserve"> of the study is suggested.</w:t>
+        <w:t>The discussion of decarbonization pathways in section 1. "Introduction" is informative but descriptive. Therefore, a clearer link between background discussion and the specific goals of the study is suggested.</w:t>
       </w:r>
     </w:p>
     <w:p>
@@ -312,7 +292,19 @@
         <w:rPr>
           <w:rFonts w:ascii="Calibri" w:eastAsia="Calibri" w:hAnsi="Calibri" w:cs="Calibri"/>
         </w:rPr>
-        <w:t xml:space="preserve"> you for the suggestion, we added in section 1. “Introduction” the following sentences to make connections between general background and the study objectives: </w:t>
+        <w:t xml:space="preserve"> you for the suggestion, we </w:t>
+      </w:r>
+      <w:r>
+        <w:rPr>
+          <w:rFonts w:ascii="Calibri" w:eastAsia="Calibri" w:hAnsi="Calibri" w:cs="Calibri"/>
+        </w:rPr>
+        <w:t xml:space="preserve">first modified the layout of section 1 by combining the decarbonization pathway and temporal sensitivity subsection to section 1.1 “Temporal sensitivity impact on decarbonization pathway”. We then added </w:t>
+      </w:r>
+      <w:r>
+        <w:rPr>
+          <w:rFonts w:ascii="Calibri" w:eastAsia="Calibri" w:hAnsi="Calibri" w:cs="Calibri"/>
+        </w:rPr>
+        <w:t xml:space="preserve">sentences to make connections between general background and the study objectives: </w:t>
       </w:r>
       <w:r>
         <w:rPr>
@@ -391,7 +383,31 @@
         <w:rPr>
           <w:rFonts w:ascii="Calibri" w:eastAsia="Calibri" w:hAnsi="Calibri" w:cs="Calibri"/>
         </w:rPr>
-        <w:t xml:space="preserve">on temporal emission factors to the study. We provided a dedicated paragraph in the following section 2.2 “Time interval differences in operational carbon emissions accounting” discussing how current guidelines, standards and literature instruct practitioners to report operational emissions accounting. </w:t>
+        <w:t xml:space="preserve">on temporal emission factors to the study. We provided a dedicated paragraph in the </w:t>
+      </w:r>
+      <w:r>
+        <w:rPr>
+          <w:rFonts w:ascii="Calibri" w:eastAsia="Calibri" w:hAnsi="Calibri" w:cs="Calibri"/>
+        </w:rPr>
+        <w:t xml:space="preserve">updated subsection 1.1 “Temporal sensitivity impact on decarbonization pathway” </w:t>
+      </w:r>
+      <w:r>
+        <w:rPr>
+          <w:rFonts w:ascii="Calibri" w:eastAsia="Calibri" w:hAnsi="Calibri" w:cs="Calibri"/>
+        </w:rPr>
+        <w:t>discussing</w:t>
+      </w:r>
+      <w:r>
+        <w:rPr>
+          <w:rFonts w:ascii="Calibri" w:eastAsia="Calibri" w:hAnsi="Calibri" w:cs="Calibri"/>
+        </w:rPr>
+        <w:t xml:space="preserve"> the research gaps from the current literature, industry standards and guidelines</w:t>
+      </w:r>
+      <w:r>
+        <w:rPr>
+          <w:rFonts w:ascii="Calibri" w:eastAsia="Calibri" w:hAnsi="Calibri" w:cs="Calibri"/>
+        </w:rPr>
+        <w:t xml:space="preserve">. </w:t>
       </w:r>
     </w:p>
     <w:p>
@@ -497,7 +513,27 @@
           <w:u w:val="single"/>
           <w:lang w:val="en-US"/>
         </w:rPr>
-        <w:t>The rest of this paper is structured as follows: Section 2 reviews existing net-zero definitions and prior discussions on the role of temporal variability in emissions assessment. Section 3 describes the methodology and datasets used to evaluate accounting accuracy, followed by results in Section 4 using three representative grid regions. Section 5 discusses the implications of these findings for policy and practice, and Section 6 concludes the study.</w:t>
+        <w:t xml:space="preserve">The rest of this paper is structured as follows: Section 2 reviews existing net-zero definitions and prior discussions on the role of temporal variability in emissions assessment. Section 3 describes the methodology and datasets used to evaluate accounting accuracy, followed by results in Section 4 using three representative grid regions. Section 5 discusses the implications of these findings for policy and practice, </w:t>
+      </w:r>
+      <w:r>
+        <w:rPr>
+          <w:rFonts w:ascii="Calibri" w:eastAsia="Calibri" w:hAnsi="Calibri" w:cs="Calibri"/>
+          <w:i/>
+          <w:iCs/>
+          <w:u w:val="single"/>
+          <w:lang w:val="en-US"/>
+        </w:rPr>
+        <w:t>and followed by conclusion</w:t>
+      </w:r>
+      <w:r>
+        <w:rPr>
+          <w:rFonts w:ascii="Calibri" w:eastAsia="Calibri" w:hAnsi="Calibri" w:cs="Calibri"/>
+          <w:i/>
+          <w:iCs/>
+          <w:u w:val="single"/>
+          <w:lang w:val="en-US"/>
+        </w:rPr>
+        <w:t>.</w:t>
       </w:r>
       <w:r>
         <w:rPr>
@@ -530,7 +566,17 @@
           <w:bCs/>
           <w:color w:val="4C94D8" w:themeColor="text2" w:themeTint="80"/>
         </w:rPr>
-        <w:t>The distinction between net-zero energy buildings (NZEBs) and net-zero carbon buildings (NZCBs) is clearly explained in section 2. "Literature Review;" however, the direct connection between these definitions and the study's focus on temporal emission factor resolution is not sufficiently emphasized. Thus, the authors are encouraged to more clearly link this background discussion to the core research question.</w:t>
+        <w:t xml:space="preserve">The distinction between net-zero energy buildings (NZEBs) and net-zero carbon buildings (NZCBs) is clearly explained in section 2. "Literature Review;" however, the direct connection between these definitions and the study's focus on temporal emission factor </w:t>
+      </w:r>
+      <w:r>
+        <w:rPr>
+          <w:rFonts w:ascii="Calibri" w:eastAsia="Calibri" w:hAnsi="Calibri" w:cs="Calibri"/>
+          <w:b/>
+          <w:bCs/>
+          <w:color w:val="4C94D8" w:themeColor="text2" w:themeTint="80"/>
+        </w:rPr>
+        <w:lastRenderedPageBreak/>
+        <w:t>resolution is not sufficiently emphasized. Thus, the authors are encouraged to more clearly link this background discussion to the core research question.</w:t>
       </w:r>
     </w:p>
     <w:p>
@@ -547,7 +593,6 @@
           <w:b/>
           <w:bCs/>
         </w:rPr>
-        <w:lastRenderedPageBreak/>
         <w:t>Response:</w:t>
       </w:r>
       <w:r>
@@ -588,30 +633,35 @@
         </w:rPr>
         <w:t xml:space="preserve">. </w:t>
       </w:r>
-    </w:p>
-    <w:p>
-      <w:pPr>
-        <w:spacing w:before="240" w:after="240"/>
-        <w:jc w:val="both"/>
-        <w:rPr>
-          <w:rFonts w:ascii="Calibri" w:eastAsia="Calibri" w:hAnsi="Calibri" w:cs="Calibri"/>
-          <w:i/>
-          <w:iCs/>
-          <w:u w:val="single"/>
-          <w:lang w:val="en-US"/>
-        </w:rPr>
-      </w:pPr>
-      <w:r>
-        <w:rPr>
-          <w:rFonts w:ascii="Calibri" w:eastAsia="Calibri" w:hAnsi="Calibri" w:cs="Calibri"/>
-        </w:rPr>
-        <w:t xml:space="preserve">Based on the given suggestion, we added a paragraph </w:t>
-      </w:r>
-      <w:r>
-        <w:rPr>
-          <w:rFonts w:ascii="Calibri" w:eastAsia="Calibri" w:hAnsi="Calibri" w:cs="Calibri"/>
-        </w:rPr>
-        <w:t>at the end of Section 2.1: “</w:t>
+      <w:r>
+        <w:rPr>
+          <w:rFonts w:ascii="Calibri" w:eastAsia="Calibri" w:hAnsi="Calibri" w:cs="Calibri"/>
+        </w:rPr>
+        <w:t>As for improvement, we added a</w:t>
+      </w:r>
+      <w:r>
+        <w:rPr>
+          <w:rFonts w:ascii="Calibri" w:eastAsia="Calibri" w:hAnsi="Calibri" w:cs="Calibri"/>
+        </w:rPr>
+        <w:t xml:space="preserve"> paragraph </w:t>
+      </w:r>
+      <w:r>
+        <w:rPr>
+          <w:rFonts w:ascii="Calibri" w:eastAsia="Calibri" w:hAnsi="Calibri" w:cs="Calibri"/>
+        </w:rPr>
+        <w:t>at the end of Section 2.1</w:t>
+      </w:r>
+      <w:r>
+        <w:rPr>
+          <w:rFonts w:ascii="Calibri" w:eastAsia="Calibri" w:hAnsi="Calibri" w:cs="Calibri"/>
+        </w:rPr>
+        <w:t xml:space="preserve"> to strengthen the link</w:t>
+      </w:r>
+      <w:r>
+        <w:rPr>
+          <w:rFonts w:ascii="Calibri" w:eastAsia="Calibri" w:hAnsi="Calibri" w:cs="Calibri"/>
+        </w:rPr>
+        <w:t>: “</w:t>
       </w:r>
       <w:r>
         <w:rPr>
@@ -691,29 +741,62 @@
         <w:rPr>
           <w:rFonts w:ascii="Calibri" w:eastAsia="Calibri" w:hAnsi="Calibri" w:cs="Calibri"/>
         </w:rPr>
-        <w:t xml:space="preserve">Thanks for the suggestion and the following comment 8. </w:t>
-      </w:r>
-      <w:r>
-        <w:rPr>
-          <w:rFonts w:ascii="Calibri" w:eastAsia="Calibri" w:hAnsi="Calibri" w:cs="Calibri"/>
-        </w:rPr>
-        <w:t xml:space="preserve">We added the table comparison in the updated Section 2.2 “Temporal sensitivity in operational carbon emissions accounting”. </w:t>
-      </w:r>
-      <w:r>
-        <w:rPr>
-          <w:rFonts w:ascii="Calibri" w:eastAsia="Calibri" w:hAnsi="Calibri" w:cs="Calibri"/>
-        </w:rPr>
-        <w:t xml:space="preserve">In the table, </w:t>
-      </w:r>
-      <w:proofErr w:type="gramStart"/>
-      <w:r>
-        <w:rPr>
-          <w:rFonts w:ascii="Calibri" w:eastAsia="Calibri" w:hAnsi="Calibri" w:cs="Calibri"/>
-          <w:lang w:val="en-US"/>
-        </w:rPr>
-        <w:t>We</w:t>
-      </w:r>
-      <w:proofErr w:type="gramEnd"/>
+        <w:t xml:space="preserve">Thanks for the suggestion and the </w:t>
+      </w:r>
+      <w:r>
+        <w:rPr>
+          <w:rFonts w:ascii="Calibri" w:eastAsia="Calibri" w:hAnsi="Calibri" w:cs="Calibri"/>
+        </w:rPr>
+        <w:t xml:space="preserve">also next </w:t>
+      </w:r>
+      <w:r>
+        <w:rPr>
+          <w:rFonts w:ascii="Calibri" w:eastAsia="Calibri" w:hAnsi="Calibri" w:cs="Calibri"/>
+        </w:rPr>
+        <w:t>comment</w:t>
+      </w:r>
+      <w:r>
+        <w:rPr>
+          <w:rFonts w:ascii="Calibri" w:eastAsia="Calibri" w:hAnsi="Calibri" w:cs="Calibri"/>
+        </w:rPr>
+        <w:t xml:space="preserve"> regarding the literature section</w:t>
+      </w:r>
+      <w:r>
+        <w:rPr>
+          <w:rFonts w:ascii="Calibri" w:eastAsia="Calibri" w:hAnsi="Calibri" w:cs="Calibri"/>
+        </w:rPr>
+        <w:t>.</w:t>
+      </w:r>
+      <w:r>
+        <w:rPr>
+          <w:rFonts w:ascii="Calibri" w:eastAsia="Calibri" w:hAnsi="Calibri" w:cs="Calibri"/>
+        </w:rPr>
+        <w:t xml:space="preserve"> In the original version of the paper, we briefly summarized how existing literature </w:t>
+      </w:r>
+      <w:r>
+        <w:rPr>
+          <w:rFonts w:ascii="Calibri" w:eastAsia="Calibri" w:hAnsi="Calibri" w:cs="Calibri"/>
+        </w:rPr>
+        <w:t xml:space="preserve">considers which emission factors to use for carbon emission accounting. However, as pointed out by the reviewer, the description is insufficient to reflect the novelty and contribution of the study. Therefore, we </w:t>
+      </w:r>
+      <w:r>
+        <w:rPr>
+          <w:rFonts w:ascii="Calibri" w:eastAsia="Calibri" w:hAnsi="Calibri" w:cs="Calibri"/>
+        </w:rPr>
+        <w:t xml:space="preserve">added the table comparison in the updated Section 2.2 “Temporal sensitivity in operational carbon emissions accounting”. </w:t>
+      </w:r>
+      <w:r>
+        <w:rPr>
+          <w:rFonts w:ascii="Calibri" w:eastAsia="Calibri" w:hAnsi="Calibri" w:cs="Calibri"/>
+        </w:rPr>
+        <w:t xml:space="preserve">In the </w:t>
+      </w:r>
+      <w:r>
+        <w:rPr>
+          <w:rFonts w:ascii="Calibri" w:eastAsia="Calibri" w:hAnsi="Calibri" w:cs="Calibri"/>
+        </w:rPr>
+        <w:t>table, we</w:t>
+      </w:r>
       <w:r>
         <w:rPr>
           <w:rFonts w:ascii="Calibri" w:eastAsia="Calibri" w:hAnsi="Calibri" w:cs="Calibri"/>
@@ -764,6 +847,7 @@
           <w:b/>
           <w:bCs/>
         </w:rPr>
+        <w:lastRenderedPageBreak/>
         <w:t xml:space="preserve">Table 1. </w:t>
       </w:r>
       <w:r>
@@ -1329,7 +1413,6 @@
               <w:rPr>
                 <w:rFonts w:ascii="Calibri" w:hAnsi="Calibri" w:cs="Calibri"/>
               </w:rPr>
-              <w:lastRenderedPageBreak/>
               <w:t>[48]</w:t>
             </w:r>
           </w:p>
@@ -1950,15 +2033,6 @@
     </w:tbl>
     <w:p>
       <w:pPr>
-        <w:spacing w:before="240" w:after="240"/>
-        <w:jc w:val="both"/>
-        <w:rPr>
-          <w:rFonts w:ascii="Calibri" w:eastAsia="Calibri" w:hAnsi="Calibri" w:cs="Calibri"/>
-        </w:rPr>
-      </w:pPr>
-    </w:p>
-    <w:p>
-      <w:pPr>
         <w:pStyle w:val="ListParagraph"/>
         <w:numPr>
           <w:ilvl w:val="0"/>
@@ -2012,13 +2086,19 @@
         <w:rPr>
           <w:rFonts w:ascii="Calibri" w:eastAsia="Calibri" w:hAnsi="Calibri" w:cs="Calibri"/>
         </w:rPr>
-        <w:t xml:space="preserve">we modified the </w:t>
-      </w:r>
-      <w:r>
-        <w:rPr>
-          <w:rFonts w:ascii="Calibri" w:eastAsia="Calibri" w:hAnsi="Calibri" w:cs="Calibri"/>
-        </w:rPr>
-        <w:t>literature review section 2.2 “</w:t>
+        <w:t xml:space="preserve">we </w:t>
+      </w:r>
+      <w:r>
+        <w:rPr>
+          <w:rFonts w:ascii="Calibri" w:eastAsia="Calibri" w:hAnsi="Calibri" w:cs="Calibri"/>
+        </w:rPr>
+        <w:t>further added a summary of study contribution below the added table comparison in</w:t>
+      </w:r>
+      <w:r>
+        <w:rPr>
+          <w:rFonts w:ascii="Calibri" w:eastAsia="Calibri" w:hAnsi="Calibri" w:cs="Calibri"/>
+        </w:rPr>
+        <w:t xml:space="preserve"> section 2.2 “</w:t>
       </w:r>
       <w:r>
         <w:rPr>
@@ -2032,39 +2112,193 @@
         <w:rPr>
           <w:rFonts w:ascii="Calibri" w:eastAsia="Calibri" w:hAnsi="Calibri" w:cs="Calibri"/>
         </w:rPr>
-        <w:t>”, and added a summary of study contribution below the added table response to the previous comment: “</w:t>
-      </w:r>
-      <w:r>
-        <w:rPr>
-          <w:rFonts w:ascii="Calibri" w:eastAsia="Calibri" w:hAnsi="Calibri" w:cs="Calibri"/>
-          <w:i/>
-          <w:iCs/>
-          <w:u w:val="single"/>
-          <w:lang w:val="en-US"/>
-        </w:rPr>
-        <w:t xml:space="preserve">Overall, the reviewed literature shows that the environmental benefit of saving 1 kWh of electricity depends strongly on when the savings occur, with greater benefits during periods of high grid emission intensity. Neglecting temporal variation in emission factors can therefore lead to systematic errors, such as overestimating avoided emissions when demand is reduced during low-emission periods (e.g., midday solar peaks), or underestimating benefits from efficiency measures and load-shifting strategies that target high-emission hours, such as envelope improvements for electrically heated buildings or storage-enabled demand shifting. However, as summarized in Table 1, most prior studies focus on comparisons between annual and hourly emission factors and rely primarily on simulated building loads. This approach largely overlooks seasonal patterns in emission factors, which we previously demonstrated to be substantial [11]. In addition, grid exports from onsite renewable generation are often treated implicitly as part of net load, rather than being explicitly evaluated as avoided emissions. In contrast, this study examines grid regions across the contiguous United States, evaluates emission factors across the full spectrum of temporal resolutions, and integrates measured electricity data from a large and diverse set of buildings that capture realistic variability. </w:t>
-      </w:r>
-      <w:proofErr w:type="gramStart"/>
-      <w:r>
-        <w:rPr>
-          <w:rFonts w:ascii="Calibri" w:eastAsia="Calibri" w:hAnsi="Calibri" w:cs="Calibri"/>
-          <w:i/>
-          <w:iCs/>
-          <w:u w:val="single"/>
-          <w:lang w:val="en-US"/>
-        </w:rPr>
-        <w:t>Also</w:t>
-      </w:r>
-      <w:proofErr w:type="gramEnd"/>
-      <w:r>
-        <w:rPr>
-          <w:rFonts w:ascii="Calibri" w:eastAsia="Calibri" w:hAnsi="Calibri" w:cs="Calibri"/>
-          <w:i/>
-          <w:iCs/>
-          <w:u w:val="single"/>
-          <w:lang w:val="en-US"/>
-        </w:rPr>
-        <w:t xml:space="preserve"> we quantified the avoided emissions separately from the net load to more appropriately assess grid benefits.</w:t>
+        <w:t>”</w:t>
+      </w:r>
+      <w:r>
+        <w:rPr>
+          <w:rFonts w:ascii="Calibri" w:eastAsia="Calibri" w:hAnsi="Calibri" w:cs="Calibri"/>
+        </w:rPr>
+        <w:t>: “</w:t>
+      </w:r>
+      <w:r>
+        <w:rPr>
+          <w:rFonts w:ascii="Calibri" w:eastAsia="Calibri" w:hAnsi="Calibri" w:cs="Calibri"/>
+          <w:i/>
+          <w:iCs/>
+          <w:u w:val="single"/>
+          <w:lang w:val="en-US"/>
+        </w:rPr>
+        <w:t xml:space="preserve">Overall, the reviewed literature shows that the </w:t>
+      </w:r>
+      <w:r>
+        <w:rPr>
+          <w:rFonts w:ascii="Calibri" w:eastAsia="Calibri" w:hAnsi="Calibri" w:cs="Calibri"/>
+          <w:i/>
+          <w:iCs/>
+          <w:u w:val="single"/>
+          <w:lang w:val="en-US"/>
+        </w:rPr>
+        <w:t xml:space="preserve">environmental impact of </w:t>
+      </w:r>
+      <w:r>
+        <w:rPr>
+          <w:rFonts w:ascii="Calibri" w:eastAsia="Calibri" w:hAnsi="Calibri" w:cs="Calibri"/>
+          <w:i/>
+          <w:iCs/>
+          <w:u w:val="single"/>
+          <w:lang w:val="en-US"/>
+        </w:rPr>
+        <w:t>using</w:t>
+      </w:r>
+      <w:r>
+        <w:rPr>
+          <w:rFonts w:ascii="Calibri" w:eastAsia="Calibri" w:hAnsi="Calibri" w:cs="Calibri"/>
+          <w:i/>
+          <w:iCs/>
+          <w:u w:val="single"/>
+          <w:lang w:val="en-US"/>
+        </w:rPr>
+        <w:t xml:space="preserve"> 1 kWh of electricity depends strongly on when </w:t>
+      </w:r>
+      <w:r>
+        <w:rPr>
+          <w:rFonts w:ascii="Calibri" w:eastAsia="Calibri" w:hAnsi="Calibri" w:cs="Calibri"/>
+          <w:i/>
+          <w:iCs/>
+          <w:u w:val="single"/>
+          <w:lang w:val="en-US"/>
+        </w:rPr>
+        <w:t>it</w:t>
+      </w:r>
+      <w:r>
+        <w:rPr>
+          <w:rFonts w:ascii="Calibri" w:eastAsia="Calibri" w:hAnsi="Calibri" w:cs="Calibri"/>
+          <w:i/>
+          <w:iCs/>
+          <w:u w:val="single"/>
+          <w:lang w:val="en-US"/>
+        </w:rPr>
+        <w:t xml:space="preserve"> </w:t>
+      </w:r>
+      <w:r>
+        <w:rPr>
+          <w:rFonts w:ascii="Calibri" w:eastAsia="Calibri" w:hAnsi="Calibri" w:cs="Calibri"/>
+          <w:i/>
+          <w:iCs/>
+          <w:u w:val="single"/>
+          <w:lang w:val="en-US"/>
+        </w:rPr>
+        <w:t>occurs</w:t>
+      </w:r>
+      <w:r>
+        <w:rPr>
+          <w:rFonts w:ascii="Calibri" w:eastAsia="Calibri" w:hAnsi="Calibri" w:cs="Calibri"/>
+          <w:i/>
+          <w:iCs/>
+          <w:u w:val="single"/>
+          <w:lang w:val="en-US"/>
+        </w:rPr>
+        <w:t xml:space="preserve">, with greater benefits during periods of high grid emission intensity. Neglecting temporal variation in emission factors can </w:t>
+      </w:r>
+      <w:r>
+        <w:rPr>
+          <w:rFonts w:ascii="Calibri" w:eastAsia="Calibri" w:hAnsi="Calibri" w:cs="Calibri"/>
+          <w:i/>
+          <w:iCs/>
+          <w:u w:val="single"/>
+          <w:lang w:val="en-US"/>
+        </w:rPr>
+        <w:t xml:space="preserve">also lead to </w:t>
+      </w:r>
+      <w:r>
+        <w:rPr>
+          <w:rFonts w:ascii="Calibri" w:eastAsia="Calibri" w:hAnsi="Calibri" w:cs="Calibri"/>
+          <w:i/>
+          <w:iCs/>
+          <w:u w:val="single"/>
+          <w:lang w:val="en-US"/>
+        </w:rPr>
+        <w:t>systematic errors</w:t>
+      </w:r>
+      <w:r>
+        <w:rPr>
+          <w:rFonts w:ascii="Calibri" w:eastAsia="Calibri" w:hAnsi="Calibri" w:cs="Calibri"/>
+          <w:i/>
+          <w:iCs/>
+          <w:u w:val="single"/>
+          <w:lang w:val="en-US"/>
+        </w:rPr>
+        <w:t xml:space="preserve"> for quantifying avoided emissions. For example the benefit can be overestimated </w:t>
+      </w:r>
+      <w:r>
+        <w:rPr>
+          <w:rFonts w:ascii="Calibri" w:eastAsia="Calibri" w:hAnsi="Calibri" w:cs="Calibri"/>
+          <w:i/>
+          <w:iCs/>
+          <w:u w:val="single"/>
+          <w:lang w:val="en-US"/>
+        </w:rPr>
+        <w:t>when demand is reduced during low-emission periods (e.g., midday solar peaks), or underesti</w:t>
+      </w:r>
+      <w:r>
+        <w:rPr>
+          <w:rFonts w:ascii="Calibri" w:eastAsia="Calibri" w:hAnsi="Calibri" w:cs="Calibri"/>
+          <w:i/>
+          <w:iCs/>
+          <w:u w:val="single"/>
+          <w:lang w:val="en-US"/>
+        </w:rPr>
+        <w:t>mated</w:t>
+      </w:r>
+      <w:r>
+        <w:rPr>
+          <w:rFonts w:ascii="Calibri" w:eastAsia="Calibri" w:hAnsi="Calibri" w:cs="Calibri"/>
+          <w:i/>
+          <w:iCs/>
+          <w:u w:val="single"/>
+          <w:lang w:val="en-US"/>
+        </w:rPr>
+        <w:t xml:space="preserve"> from efficiency measures and load-shifting strategies that target high-emission hours</w:t>
+      </w:r>
+      <w:r>
+        <w:rPr>
+          <w:rFonts w:ascii="Calibri" w:eastAsia="Calibri" w:hAnsi="Calibri" w:cs="Calibri"/>
+          <w:i/>
+          <w:iCs/>
+          <w:u w:val="single"/>
+          <w:lang w:val="en-US"/>
+        </w:rPr>
+        <w:t xml:space="preserve"> (e.g., </w:t>
+      </w:r>
+      <w:r>
+        <w:rPr>
+          <w:rFonts w:ascii="Calibri" w:eastAsia="Calibri" w:hAnsi="Calibri" w:cs="Calibri"/>
+          <w:i/>
+          <w:iCs/>
+          <w:u w:val="single"/>
+          <w:lang w:val="en-US"/>
+        </w:rPr>
+        <w:t>envelope improvements for electrically heated buildings or storage-enabled demand shifting</w:t>
+      </w:r>
+      <w:r>
+        <w:rPr>
+          <w:rFonts w:ascii="Calibri" w:eastAsia="Calibri" w:hAnsi="Calibri" w:cs="Calibri"/>
+          <w:i/>
+          <w:iCs/>
+          <w:u w:val="single"/>
+          <w:lang w:val="en-US"/>
+        </w:rPr>
+        <w:t>)</w:t>
+      </w:r>
+      <w:r>
+        <w:rPr>
+          <w:rFonts w:ascii="Calibri" w:eastAsia="Calibri" w:hAnsi="Calibri" w:cs="Calibri"/>
+          <w:i/>
+          <w:iCs/>
+          <w:u w:val="single"/>
+          <w:lang w:val="en-US"/>
+        </w:rPr>
+        <w:t>. However, as summarized in Table 1, most prior studies focus on comparisons between annual and hourly emission factors and rely primarily on simulated building loads. This approach largely overlooks seasonal patterns in emission factors, which we previously demonstrated to be substantial [11]. In addition, grid exports from onsite renewable generation are often treated implicitly as part of net load, rather than being explicitly evaluated as avoided emissions. In contrast, this study examines grid regions across the contiguous United States, evaluates emission factors across the full spectrum of temporal resolutions, and integrates measured electricity data from a large and diverse set of buildings that capture realistic variability. Also we quantified the avoided emissions separately from the net load to more appropriately assess grid benefits.</w:t>
       </w:r>
       <w:r>
         <w:rPr>
@@ -2100,7 +2334,17 @@
           <w:bCs/>
           <w:color w:val="4C94D8" w:themeColor="text2" w:themeTint="80"/>
         </w:rPr>
-        <w:t>Section 3. "Methodology" is generally well structured and data-driven; however, the assumption that hourly emission factors represent the "ground truth" is not sufficiently justified. Therefore, the authors are encouraged to better justify this assumption or discuss its limitations and implications.</w:t>
+        <w:t xml:space="preserve">Section 3. "Methodology" is generally well structured and data-driven; however, the assumption that hourly emission factors represent the "ground truth" is not sufficiently </w:t>
+      </w:r>
+      <w:r>
+        <w:rPr>
+          <w:rFonts w:ascii="Calibri" w:eastAsia="Calibri" w:hAnsi="Calibri" w:cs="Calibri"/>
+          <w:b/>
+          <w:bCs/>
+          <w:color w:val="4C94D8" w:themeColor="text2" w:themeTint="80"/>
+        </w:rPr>
+        <w:lastRenderedPageBreak/>
+        <w:t>justified. Therefore, the authors are encouraged to better justify this assumption or discuss its limitations and implications.</w:t>
       </w:r>
     </w:p>
     <w:p>
@@ -2153,14 +2397,31 @@
         <w:rPr>
           <w:rFonts w:ascii="Calibri" w:eastAsia="Calibri" w:hAnsi="Calibri" w:cs="Calibri"/>
         </w:rPr>
-        <w:t xml:space="preserve">We agreed </w:t>
-      </w:r>
-      <w:r>
-        <w:rPr>
-          <w:rFonts w:ascii="Calibri" w:eastAsia="Calibri" w:hAnsi="Calibri" w:cs="Calibri"/>
-        </w:rPr>
-        <w:lastRenderedPageBreak/>
-        <w:t xml:space="preserve">that referring hourly emission factors can be misleading since the primary focus of the study is to quantify the deviations </w:t>
+        <w:t xml:space="preserve">We agreed that </w:t>
+      </w:r>
+      <w:r>
+        <w:rPr>
+          <w:rFonts w:ascii="Calibri" w:eastAsia="Calibri" w:hAnsi="Calibri" w:cs="Calibri"/>
+        </w:rPr>
+        <w:t xml:space="preserve">framing </w:t>
+      </w:r>
+      <w:r>
+        <w:rPr>
+          <w:rFonts w:ascii="Calibri" w:eastAsia="Calibri" w:hAnsi="Calibri" w:cs="Calibri"/>
+        </w:rPr>
+        <w:t xml:space="preserve">hourly emission factors </w:t>
+      </w:r>
+      <w:r>
+        <w:rPr>
+          <w:rFonts w:ascii="Calibri" w:eastAsia="Calibri" w:hAnsi="Calibri" w:cs="Calibri"/>
+        </w:rPr>
+        <w:t xml:space="preserve">as the “ground truth” </w:t>
+      </w:r>
+      <w:r>
+        <w:rPr>
+          <w:rFonts w:ascii="Calibri" w:eastAsia="Calibri" w:hAnsi="Calibri" w:cs="Calibri"/>
+        </w:rPr>
+        <w:t xml:space="preserve">can be misleading since the primary focus of the study is to quantify the deviations </w:t>
       </w:r>
       <w:r>
         <w:rPr>
@@ -2208,12 +2469,6 @@
         <w:rPr>
           <w:rFonts w:ascii="Calibri" w:eastAsia="Calibri" w:hAnsi="Calibri" w:cs="Calibri"/>
         </w:rPr>
-        <w:t>. To enhance clarity of the methodology, we summarized the general limitation of mapping between various emission factors and measured electricity also in the methodology</w:t>
-      </w:r>
-      <w:r>
-        <w:rPr>
-          <w:rFonts w:ascii="Calibri" w:eastAsia="Calibri" w:hAnsi="Calibri" w:cs="Calibri"/>
-        </w:rPr>
         <w:t xml:space="preserve">. </w:t>
       </w:r>
     </w:p>
@@ -2223,63 +2478,209 @@
         <w:jc w:val="both"/>
         <w:rPr>
           <w:rFonts w:ascii="Calibri" w:eastAsia="Calibri" w:hAnsi="Calibri" w:cs="Calibri"/>
-          <w:lang w:val="en-US"/>
-        </w:rPr>
-      </w:pPr>
-      <w:r>
-        <w:rPr>
-          <w:rFonts w:ascii="Calibri" w:eastAsia="Calibri" w:hAnsi="Calibri" w:cs="Calibri"/>
-        </w:rPr>
-        <w:t xml:space="preserve">For the updated version, we </w:t>
-      </w:r>
-      <w:r>
-        <w:rPr>
-          <w:rFonts w:ascii="Calibri" w:eastAsia="Calibri" w:hAnsi="Calibri" w:cs="Calibri"/>
-        </w:rPr>
-        <w:t>added</w:t>
-      </w:r>
-      <w:r>
-        <w:rPr>
-          <w:rFonts w:ascii="Calibri" w:eastAsia="Calibri" w:hAnsi="Calibri" w:cs="Calibri"/>
-        </w:rPr>
-        <w:t xml:space="preserve"> in Section 3 “Methodology”: “</w:t>
-      </w:r>
-      <w:r>
-        <w:rPr>
-          <w:rFonts w:ascii="Calibri" w:eastAsia="Calibri" w:hAnsi="Calibri" w:cs="Calibri"/>
-          <w:i/>
-          <w:iCs/>
-          <w:u w:val="single"/>
-          <w:lang w:val="en-US"/>
-        </w:rPr>
-        <w:t xml:space="preserve">To assess the error induced by less accurate emission factors, we used the hourly emission factor as the baseline (i.e., the high resolution benchmark reference), although this assumes that hourly emission factors are accurate even for 2050 prediction, which is certainly not the case, they most realistically represent future grid conditions based on cost, capacity expansion and dispatch model of the grid. </w:t>
-      </w:r>
-      <w:r>
-        <w:rPr>
-          <w:rFonts w:ascii="Calibri" w:eastAsia="Calibri" w:hAnsi="Calibri" w:cs="Calibri"/>
-          <w:i/>
-          <w:iCs/>
-          <w:u w:val="single"/>
-          <w:lang w:val="en-US"/>
-        </w:rPr>
-        <w:t>We acknowledge that the mapping between grid emission factors and building electricity measurements are subject to weather mismatches between different years. Additionally</w:t>
-      </w:r>
-      <w:r>
-        <w:rPr>
-          <w:rFonts w:ascii="Calibri" w:eastAsia="Calibri" w:hAnsi="Calibri" w:cs="Calibri"/>
-          <w:i/>
-          <w:iCs/>
-          <w:u w:val="single"/>
-          <w:lang w:val="en-US"/>
-        </w:rPr>
-        <w:t>, this study applies the same measured building electricity profiles across future grid scenarios, whereas dynamic modeling that incorporates climate change and evolving occupant behavior, as recommended by the IEA Annex project [44], would provide greater fidelity. To address these limitations while maintaining interpretability, we selected three grid regions and future scenarios as representative examples spanning the full range of expected grid conditions, from regions with high shares of diversified renewables (e.g., CAISO) to those still heavily reliant on fossil fuels (e.g., PJM East). A direct comparison of these grid characteristics is provided in Figure 11. Supplementary materials include results for an additional 15 grid regions across the contiguous United States and the avoided emissions assessment results.</w:t>
-      </w:r>
-      <w:r>
-        <w:rPr>
-          <w:rFonts w:ascii="Calibri" w:eastAsia="Calibri" w:hAnsi="Calibri" w:cs="Calibri"/>
-          <w:i/>
-          <w:iCs/>
-          <w:u w:val="single"/>
+        </w:rPr>
+      </w:pPr>
+      <w:r>
+        <w:rPr>
+          <w:rFonts w:ascii="Calibri" w:eastAsia="Calibri" w:hAnsi="Calibri" w:cs="Calibri"/>
+        </w:rPr>
+        <w:t xml:space="preserve">To enhance clarity of the methodology, </w:t>
+      </w:r>
+      <w:r>
+        <w:rPr>
+          <w:rFonts w:ascii="Calibri" w:eastAsia="Calibri" w:hAnsi="Calibri" w:cs="Calibri"/>
+        </w:rPr>
+        <w:t>we first mentioned the general limitation that associated with the reference of hourly emission factors: “</w:t>
+      </w:r>
+      <w:r>
+        <w:rPr>
+          <w:rFonts w:ascii="Calibri" w:eastAsia="Calibri" w:hAnsi="Calibri" w:cs="Calibri"/>
+          <w:i/>
+          <w:iCs/>
+          <w:u w:val="single"/>
+          <w:lang w:val="en-US"/>
+        </w:rPr>
+        <w:t xml:space="preserve">To assess the error induced by less accurate emission factors, we used the hourly emission factor as the baseline (i.e., the high resolution benchmark reference), although this assumes that hourly emission factors are accurate even for 2050 prediction, which is certainly not the case, they most realistically </w:t>
+      </w:r>
+      <w:r>
+        <w:rPr>
+          <w:rFonts w:ascii="Calibri" w:eastAsia="Calibri" w:hAnsi="Calibri" w:cs="Calibri"/>
+          <w:i/>
+          <w:iCs/>
+          <w:u w:val="single"/>
+          <w:lang w:val="en-US"/>
+        </w:rPr>
+        <w:t>project</w:t>
+      </w:r>
+      <w:r>
+        <w:rPr>
+          <w:rFonts w:ascii="Calibri" w:eastAsia="Calibri" w:hAnsi="Calibri" w:cs="Calibri"/>
+          <w:i/>
+          <w:iCs/>
+          <w:u w:val="single"/>
+          <w:lang w:val="en-US"/>
+        </w:rPr>
+        <w:t xml:space="preserve"> future grid conditions based on cost, capacity expansion and dispatch model of the grid.</w:t>
+      </w:r>
+      <w:r>
+        <w:rPr>
+          <w:rFonts w:ascii="Calibri" w:eastAsia="Calibri" w:hAnsi="Calibri" w:cs="Calibri"/>
+          <w:i/>
+          <w:iCs/>
+          <w:u w:val="single"/>
+          <w:lang w:val="en-US"/>
+        </w:rPr>
+        <w:t>”</w:t>
+      </w:r>
+      <w:r>
+        <w:rPr>
+          <w:rFonts w:ascii="Calibri" w:eastAsia="Calibri" w:hAnsi="Calibri" w:cs="Calibri"/>
+          <w:lang w:val="en-US"/>
+        </w:rPr>
+        <w:t xml:space="preserve"> </w:t>
+      </w:r>
+      <w:r>
+        <w:rPr>
+          <w:rFonts w:ascii="Calibri" w:eastAsia="Calibri" w:hAnsi="Calibri" w:cs="Calibri"/>
+          <w:lang w:val="en-US"/>
+        </w:rPr>
+        <w:t xml:space="preserve">Then, </w:t>
+      </w:r>
+      <w:r>
+        <w:rPr>
+          <w:rFonts w:ascii="Calibri" w:eastAsia="Calibri" w:hAnsi="Calibri" w:cs="Calibri"/>
+        </w:rPr>
+        <w:t>we summarized the general limitation of mapping between various emission factors and measured electricity in the methodology</w:t>
+      </w:r>
+      <w:r>
+        <w:rPr>
+          <w:rFonts w:ascii="Calibri" w:eastAsia="Calibri" w:hAnsi="Calibri" w:cs="Calibri"/>
+        </w:rPr>
+        <w:t>:</w:t>
+      </w:r>
+      <w:r>
+        <w:rPr>
+          <w:rFonts w:ascii="Calibri" w:eastAsia="Calibri" w:hAnsi="Calibri" w:cs="Calibri"/>
+        </w:rPr>
+        <w:t xml:space="preserve"> “</w:t>
+      </w:r>
+      <w:r>
+        <w:rPr>
+          <w:rFonts w:ascii="Calibri" w:eastAsia="Calibri" w:hAnsi="Calibri" w:cs="Calibri"/>
+          <w:i/>
+          <w:iCs/>
+          <w:u w:val="single"/>
+          <w:lang w:val="en-US"/>
+        </w:rPr>
+        <w:t>We acknowledge that the mapping between grid emission factors and building electricity measurements are subject to weather mismatches between different years. Additionally, this study applies the same measured building electricity profiles across future grid scenarios, whereas dynamic modeling that incorporates climate change and evolving occupant behavior, as recommended by the IEA Annex project [44].</w:t>
+      </w:r>
+      <w:r>
+        <w:rPr>
+          <w:rFonts w:ascii="Calibri" w:eastAsia="Calibri" w:hAnsi="Calibri" w:cs="Calibri"/>
+          <w:i/>
+          <w:iCs/>
+          <w:u w:val="single"/>
+          <w:lang w:val="en-US"/>
+        </w:rPr>
+        <w:t>”</w:t>
+      </w:r>
+      <w:r>
+        <w:rPr>
+          <w:rFonts w:ascii="Calibri" w:eastAsia="Calibri" w:hAnsi="Calibri" w:cs="Calibri"/>
+          <w:lang w:val="en-US"/>
+        </w:rPr>
+        <w:t xml:space="preserve"> </w:t>
+      </w:r>
+      <w:r>
+        <w:rPr>
+          <w:rFonts w:ascii="Calibri" w:eastAsia="Calibri" w:hAnsi="Calibri" w:cs="Calibri"/>
+          <w:lang w:val="en-US"/>
+        </w:rPr>
+        <w:t>Since we have subsections describing the building and the emission datasets, we believe adding dedicated limitation paragraphs to each subsection provides more clarity. Therefore, we attached the weather synchronization concern at the end of section 3.2 “Cambium 2024 dataset”: “</w:t>
+      </w:r>
+      <w:r>
+        <w:rPr>
+          <w:rFonts w:ascii="Calibri" w:eastAsia="Calibri" w:hAnsi="Calibri" w:cs="Calibri"/>
+          <w:i/>
+          <w:iCs/>
+          <w:u w:val="single"/>
+          <w:lang w:val="en-US"/>
+        </w:rPr>
+        <w:t>A key practical limitation and also constraint in applying hourly emission factors as the benchmark reference is their sensitivity to weather assumptions. Hourly grid emission rates are typically derived from production-cost or dispatch models calibrated using meteorological conditions from a specific historical year (or a limited set of years, such as those extracted from the Cambium dataset, which uses actual meteorological data from 2012). As a result, the temporal profile of renewable generation, load, and marginal unit dispatch embedded in these hourly factors reflects weather patterns that may not align with the actual weather experienced by buildings during the analysis period.</w:t>
+      </w:r>
+      <w:r>
+        <w:t xml:space="preserve"> </w:t>
+      </w:r>
+      <w:r>
+        <w:rPr>
+          <w:rFonts w:ascii="Calibri" w:eastAsia="Calibri" w:hAnsi="Calibri" w:cs="Calibri"/>
+          <w:i/>
+          <w:iCs/>
+          <w:u w:val="single"/>
+        </w:rPr>
+        <w:t>Even when projections target the same calendar year, weather variability within a grid region can be substantial.</w:t>
+      </w:r>
+      <w:r>
+        <w:rPr>
+          <w:rFonts w:ascii="Calibri" w:eastAsia="Calibri" w:hAnsi="Calibri" w:cs="Calibri"/>
+          <w:i/>
+          <w:iCs/>
+          <w:u w:val="single"/>
+        </w:rPr>
+        <w:t xml:space="preserve"> </w:t>
+      </w:r>
+      <w:r>
+        <w:rPr>
+          <w:rFonts w:ascii="Calibri" w:eastAsia="Calibri" w:hAnsi="Calibri" w:cs="Calibri"/>
+          <w:i/>
+          <w:iCs/>
+          <w:u w:val="single"/>
+          <w:lang w:val="en-US"/>
+        </w:rPr>
+        <w:t>This mismatch can introduce systematic discrepancies when hourly emission factors are paired with measured building electricity consumption from a different year or region, particularly under extreme or anomalous weather conditions. For example, there might be an emissions spike in the grid prediction due to a rare event, such as a storm in the weather file used, and that did not coincide with the actual weather encountered by the building.</w:t>
+      </w:r>
+      <w:r>
+        <w:rPr>
+          <w:rFonts w:ascii="Calibri" w:eastAsia="Calibri" w:hAnsi="Calibri" w:cs="Calibri"/>
+          <w:i/>
+          <w:iCs/>
+          <w:u w:val="single"/>
+          <w:lang w:val="en-US"/>
+        </w:rPr>
+        <w:t xml:space="preserve"> Such asynchronization is common </w:t>
+      </w:r>
+      <w:r>
+        <w:rPr>
+          <w:rFonts w:ascii="Calibri" w:eastAsia="Calibri" w:hAnsi="Calibri" w:cs="Calibri"/>
+          <w:i/>
+          <w:iCs/>
+          <w:u w:val="single"/>
+          <w:lang w:val="en-US"/>
+        </w:rPr>
+        <w:t>i</w:t>
+      </w:r>
+      <w:r>
+        <w:rPr>
+          <w:rFonts w:ascii="Calibri" w:eastAsia="Calibri" w:hAnsi="Calibri" w:cs="Calibri"/>
+          <w:i/>
+          <w:iCs/>
+          <w:u w:val="single"/>
+        </w:rPr>
+        <w:t>n future projection analyses, though it is generally less critical for retrospective emissions accounting</w:t>
+      </w:r>
+      <w:r>
+        <w:rPr>
+          <w:rFonts w:ascii="Calibri" w:eastAsia="Calibri" w:hAnsi="Calibri" w:cs="Calibri"/>
+          <w:i/>
+          <w:iCs/>
+          <w:u w:val="single"/>
+          <w:lang w:val="en-US"/>
+        </w:rPr>
+        <w:t>.</w:t>
+      </w:r>
+      <w:r>
+        <w:rPr>
+          <w:rFonts w:ascii="Calibri" w:eastAsia="Calibri" w:hAnsi="Calibri" w:cs="Calibri"/>
           <w:lang w:val="en-US"/>
         </w:rPr>
         <w:t>”</w:t>
@@ -2309,7 +2710,17 @@
           <w:bCs/>
           <w:color w:val="4C94D8" w:themeColor="text2" w:themeTint="80"/>
         </w:rPr>
-        <w:t>In section 3.1. "Building Genome 2.0 dataset" the author highlighted that buildings from the Building Genome dataset are treated as a single aggregated group across grid regions, ignoring regional building characteristics. Hence, it should be clarified how this assumption may influence the results and associated uncertainty.</w:t>
+        <w:t xml:space="preserve">In section 3.1. "Building Genome 2.0 dataset" the author highlighted that buildings from the Building Genome dataset are treated as a single aggregated group across grid regions, </w:t>
+      </w:r>
+      <w:r>
+        <w:rPr>
+          <w:rFonts w:ascii="Calibri" w:eastAsia="Calibri" w:hAnsi="Calibri" w:cs="Calibri"/>
+          <w:b/>
+          <w:bCs/>
+          <w:color w:val="4C94D8" w:themeColor="text2" w:themeTint="80"/>
+        </w:rPr>
+        <w:lastRenderedPageBreak/>
+        <w:t>ignoring regional building characteristics. Hence, it should be clarified how this assumption may influence the results and associated uncertainty.</w:t>
       </w:r>
     </w:p>
     <w:p>
@@ -2338,7 +2749,19 @@
         <w:rPr>
           <w:rFonts w:ascii="Calibri" w:eastAsia="Calibri" w:hAnsi="Calibri" w:cs="Calibri"/>
         </w:rPr>
-        <w:t xml:space="preserve">ks for the comment, we added discussion to the Section 3.1. “Building Genome 2.0 dataset” </w:t>
+        <w:t xml:space="preserve">ks for the comment, </w:t>
+      </w:r>
+      <w:r>
+        <w:rPr>
+          <w:rFonts w:ascii="Calibri" w:eastAsia="Calibri" w:hAnsi="Calibri" w:cs="Calibri"/>
+        </w:rPr>
+        <w:t xml:space="preserve">as we outlined in the previous response, we provide dedicated paragraphs to each subsection of the methodology. Therefore, we added in </w:t>
+      </w:r>
+      <w:r>
+        <w:rPr>
+          <w:rFonts w:ascii="Calibri" w:eastAsia="Calibri" w:hAnsi="Calibri" w:cs="Calibri"/>
+        </w:rPr>
+        <w:t xml:space="preserve">Section 3.1. “Building Genome 2.0 dataset” </w:t>
       </w:r>
       <w:r>
         <w:rPr>
@@ -2422,68 +2845,412 @@
           <w:b/>
           <w:bCs/>
         </w:rPr>
+        <w:t xml:space="preserve">Response: </w:t>
+      </w:r>
+      <w:r>
+        <w:rPr>
+          <w:rFonts w:ascii="Calibri" w:eastAsia="Calibri" w:hAnsi="Calibri" w:cs="Calibri"/>
+          <w:highlight w:val="yellow"/>
+          <w:rPrChange w:id="2" w:author="Aoyu Zou" w:date="2026-01-29T12:14:00Z" w16du:dateUtc="2026-01-29T20:14:00Z">
+            <w:rPr>
+              <w:rFonts w:ascii="Calibri" w:eastAsia="Calibri" w:hAnsi="Calibri" w:cs="Calibri"/>
+            </w:rPr>
+          </w:rPrChange>
+        </w:rPr>
+        <w:t xml:space="preserve">Thanks for the comment, which is important feedback for the study to improve the implication of the analysis results. We </w:t>
+      </w:r>
+      <w:r>
+        <w:rPr>
+          <w:rFonts w:ascii="Calibri" w:eastAsia="Calibri" w:hAnsi="Calibri" w:cs="Calibri"/>
+          <w:highlight w:val="yellow"/>
+          <w:rPrChange w:id="3" w:author="Aoyu Zou" w:date="2026-01-29T12:14:00Z" w16du:dateUtc="2026-01-29T20:14:00Z">
+            <w:rPr>
+              <w:rFonts w:ascii="Calibri" w:eastAsia="Calibri" w:hAnsi="Calibri" w:cs="Calibri"/>
+            </w:rPr>
+          </w:rPrChange>
+        </w:rPr>
+        <w:t>added</w:t>
+      </w:r>
+      <w:r>
+        <w:rPr>
+          <w:rFonts w:ascii="Calibri" w:eastAsia="Calibri" w:hAnsi="Calibri" w:cs="Calibri"/>
+          <w:highlight w:val="yellow"/>
+          <w:rPrChange w:id="4" w:author="Aoyu Zou" w:date="2026-01-29T12:14:00Z" w16du:dateUtc="2026-01-29T20:14:00Z">
+            <w:rPr>
+              <w:rFonts w:ascii="Calibri" w:eastAsia="Calibri" w:hAnsi="Calibri" w:cs="Calibri"/>
+            </w:rPr>
+          </w:rPrChange>
+        </w:rPr>
+        <w:t xml:space="preserve"> a new section </w:t>
+      </w:r>
+      <w:r>
+        <w:rPr>
+          <w:rFonts w:ascii="Calibri" w:eastAsia="Calibri" w:hAnsi="Calibri" w:cs="Calibri"/>
+          <w:highlight w:val="yellow"/>
+          <w:rPrChange w:id="5" w:author="Aoyu Zou" w:date="2026-01-29T12:14:00Z" w16du:dateUtc="2026-01-29T20:14:00Z">
+            <w:rPr>
+              <w:rFonts w:ascii="Calibri" w:eastAsia="Calibri" w:hAnsi="Calibri" w:cs="Calibri"/>
+            </w:rPr>
+          </w:rPrChange>
+        </w:rPr>
+        <w:t>4.4 “</w:t>
+      </w:r>
+      <w:r>
+        <w:rPr>
+          <w:rFonts w:ascii="Calibri" w:eastAsia="Calibri" w:hAnsi="Calibri" w:cs="Calibri"/>
+          <w:highlight w:val="yellow"/>
+          <w:rPrChange w:id="6" w:author="Aoyu Zou" w:date="2026-01-29T12:14:00Z" w16du:dateUtc="2026-01-29T20:14:00Z">
+            <w:rPr>
+              <w:rFonts w:ascii="Calibri" w:eastAsia="Calibri" w:hAnsi="Calibri" w:cs="Calibri"/>
+            </w:rPr>
+          </w:rPrChange>
+        </w:rPr>
+        <w:t>Other grid regions</w:t>
+      </w:r>
+      <w:r>
+        <w:rPr>
+          <w:rFonts w:ascii="Calibri" w:eastAsia="Calibri" w:hAnsi="Calibri" w:cs="Calibri"/>
+          <w:highlight w:val="yellow"/>
+          <w:rPrChange w:id="7" w:author="Aoyu Zou" w:date="2026-01-29T12:14:00Z" w16du:dateUtc="2026-01-29T20:14:00Z">
+            <w:rPr>
+              <w:rFonts w:ascii="Calibri" w:eastAsia="Calibri" w:hAnsi="Calibri" w:cs="Calibri"/>
+            </w:rPr>
+          </w:rPrChange>
+        </w:rPr>
+        <w:t xml:space="preserve">” </w:t>
+      </w:r>
+      <w:r>
+        <w:rPr>
+          <w:rFonts w:ascii="Calibri" w:eastAsia="Calibri" w:hAnsi="Calibri" w:cs="Calibri"/>
+          <w:highlight w:val="yellow"/>
+          <w:rPrChange w:id="8" w:author="Aoyu Zou" w:date="2026-01-29T12:14:00Z" w16du:dateUtc="2026-01-29T20:14:00Z">
+            <w:rPr>
+              <w:rFonts w:ascii="Calibri" w:eastAsia="Calibri" w:hAnsi="Calibri" w:cs="Calibri"/>
+            </w:rPr>
+          </w:rPrChange>
+        </w:rPr>
+        <w:t xml:space="preserve">at the </w:t>
+      </w:r>
+      <w:r>
+        <w:rPr>
+          <w:rFonts w:ascii="Calibri" w:eastAsia="Calibri" w:hAnsi="Calibri" w:cs="Calibri"/>
+          <w:highlight w:val="yellow"/>
+          <w:rPrChange w:id="9" w:author="Aoyu Zou" w:date="2026-01-29T12:14:00Z" w16du:dateUtc="2026-01-29T20:14:00Z">
+            <w:rPr>
+              <w:rFonts w:ascii="Calibri" w:eastAsia="Calibri" w:hAnsi="Calibri" w:cs="Calibri"/>
+            </w:rPr>
+          </w:rPrChange>
+        </w:rPr>
+        <w:t>end of current result section</w:t>
+      </w:r>
+      <w:r>
+        <w:rPr>
+          <w:rFonts w:ascii="Calibri" w:eastAsia="Calibri" w:hAnsi="Calibri" w:cs="Calibri"/>
+          <w:highlight w:val="yellow"/>
+          <w:rPrChange w:id="10" w:author="Aoyu Zou" w:date="2026-01-29T12:14:00Z" w16du:dateUtc="2026-01-29T20:14:00Z">
+            <w:rPr>
+              <w:rFonts w:ascii="Calibri" w:eastAsia="Calibri" w:hAnsi="Calibri" w:cs="Calibri"/>
+            </w:rPr>
+          </w:rPrChange>
+        </w:rPr>
+        <w:t xml:space="preserve"> and added two new figures to show the median fractional errors of each emission factors discussed calculated for all grid regions. </w:t>
+      </w:r>
+      <w:r>
+        <w:rPr>
+          <w:rFonts w:ascii="Calibri" w:eastAsia="Calibri" w:hAnsi="Calibri" w:cs="Calibri"/>
+          <w:highlight w:val="yellow"/>
+          <w:rPrChange w:id="11" w:author="Aoyu Zou" w:date="2026-01-29T12:14:00Z" w16du:dateUtc="2026-01-29T20:14:00Z">
+            <w:rPr>
+              <w:rFonts w:ascii="Calibri" w:eastAsia="Calibri" w:hAnsi="Calibri" w:cs="Calibri"/>
+            </w:rPr>
+          </w:rPrChange>
+        </w:rPr>
+        <w:t>And at the end of avoided emissions quantification, we added a paragraph describing how the fractional errors compare to a previous field evaluation study findings on the effect of load shift strategy:</w:t>
+      </w:r>
+    </w:p>
+    <w:p>
+      <w:pPr>
+        <w:spacing w:before="240" w:after="240"/>
+        <w:jc w:val="both"/>
+        <w:rPr>
+          <w:rFonts w:ascii="Calibri" w:eastAsia="Calibri" w:hAnsi="Calibri" w:cs="Calibri"/>
+          <w:i/>
+          <w:iCs/>
+          <w:u w:val="single"/>
+        </w:rPr>
+      </w:pPr>
+      <w:r>
+        <w:rPr>
+          <w:rFonts w:ascii="Calibri" w:eastAsia="Calibri" w:hAnsi="Calibri" w:cs="Calibri"/>
+          <w:i/>
+          <w:iCs/>
+          <w:u w:val="single"/>
+        </w:rPr>
+        <w:t>“</w:t>
+      </w:r>
+      <w:r>
+        <w:rPr>
+          <w:rFonts w:ascii="Calibri" w:eastAsia="Calibri" w:hAnsi="Calibri" w:cs="Calibri"/>
+          <w:i/>
+          <w:iCs/>
+          <w:u w:val="single"/>
+        </w:rPr>
+        <w:t xml:space="preserve">As can be seen from the errors estimated, </w:t>
+      </w:r>
+      <w:r>
+        <w:rPr>
+          <w:rFonts w:ascii="Calibri" w:eastAsia="Calibri" w:hAnsi="Calibri" w:cs="Calibri"/>
+          <w:i/>
+          <w:iCs/>
+          <w:u w:val="single"/>
+        </w:rPr>
+        <w:t xml:space="preserve">the use of coarse emission factors such as annual averages can overestimate the credited benefits of renewable energy generation, because periods of high onsite solar output often coincide </w:t>
+      </w:r>
+      <w:r>
+        <w:rPr>
+          <w:rFonts w:ascii="Calibri" w:eastAsia="Calibri" w:hAnsi="Calibri" w:cs="Calibri"/>
+          <w:i/>
+          <w:iCs/>
+          <w:u w:val="single"/>
+        </w:rPr>
+        <w:t xml:space="preserve">favorable grid conditions </w:t>
+      </w:r>
+      <w:r>
+        <w:rPr>
+          <w:rFonts w:ascii="Calibri" w:eastAsia="Calibri" w:hAnsi="Calibri" w:cs="Calibri"/>
+          <w:i/>
+          <w:iCs/>
+          <w:u w:val="single"/>
+        </w:rPr>
+        <w:t>with low</w:t>
+      </w:r>
+      <w:r>
+        <w:rPr>
+          <w:rFonts w:ascii="Calibri" w:eastAsia="Calibri" w:hAnsi="Calibri" w:cs="Calibri"/>
+          <w:i/>
+          <w:iCs/>
+          <w:u w:val="single"/>
+        </w:rPr>
+        <w:t>er</w:t>
+      </w:r>
+      <w:r>
+        <w:rPr>
+          <w:rFonts w:ascii="Calibri" w:eastAsia="Calibri" w:hAnsi="Calibri" w:cs="Calibri"/>
+          <w:i/>
+          <w:iCs/>
+          <w:u w:val="single"/>
+        </w:rPr>
+        <w:t xml:space="preserve"> emission</w:t>
+      </w:r>
+      <w:r>
+        <w:rPr>
+          <w:rFonts w:ascii="Calibri" w:eastAsia="Calibri" w:hAnsi="Calibri" w:cs="Calibri"/>
+          <w:i/>
+          <w:iCs/>
+          <w:u w:val="single"/>
+        </w:rPr>
+        <w:t xml:space="preserve"> rates</w:t>
+      </w:r>
+      <w:r>
+        <w:rPr>
+          <w:rFonts w:ascii="Calibri" w:eastAsia="Calibri" w:hAnsi="Calibri" w:cs="Calibri"/>
+          <w:i/>
+          <w:iCs/>
+          <w:u w:val="single"/>
+        </w:rPr>
+        <w:t xml:space="preserve">. At the same time, these simplified factors tend to underestimate the impacts of load-shifting retrofit measures, whether achieved through </w:t>
+      </w:r>
+      <w:r>
+        <w:rPr>
+          <w:rFonts w:ascii="Calibri" w:eastAsia="Calibri" w:hAnsi="Calibri" w:cs="Calibri"/>
+          <w:i/>
+          <w:iCs/>
+          <w:u w:val="single"/>
+        </w:rPr>
+        <w:t xml:space="preserve">simple </w:t>
+      </w:r>
+      <w:r>
+        <w:rPr>
+          <w:rFonts w:ascii="Calibri" w:eastAsia="Calibri" w:hAnsi="Calibri" w:cs="Calibri"/>
+          <w:i/>
+          <w:iCs/>
+          <w:u w:val="single"/>
+        </w:rPr>
+        <w:t xml:space="preserve">setpoint </w:t>
+      </w:r>
+      <w:r>
+        <w:rPr>
+          <w:rFonts w:ascii="Calibri" w:eastAsia="Calibri" w:hAnsi="Calibri" w:cs="Calibri"/>
+          <w:i/>
+          <w:iCs/>
+          <w:u w:val="single"/>
+        </w:rPr>
+        <w:t>reset</w:t>
+      </w:r>
+      <w:r>
+        <w:rPr>
+          <w:rFonts w:ascii="Calibri" w:eastAsia="Calibri" w:hAnsi="Calibri" w:cs="Calibri"/>
+          <w:i/>
+          <w:iCs/>
+          <w:u w:val="single"/>
+        </w:rPr>
+        <w:t xml:space="preserve"> or energy storage systems. This</w:t>
+      </w:r>
+      <w:r>
+        <w:rPr>
+          <w:rFonts w:ascii="Calibri" w:eastAsia="Calibri" w:hAnsi="Calibri" w:cs="Calibri"/>
+          <w:i/>
+          <w:iCs/>
+          <w:u w:val="single"/>
+        </w:rPr>
+        <w:t xml:space="preserve"> overlooked underestimation </w:t>
+      </w:r>
+      <w:r>
+        <w:rPr>
+          <w:rFonts w:ascii="Calibri" w:eastAsia="Calibri" w:hAnsi="Calibri" w:cs="Calibri"/>
+          <w:i/>
+          <w:iCs/>
+          <w:u w:val="single"/>
+        </w:rPr>
+        <w:t>can ultimately discourage participation in emission-based demand response programs</w:t>
+      </w:r>
+      <w:r>
+        <w:rPr>
+          <w:rFonts w:ascii="Calibri" w:eastAsia="Calibri" w:hAnsi="Calibri" w:cs="Calibri"/>
+          <w:i/>
+          <w:iCs/>
+          <w:u w:val="single"/>
+        </w:rPr>
+        <w:t xml:space="preserve"> that is also crucial for climate change mitigation</w:t>
+      </w:r>
+      <w:r>
+        <w:rPr>
+          <w:rFonts w:ascii="Calibri" w:eastAsia="Calibri" w:hAnsi="Calibri" w:cs="Calibri"/>
+          <w:i/>
+          <w:iCs/>
+          <w:u w:val="single"/>
+        </w:rPr>
+        <w:t>.</w:t>
+      </w:r>
+      <w:r>
+        <w:rPr>
+          <w:rFonts w:ascii="Calibri" w:eastAsia="Calibri" w:hAnsi="Calibri" w:cs="Calibri"/>
+          <w:i/>
+          <w:iCs/>
+          <w:u w:val="single"/>
+        </w:rPr>
+        <w:t>”</w:t>
+      </w:r>
+      <w:r>
+        <w:rPr>
+          <w:rFonts w:ascii="Calibri" w:eastAsia="Calibri" w:hAnsi="Calibri" w:cs="Calibri"/>
+          <w:i/>
+          <w:iCs/>
+          <w:u w:val="single"/>
+        </w:rPr>
+        <w:t xml:space="preserve"> </w:t>
+      </w:r>
+    </w:p>
+    <w:p>
+      <w:pPr>
+        <w:pStyle w:val="ListParagraph"/>
+        <w:numPr>
+          <w:ilvl w:val="0"/>
+          <w:numId w:val="1"/>
+        </w:numPr>
+        <w:spacing w:before="240" w:after="240"/>
+        <w:ind w:left="360"/>
+        <w:jc w:val="both"/>
+        <w:rPr>
+          <w:rFonts w:ascii="Calibri" w:eastAsia="Calibri" w:hAnsi="Calibri" w:cs="Calibri"/>
+          <w:b/>
+          <w:bCs/>
+          <w:color w:val="4C94D8" w:themeColor="text2" w:themeTint="80"/>
+        </w:rPr>
+      </w:pPr>
+      <w:r>
+        <w:rPr>
+          <w:rFonts w:ascii="Calibri" w:eastAsia="Calibri" w:hAnsi="Calibri" w:cs="Calibri"/>
+          <w:b/>
+          <w:bCs/>
+          <w:color w:val="4C94D8" w:themeColor="text2" w:themeTint="80"/>
+        </w:rPr>
+        <w:t>The CAISO-focused results in section 4.1. "CAISO" are detailed; however, it is not always clear whether the observed trends are region-specific or expected to hold across other grid regions. Therefore, the authors should clarify which findings are general and which are context dependent.</w:t>
+      </w:r>
+    </w:p>
+    <w:p>
+      <w:pPr>
+        <w:spacing w:before="240" w:after="240"/>
+        <w:jc w:val="both"/>
+        <w:rPr>
+          <w:rFonts w:ascii="Calibri" w:eastAsia="Calibri" w:hAnsi="Calibri" w:cs="Calibri"/>
+        </w:rPr>
+      </w:pPr>
+      <w:r>
+        <w:rPr>
+          <w:rFonts w:ascii="Calibri" w:eastAsia="Calibri" w:hAnsi="Calibri" w:cs="Calibri"/>
+          <w:b/>
+          <w:bCs/>
+        </w:rPr>
+        <w:t xml:space="preserve">Response: </w:t>
+      </w:r>
+      <w:r>
+        <w:rPr>
+          <w:rFonts w:ascii="Calibri" w:eastAsia="Calibri" w:hAnsi="Calibri" w:cs="Calibri"/>
+        </w:rPr>
+        <w:t>Thank</w:t>
+      </w:r>
+      <w:r>
+        <w:rPr>
+          <w:rFonts w:ascii="Calibri" w:eastAsia="Calibri" w:hAnsi="Calibri" w:cs="Calibri"/>
+        </w:rPr>
+        <w:t xml:space="preserve">s for the comment, as responded to the previous comments, we added a new section 4.4 “Other grid regions” in the results analysis to show the overall median fractional errors </w:t>
+      </w:r>
+      <w:r>
+        <w:rPr>
+          <w:rFonts w:ascii="Calibri" w:eastAsia="Calibri" w:hAnsi="Calibri" w:cs="Calibri"/>
+        </w:rPr>
+        <w:t xml:space="preserve">of operational and avoided emissions </w:t>
+      </w:r>
+      <w:r>
+        <w:rPr>
+          <w:rFonts w:ascii="Calibri" w:eastAsia="Calibri" w:hAnsi="Calibri" w:cs="Calibri"/>
+        </w:rPr>
+        <w:t xml:space="preserve">over </w:t>
+      </w:r>
+      <w:r>
+        <w:rPr>
+          <w:rFonts w:ascii="Calibri" w:eastAsia="Calibri" w:hAnsi="Calibri" w:cs="Calibri"/>
+        </w:rPr>
+        <w:t xml:space="preserve">all 18 grid regions. </w:t>
+      </w:r>
+    </w:p>
+    <w:p>
+      <w:pPr>
+        <w:spacing w:before="240" w:after="240"/>
+        <w:jc w:val="both"/>
+        <w:rPr>
+          <w:rFonts w:ascii="Calibri" w:eastAsia="Calibri" w:hAnsi="Calibri" w:cs="Calibri"/>
+          <w:i/>
+          <w:iCs/>
+          <w:u w:val="single"/>
+        </w:rPr>
+      </w:pPr>
+      <w:r>
+        <w:rPr>
+          <w:rFonts w:ascii="Calibri" w:eastAsia="Calibri" w:hAnsi="Calibri" w:cs="Calibri"/>
+        </w:rPr>
         <w:lastRenderedPageBreak/>
-        <w:t xml:space="preserve">Response: </w:t>
-      </w:r>
-      <w:r>
-        <w:rPr>
-          <w:rFonts w:ascii="Calibri" w:eastAsia="Calibri" w:hAnsi="Calibri" w:cs="Calibri"/>
-        </w:rPr>
-        <w:t>Th</w:t>
-      </w:r>
-      <w:r>
-        <w:rPr>
-          <w:rFonts w:ascii="Calibri" w:eastAsia="Calibri" w:hAnsi="Calibri" w:cs="Calibri"/>
-        </w:rPr>
-        <w:t xml:space="preserve">anks for the comment, which is important feedback for the study to improve the implication of the analysis results. We </w:t>
-      </w:r>
-      <w:r>
-        <w:rPr>
-          <w:rFonts w:ascii="Calibri" w:eastAsia="Calibri" w:hAnsi="Calibri" w:cs="Calibri"/>
-        </w:rPr>
-        <w:t>added</w:t>
-      </w:r>
-      <w:r>
-        <w:rPr>
-          <w:rFonts w:ascii="Calibri" w:eastAsia="Calibri" w:hAnsi="Calibri" w:cs="Calibri"/>
-        </w:rPr>
-        <w:t xml:space="preserve"> a new section </w:t>
-      </w:r>
-      <w:r>
-        <w:rPr>
-          <w:rFonts w:ascii="Calibri" w:eastAsia="Calibri" w:hAnsi="Calibri" w:cs="Calibri"/>
-        </w:rPr>
-        <w:t>4.4 “</w:t>
-      </w:r>
-      <w:r>
-        <w:rPr>
-          <w:rFonts w:ascii="Calibri" w:eastAsia="Calibri" w:hAnsi="Calibri" w:cs="Calibri"/>
-        </w:rPr>
-        <w:t>Other grid regions</w:t>
-      </w:r>
-      <w:r>
-        <w:rPr>
-          <w:rFonts w:ascii="Calibri" w:eastAsia="Calibri" w:hAnsi="Calibri" w:cs="Calibri"/>
-        </w:rPr>
-        <w:t xml:space="preserve">” </w:t>
-      </w:r>
-      <w:r>
-        <w:rPr>
-          <w:rFonts w:ascii="Calibri" w:eastAsia="Calibri" w:hAnsi="Calibri" w:cs="Calibri"/>
-        </w:rPr>
-        <w:t xml:space="preserve">at the </w:t>
-      </w:r>
-      <w:r>
-        <w:rPr>
-          <w:rFonts w:ascii="Calibri" w:eastAsia="Calibri" w:hAnsi="Calibri" w:cs="Calibri"/>
-        </w:rPr>
-        <w:t>end of current result section</w:t>
-      </w:r>
-      <w:r>
-        <w:rPr>
-          <w:rFonts w:ascii="Calibri" w:eastAsia="Calibri" w:hAnsi="Calibri" w:cs="Calibri"/>
-        </w:rPr>
-        <w:t xml:space="preserve"> and added two new figures to show the median fractional errors of each emission factors discussed calculated for all grid regions. </w:t>
+        <w:t>“</w:t>
+      </w:r>
+      <w:r>
+        <w:rPr>
+          <w:rFonts w:ascii="Calibri" w:eastAsia="Calibri" w:hAnsi="Calibri" w:cs="Calibri"/>
+          <w:i/>
+          <w:iCs/>
+          <w:u w:val="single"/>
+        </w:rPr>
+        <w:t>4.4 Other grid regions</w:t>
       </w:r>
     </w:p>
     <w:p>
@@ -2492,19 +3259,51 @@
         <w:jc w:val="both"/>
         <w:rPr>
           <w:rFonts w:ascii="Calibri" w:eastAsia="Calibri" w:hAnsi="Calibri" w:cs="Calibri"/>
-        </w:rPr>
-      </w:pPr>
-      <w:r>
-        <w:rPr>
-          <w:rFonts w:ascii="Calibri" w:eastAsia="Calibri" w:hAnsi="Calibri" w:cs="Calibri"/>
-        </w:rPr>
-        <w:t>The two plots provide generalizable temporal sensitivity implications of the emission factors</w:t>
-      </w:r>
-      <w:r>
-        <w:rPr>
-          <w:rFonts w:ascii="Calibri" w:eastAsia="Calibri" w:hAnsi="Calibri" w:cs="Calibri"/>
-        </w:rPr>
-        <w:t xml:space="preserve">: </w:t>
+          <w:i/>
+          <w:iCs/>
+          <w:u w:val="single"/>
+          <w:lang w:val="en-US"/>
+        </w:rPr>
+      </w:pPr>
+      <w:r>
+        <w:rPr>
+          <w:rFonts w:ascii="Calibri" w:eastAsia="Calibri" w:hAnsi="Calibri" w:cs="Calibri"/>
+          <w:i/>
+          <w:iCs/>
+          <w:u w:val="single"/>
+          <w:lang w:val="en-US"/>
+        </w:rPr>
+        <w:t xml:space="preserve">Additional results for other grid regions, along with avoided emissions assessed using long-run marginal emissions rates (LRMER), are provided in the supplementary material. Across all 18 grid regions, we observed consistent patterns: annual emission factors systematically oversimplify operational emission intensity. Figure 9 summarizes these by presenting the median fractional error of aggregated net operational emissions and avoided emissions across results from all regions. For the current and near-future conditions (2025), annual, seasonal, and time-of-day emission factors yield median errors of approximately 5%, which may be considered acceptable given their simplicity and limited sensitivity to grid development scenarios. However, these factors become unreliable </w:t>
+      </w:r>
+      <w:r>
+        <w:rPr>
+          <w:rFonts w:ascii="Calibri" w:eastAsia="Calibri" w:hAnsi="Calibri" w:cs="Calibri"/>
+          <w:i/>
+          <w:iCs/>
+          <w:u w:val="single"/>
+          <w:lang w:val="en-US"/>
+        </w:rPr>
+        <w:t>when onsite solar generation continues to increase and gradually offsets the energy usage of the building</w:t>
+      </w:r>
+      <w:r>
+        <w:rPr>
+          <w:rFonts w:ascii="Calibri" w:eastAsia="Calibri" w:hAnsi="Calibri" w:cs="Calibri"/>
+          <w:i/>
+          <w:iCs/>
+          <w:u w:val="single"/>
+          <w:lang w:val="en-US"/>
+        </w:rPr>
+        <w:t>, whereas season-hour and month-hour emission factors consistently maintain median errors below 5%. Notably, the reported median fractional errors reflect deviations attributable solely to temporal resolution simplification, independent of uncertainty in the underlying emission intensity estimates.</w:t>
+      </w:r>
+      <w:r>
+        <w:rPr>
+          <w:rFonts w:ascii="Calibri" w:eastAsia="Calibri" w:hAnsi="Calibri" w:cs="Calibri"/>
+          <w:i/>
+          <w:iCs/>
+          <w:u w:val="single"/>
+          <w:lang w:val="en-US"/>
+        </w:rPr>
+        <w:t xml:space="preserve"> </w:t>
       </w:r>
     </w:p>
     <w:p>
@@ -2516,96 +3315,6 @@
           <w:i/>
           <w:iCs/>
           <w:u w:val="single"/>
-        </w:rPr>
-      </w:pPr>
-      <w:r>
-        <w:rPr>
-          <w:rFonts w:ascii="Calibri" w:eastAsia="Calibri" w:hAnsi="Calibri" w:cs="Calibri"/>
-        </w:rPr>
-        <w:t>“</w:t>
-      </w:r>
-      <w:r>
-        <w:rPr>
-          <w:rFonts w:ascii="Calibri" w:eastAsia="Calibri" w:hAnsi="Calibri" w:cs="Calibri"/>
-          <w:i/>
-          <w:iCs/>
-          <w:u w:val="single"/>
-        </w:rPr>
-        <w:t>4.4 Other grid regions</w:t>
-      </w:r>
-    </w:p>
-    <w:p>
-      <w:pPr>
-        <w:spacing w:before="240" w:after="240"/>
-        <w:jc w:val="both"/>
-        <w:rPr>
-          <w:rFonts w:ascii="Calibri" w:eastAsia="Calibri" w:hAnsi="Calibri" w:cs="Calibri"/>
-          <w:i/>
-          <w:iCs/>
-          <w:u w:val="single"/>
-          <w:lang w:val="en-US"/>
-        </w:rPr>
-      </w:pPr>
-      <w:r>
-        <w:rPr>
-          <w:rFonts w:ascii="Calibri" w:eastAsia="Calibri" w:hAnsi="Calibri" w:cs="Calibri"/>
-          <w:i/>
-          <w:iCs/>
-          <w:u w:val="single"/>
-          <w:lang w:val="en-US"/>
-        </w:rPr>
-        <w:t xml:space="preserve">Additional results for other grid regions, along with avoided emissions assessed using long-run marginal emissions rates (LRMER), are provided in the supplementary material. Across all 18 grid regions, we observed consistent patterns: annual emission factors systematically oversimplify operational emission intensity. Figure 9 summarizes these by presenting the median fractional error of aggregated net operational emissions and avoided emissions across results from all regions. For the current and near-future conditions (2025), annual, seasonal, and time-of-day emission factors yield median errors of approximately 5%, which may be considered acceptable given their simplicity and limited sensitivity to grid development scenarios. However, these factors become unreliable </w:t>
-      </w:r>
-      <w:r>
-        <w:rPr>
-          <w:rFonts w:ascii="Calibri" w:eastAsia="Calibri" w:hAnsi="Calibri" w:cs="Calibri"/>
-          <w:i/>
-          <w:iCs/>
-          <w:u w:val="single"/>
-          <w:lang w:val="en-US"/>
-        </w:rPr>
-        <w:t xml:space="preserve">when onsite solar generation continues to increase and gradually </w:t>
-      </w:r>
-      <w:r>
-        <w:rPr>
-          <w:rFonts w:ascii="Calibri" w:eastAsia="Calibri" w:hAnsi="Calibri" w:cs="Calibri"/>
-          <w:i/>
-          <w:iCs/>
-          <w:u w:val="single"/>
-          <w:lang w:val="en-US"/>
-        </w:rPr>
-        <w:t>offsets the energy usage of the building</w:t>
-      </w:r>
-      <w:r>
-        <w:rPr>
-          <w:rFonts w:ascii="Calibri" w:eastAsia="Calibri" w:hAnsi="Calibri" w:cs="Calibri"/>
-          <w:i/>
-          <w:iCs/>
-          <w:u w:val="single"/>
-          <w:lang w:val="en-US"/>
-        </w:rPr>
-        <w:t>, whereas season-hour and month-hour emission factors consistently maintain median errors below 5%. Notably, the reported median fractional errors reflect deviations attributable solely to temporal resolution simplification, independent of uncertainty in the underlying emission intensity estimates.</w:t>
-      </w:r>
-      <w:r>
-        <w:rPr>
-          <w:rFonts w:ascii="Calibri" w:eastAsia="Calibri" w:hAnsi="Calibri" w:cs="Calibri"/>
-          <w:i/>
-          <w:iCs/>
-          <w:u w:val="single"/>
-          <w:lang w:val="en-US"/>
-        </w:rPr>
-        <w:t xml:space="preserve"> </w:t>
-      </w:r>
-    </w:p>
-    <w:p>
-      <w:pPr>
-        <w:spacing w:before="240" w:after="240"/>
-        <w:jc w:val="both"/>
-        <w:rPr>
-          <w:rFonts w:ascii="Calibri" w:eastAsia="Calibri" w:hAnsi="Calibri" w:cs="Calibri"/>
-          <w:i/>
-          <w:iCs/>
-          <w:u w:val="single"/>
           <w:lang w:val="en-US"/>
         </w:rPr>
       </w:pPr>
@@ -2619,10 +3328,9 @@
           <w:lang w:val="en-US"/>
           <w14:ligatures w14:val="standardContextual"/>
         </w:rPr>
-        <w:lastRenderedPageBreak/>
         <w:drawing>
-          <wp:inline distT="0" distB="0" distL="0" distR="0" wp14:anchorId="59640199" wp14:editId="7D6A4278">
-            <wp:extent cx="5943600" cy="5200650"/>
+          <wp:inline distT="0" distB="0" distL="0" distR="0" wp14:anchorId="1FF02827" wp14:editId="1F89D12B">
+            <wp:extent cx="5029200" cy="4400550"/>
             <wp:effectExtent l="0" t="0" r="0" b="6350"/>
             <wp:docPr id="354905300" name="Picture 1" descr="A graph of the number of carbon emissions&#10;&#10;AI-generated content may be incorrect."/>
             <wp:cNvGraphicFramePr>
@@ -2650,7 +3358,7 @@
                   <pic:spPr>
                     <a:xfrm>
                       <a:off x="0" y="0"/>
-                      <a:ext cx="5943600" cy="5200650"/>
+                      <a:ext cx="5029200" cy="4400550"/>
                     </a:xfrm>
                     <a:prstGeom prst="rect">
                       <a:avLst/>
@@ -2706,6 +3414,7 @@
           <w:u w:val="single"/>
           <w:lang w:val="en-US"/>
         </w:rPr>
+        <w:lastRenderedPageBreak/>
         <w:t>Figure 10 presents the aggregated median fractional error associated with quantifying avoided emissions from excess onsite solar generation exported to the grid. The results show that avoided emissions are substantially more difficult to assess, particularly under future grid projections. When static emission factors are used, absolute deviations can exceed 100%. If adopting a 10% error threshold as an acceptable trade-off for simplification (indicated by the red dashed line), only season-hour and month-hour emission factors mostly meet this criterion. The figure also shows substantially higher fractional errors at lower capacities of onsite generation (e.g., 25% PV offset). As observed in the CAISO results, when grid export opportunities are limited to only a few hours per year, simplifying temporal resolution can produce exceptionally large deviations in avoided emissions estimates.</w:t>
       </w:r>
     </w:p>
@@ -2721,29 +3430,7 @@
           <w:lang w:val="en-US"/>
         </w:rPr>
       </w:pPr>
-      <w:r>
-        <w:rPr>
-          <w:rFonts w:ascii="Calibri" w:eastAsia="Calibri" w:hAnsi="Calibri" w:cs="Calibri"/>
-          <w:i/>
-          <w:iCs/>
-          <w:u w:val="single"/>
-          <w:lang w:val="en-US"/>
-        </w:rPr>
-        <w:t>.</w:t>
-      </w:r>
-    </w:p>
-    <w:p>
-      <w:pPr>
-        <w:spacing w:before="240" w:after="240"/>
-        <w:jc w:val="both"/>
-        <w:rPr>
-          <w:rFonts w:ascii="Calibri" w:eastAsia="Calibri" w:hAnsi="Calibri" w:cs="Calibri"/>
-          <w:i/>
-          <w:iCs/>
-          <w:u w:val="single"/>
-          <w:lang w:val="en-US"/>
-        </w:rPr>
-      </w:pPr>
+      <w:commentRangeStart w:id="12"/>
       <w:r>
         <w:rPr>
           <w:rFonts w:ascii="Calibri" w:eastAsia="Calibri" w:hAnsi="Calibri" w:cs="Calibri"/>
@@ -2754,10 +3441,9 @@
           <w:lang w:val="en-US"/>
           <w14:ligatures w14:val="standardContextual"/>
         </w:rPr>
-        <w:lastRenderedPageBreak/>
         <w:drawing>
-          <wp:inline distT="0" distB="0" distL="0" distR="0" wp14:anchorId="697FAC46" wp14:editId="4E6514B2">
-            <wp:extent cx="5943600" cy="5943600"/>
+          <wp:inline distT="0" distB="0" distL="0" distR="0" wp14:anchorId="6AB27194" wp14:editId="2F2E5544">
+            <wp:extent cx="5029200" cy="5029200"/>
             <wp:effectExtent l="0" t="0" r="0" b="0"/>
             <wp:docPr id="82902227" name="Picture 4" descr="A graph of different types of carbon emissions&#10;&#10;AI-generated content may be incorrect."/>
             <wp:cNvGraphicFramePr>
@@ -2785,7 +3471,7 @@
                   <pic:spPr>
                     <a:xfrm>
                       <a:off x="0" y="0"/>
-                      <a:ext cx="5943600" cy="5943600"/>
+                      <a:ext cx="5029200" cy="5029200"/>
                     </a:xfrm>
                     <a:prstGeom prst="rect">
                       <a:avLst/>
@@ -2797,6 +3483,20 @@
           </wp:inline>
         </w:drawing>
       </w:r>
+      <w:commentRangeEnd w:id="12"/>
+      <w:r>
+        <w:rPr>
+          <w:rStyle w:val="CommentReference"/>
+          <w:rFonts w:ascii="Calibri" w:eastAsia="Calibri" w:hAnsi="Calibri" w:cs="Calibri"/>
+          <w:i/>
+          <w:iCs/>
+          <w:sz w:val="22"/>
+          <w:szCs w:val="22"/>
+          <w:u w:val="single"/>
+          <w:lang w:val="en-US"/>
+        </w:rPr>
+        <w:commentReference w:id="12"/>
+      </w:r>
     </w:p>
     <w:p>
       <w:pPr>
@@ -2815,18 +3515,7 @@
           <w:u w:val="single"/>
           <w:lang w:val="en-US"/>
         </w:rPr>
-        <w:t xml:space="preserve">Figure 10. Median fractional errors of avoided emissions by onsite renewable generation export calculated when aggregating all 18 grid </w:t>
-      </w:r>
-      <w:proofErr w:type="gramStart"/>
-      <w:r>
-        <w:rPr>
-          <w:rFonts w:ascii="Calibri" w:eastAsia="Calibri" w:hAnsi="Calibri" w:cs="Calibri"/>
-          <w:i/>
-          <w:iCs/>
-          <w:u w:val="single"/>
-          <w:lang w:val="en-US"/>
-        </w:rPr>
-        <w:t xml:space="preserve">regions </w:t>
+        <w:t xml:space="preserve">Figure 10. Median fractional errors of avoided emissions by onsite renewable generation export calculated when aggregating all 18 grid regions </w:t>
       </w:r>
       <w:r>
         <w:rPr>
@@ -2838,7 +3527,6 @@
         </w:rPr>
         <w:t>.</w:t>
       </w:r>
-      <w:proofErr w:type="gramEnd"/>
       <w:r>
         <w:rPr>
           <w:rFonts w:ascii="Calibri" w:eastAsia="Calibri" w:hAnsi="Calibri" w:cs="Calibri"/>
@@ -2870,7 +3558,17 @@
           <w:bCs/>
           <w:color w:val="4C94D8" w:themeColor="text2" w:themeTint="80"/>
         </w:rPr>
-        <w:t>The CAISO-focused results in section 4.1. "CAISO" are detailed; however, it is not always clear whether the observed trends are region-specific or expected to hold across other grid regions. Therefore, the authors should clarify which findings are general and which are context dependent.</w:t>
+        <w:t xml:space="preserve">In section 5.2. "Grid generation mix impact," the discussion of grid generation mix is informative but highly region-specific, particularly for CAISO and ERCOT. Therefore, the </w:t>
+      </w:r>
+      <w:r>
+        <w:rPr>
+          <w:rFonts w:ascii="Calibri" w:eastAsia="Calibri" w:hAnsi="Calibri" w:cs="Calibri"/>
+          <w:b/>
+          <w:bCs/>
+          <w:color w:val="4C94D8" w:themeColor="text2" w:themeTint="80"/>
+        </w:rPr>
+        <w:lastRenderedPageBreak/>
+        <w:t>authors are recommended to more clearly distinguish general insights from region-dependent observations.</w:t>
       </w:r>
     </w:p>
     <w:p>
@@ -2879,8 +3577,6 @@
         <w:jc w:val="both"/>
         <w:rPr>
           <w:rFonts w:ascii="Calibri" w:eastAsia="Calibri" w:hAnsi="Calibri" w:cs="Calibri"/>
-          <w:b/>
-          <w:bCs/>
         </w:rPr>
       </w:pPr>
       <w:r>
@@ -2895,26 +3591,54 @@
         <w:rPr>
           <w:rFonts w:ascii="Calibri" w:eastAsia="Calibri" w:hAnsi="Calibri" w:cs="Calibri"/>
         </w:rPr>
-        <w:t>Thank</w:t>
-      </w:r>
-      <w:r>
-        <w:rPr>
-          <w:rFonts w:ascii="Calibri" w:eastAsia="Calibri" w:hAnsi="Calibri" w:cs="Calibri"/>
-        </w:rPr>
-        <w:t xml:space="preserve">s so much for the comment, as responded to the previous comments, we added a new section 4.4 “Other grid regions” in the results analysis to show the overall median fractional errors over </w:t>
-      </w:r>
-      <w:r>
-        <w:rPr>
-          <w:rFonts w:ascii="Calibri" w:eastAsia="Calibri" w:hAnsi="Calibri" w:cs="Calibri"/>
-        </w:rPr>
-        <w:lastRenderedPageBreak/>
-        <w:t xml:space="preserve">all 18 grid regions. </w:t>
-      </w:r>
-      <w:r>
-        <w:rPr>
-          <w:rFonts w:ascii="Calibri" w:eastAsia="Calibri" w:hAnsi="Calibri" w:cs="Calibri"/>
-        </w:rPr>
-        <w:t>The two added figures demonstrate generalizable conclusions of the study and suggest net-zero carbon buildings, especially near net-zero carbon buildings should at least be assessed using season-hour emission factors if considering 5% deviation due to simplification as an acceptable threshold.</w:t>
+        <w:t xml:space="preserve">Thanks for the suggestion and feedback. </w:t>
+      </w:r>
+      <w:r>
+        <w:rPr>
+          <w:rFonts w:ascii="Calibri" w:eastAsia="Calibri" w:hAnsi="Calibri" w:cs="Calibri"/>
+        </w:rPr>
+        <w:t xml:space="preserve">We modified the last paragraph at the end of Section 5.2 “Grid generation mix impact” to </w:t>
+      </w:r>
+      <w:r>
+        <w:rPr>
+          <w:rFonts w:ascii="Calibri" w:eastAsia="Calibri" w:hAnsi="Calibri" w:cs="Calibri"/>
+        </w:rPr>
+        <w:t xml:space="preserve">summarize </w:t>
+      </w:r>
+      <w:r>
+        <w:rPr>
+          <w:rFonts w:ascii="Calibri" w:eastAsia="Calibri" w:hAnsi="Calibri" w:cs="Calibri"/>
+        </w:rPr>
+        <w:t xml:space="preserve">general insight: </w:t>
+      </w:r>
+      <w:r>
+        <w:rPr>
+          <w:rFonts w:ascii="Calibri" w:eastAsia="Calibri" w:hAnsi="Calibri" w:cs="Calibri"/>
+          <w:i/>
+          <w:iCs/>
+          <w:u w:val="single"/>
+        </w:rPr>
+        <w:t>“</w:t>
+      </w:r>
+      <w:r>
+        <w:rPr>
+          <w:rFonts w:ascii="Calibri" w:eastAsia="Calibri" w:hAnsi="Calibri" w:cs="Calibri"/>
+          <w:i/>
+          <w:iCs/>
+          <w:u w:val="single"/>
+          <w:lang w:val="en-US"/>
+        </w:rPr>
+        <w:t>In general, we observed that variability in grid emission rates is more strongly correlated with the share of solar generation than with the total share of renewable energy. Grid regions with higher solar penetration tend to exhibit larger deviations when annual or seasonal average emission factors are applied, reflecting the pronounced diurnal variability of solar output. In contrast, regions with more balanced renewable portfolios, such as higher wind or hydropower contributions, or greater battery storage capacity, exhibit smoother emission profiles and lower variability. One notable exception is the NYISO grid region, which assumes a fully decarbonized grid by 2050; under this scenario, emission rates are uniformly zero, resulting in no estimation error, as shown in the supplementary figures.</w:t>
+      </w:r>
+      <w:r>
+        <w:rPr>
+          <w:rFonts w:ascii="Calibri" w:eastAsia="Calibri" w:hAnsi="Calibri" w:cs="Calibri"/>
+          <w:i/>
+          <w:iCs/>
+          <w:u w:val="single"/>
+          <w:lang w:val="en-US"/>
+        </w:rPr>
+        <w:t>”</w:t>
       </w:r>
     </w:p>
     <w:p>
@@ -2941,7 +3665,7 @@
           <w:bCs/>
           <w:color w:val="4C94D8" w:themeColor="text2" w:themeTint="80"/>
         </w:rPr>
-        <w:t>In section 5.2. "Grid generation mix impact," the discussion of grid generation mix is informative but highly region-specific, particularly for CAISO and ERCOT. Therefore, the authors are recommended to more clearly distinguish general insights from region-dependent observations.</w:t>
+        <w:t>Section 6. "Conclusion" clearly summarizes the study findings; however, it largely repeats results rather than synthesizing them into broader insights. Therefore, the authors are encouraged to more explicitly highlight the key takeaways and their significance beyond the specific case studies.</w:t>
       </w:r>
     </w:p>
     <w:p>
@@ -2964,42 +3688,148 @@
         <w:rPr>
           <w:rFonts w:ascii="Calibri" w:eastAsia="Calibri" w:hAnsi="Calibri" w:cs="Calibri"/>
         </w:rPr>
-        <w:t xml:space="preserve">Thanks for the suggestion and feedback. </w:t>
-      </w:r>
-      <w:r>
-        <w:rPr>
-          <w:rFonts w:ascii="Calibri" w:eastAsia="Calibri" w:hAnsi="Calibri" w:cs="Calibri"/>
-        </w:rPr>
-        <w:t xml:space="preserve">We modified the last paragraph at the end of Section 5.2 “Grid generation mix impact” to describe general insight, which follows up with the region-dependent observations described in the content above: </w:t>
-      </w:r>
-      <w:r>
-        <w:rPr>
-          <w:rFonts w:ascii="Calibri" w:eastAsia="Calibri" w:hAnsi="Calibri" w:cs="Calibri"/>
-          <w:i/>
-          <w:iCs/>
-          <w:u w:val="single"/>
+        <w:t xml:space="preserve">Thanks for the comments. We modified </w:t>
+      </w:r>
+      <w:r>
+        <w:rPr>
+          <w:rFonts w:ascii="Calibri" w:eastAsia="Calibri" w:hAnsi="Calibri" w:cs="Calibri"/>
+        </w:rPr>
+        <w:t xml:space="preserve">Section 6. “Conclusion” </w:t>
+      </w:r>
+      <w:r>
+        <w:rPr>
+          <w:rFonts w:ascii="Calibri" w:eastAsia="Calibri" w:hAnsi="Calibri" w:cs="Calibri"/>
+        </w:rPr>
+        <w:t xml:space="preserve">to more concisely </w:t>
+      </w:r>
+      <w:r>
+        <w:rPr>
+          <w:rFonts w:ascii="Calibri" w:eastAsia="Calibri" w:hAnsi="Calibri" w:cs="Calibri"/>
+        </w:rPr>
+        <w:t>summarize</w:t>
+      </w:r>
+      <w:r>
+        <w:rPr>
+          <w:rFonts w:ascii="Calibri" w:eastAsia="Calibri" w:hAnsi="Calibri" w:cs="Calibri"/>
+        </w:rPr>
+        <w:t xml:space="preserve"> the </w:t>
+      </w:r>
+      <w:r>
+        <w:rPr>
+          <w:rFonts w:ascii="Calibri" w:eastAsia="Calibri" w:hAnsi="Calibri" w:cs="Calibri"/>
+        </w:rPr>
+        <w:t xml:space="preserve">study </w:t>
+      </w:r>
+      <w:r>
+        <w:rPr>
+          <w:rFonts w:ascii="Calibri" w:eastAsia="Calibri" w:hAnsi="Calibri" w:cs="Calibri"/>
+        </w:rPr>
+        <w:t>and focus on the implication of the analysis and takeaway messages</w:t>
+      </w:r>
+      <w:r>
+        <w:rPr>
+          <w:rFonts w:ascii="Calibri" w:eastAsia="Calibri" w:hAnsi="Calibri" w:cs="Calibri"/>
+        </w:rPr>
+        <w:t xml:space="preserve">. We also added the future work planned that aims to address the limitations of the study as suggested by the comment below. </w:t>
+      </w:r>
+    </w:p>
+    <w:p>
+      <w:pPr>
+        <w:spacing w:before="240"/>
+        <w:jc w:val="both"/>
+        <w:rPr>
+          <w:rFonts w:ascii="Calibri" w:eastAsia="Calibri" w:hAnsi="Calibri" w:cs="Calibri"/>
+          <w:i/>
+          <w:iCs/>
+          <w:u w:val="single"/>
+          <w:lang w:val="en-US"/>
+        </w:rPr>
+      </w:pPr>
+      <w:r>
+        <w:rPr>
+          <w:rFonts w:ascii="Calibri" w:eastAsia="Calibri" w:hAnsi="Calibri" w:cs="Calibri"/>
+        </w:rPr>
+        <w:t>The highlighted takeaway message from the conclusion is: “</w:t>
+      </w:r>
+      <w:r>
+        <w:rPr>
+          <w:rFonts w:ascii="Calibri" w:eastAsia="Calibri" w:hAnsi="Calibri" w:cs="Calibri"/>
+          <w:i/>
+          <w:iCs/>
+          <w:u w:val="single"/>
+          <w:lang w:val="en-US"/>
+        </w:rPr>
+        <w:t xml:space="preserve">A profound implication of these findings is that with a growing trend of increasing onsite renewable generation in buildings as a retrofit measure, our study results highlight a critical discrepancy that net-zero energy buildings do not necessarily guarantee a building is net-zero carbon in operation. Especially in solar-dominant regions where grid emission rates vary significantly in time. The problem is especially pronounced when evaluating avoided emissions for grid exports, which needs to be assessed separately from operational impact. Due to the intermittency of the utility export, the use of temporally coarse emission factors introduces substantial uncertainty and can misrepresent environmental benefits. The same implication also applies when quantifying avoided emissions for efficiency retrofit and load shift retrofit measures where the intervention effect also varies in time. </w:t>
+      </w:r>
+      <w:r>
+        <w:rPr>
+          <w:rFonts w:ascii="Calibri" w:eastAsia="Calibri" w:hAnsi="Calibri" w:cs="Calibri"/>
+          <w:i/>
+          <w:iCs/>
+          <w:u w:val="single"/>
+          <w:lang w:val="en-US"/>
         </w:rPr>
         <w:t>“</w:t>
       </w:r>
-      <w:r>
-        <w:rPr>
-          <w:rFonts w:ascii="Calibri" w:eastAsia="Calibri" w:hAnsi="Calibri" w:cs="Calibri"/>
-          <w:i/>
-          <w:iCs/>
-          <w:u w:val="single"/>
-          <w:lang w:val="en-US"/>
-        </w:rPr>
-        <w:t>In general, we observed that variability in grid emission rates is more strongly correlated with the share of solar generation than with the total share of renewable energy. Grid regions with higher solar penetration tend to exhibit larger deviations when annual or seasonal average emission factors are applied, reflecting the pronounced diurnal variability of solar output. In contrast, regions with more balanced renewable portfolios, such as higher wind or hydropower contributions, or greater battery storage capacity, exhibit smoother emission profiles and lower variability. One notable exception is the NYISO grid region, which assumes a fully decarbonized grid by 2050; under this scenario, emission rates are uniformly zero, resulting in no estimation error, as shown in the supplementary figures.</w:t>
-      </w:r>
-      <w:r>
-        <w:rPr>
-          <w:rFonts w:ascii="Calibri" w:eastAsia="Calibri" w:hAnsi="Calibri" w:cs="Calibri"/>
-          <w:i/>
-          <w:iCs/>
-          <w:u w:val="single"/>
-          <w:lang w:val="en-US"/>
+    </w:p>
+    <w:p>
+      <w:pPr>
+        <w:spacing w:before="240" w:after="240"/>
+        <w:jc w:val="both"/>
+        <w:rPr>
+          <w:rFonts w:ascii="Calibri" w:eastAsia="Calibri" w:hAnsi="Calibri" w:cs="Calibri"/>
+          <w:lang w:val="en-US"/>
+        </w:rPr>
+      </w:pPr>
+      <w:r>
+        <w:rPr>
+          <w:rFonts w:ascii="Calibri" w:eastAsia="Calibri" w:hAnsi="Calibri" w:cs="Calibri"/>
+        </w:rPr>
+        <w:t xml:space="preserve">The </w:t>
+      </w:r>
+      <w:r>
+        <w:rPr>
+          <w:rFonts w:ascii="Calibri" w:eastAsia="Calibri" w:hAnsi="Calibri" w:cs="Calibri"/>
+        </w:rPr>
+        <w:t>added future work to the conclusion</w:t>
+      </w:r>
+      <w:r>
+        <w:rPr>
+          <w:rFonts w:ascii="Calibri" w:eastAsia="Calibri" w:hAnsi="Calibri" w:cs="Calibri"/>
+        </w:rPr>
+        <w:t xml:space="preserve"> is shown below: “</w:t>
+      </w:r>
+      <w:r>
+        <w:rPr>
+          <w:rFonts w:ascii="Calibri" w:eastAsia="Calibri" w:hAnsi="Calibri" w:cs="Calibri"/>
+          <w:i/>
+          <w:iCs/>
+          <w:u w:val="single"/>
+          <w:lang w:val="en-US"/>
+        </w:rPr>
+        <w:t>Future work should incorporate dynamic building energy-use projections that account for climate change, evolving occupancy patterns, behavioral shifts, and the use of battery energy storage system for load shift application</w:t>
+      </w:r>
+      <w:r>
+        <w:rPr>
+          <w:rFonts w:ascii="Calibri" w:eastAsia="Calibri" w:hAnsi="Calibri" w:cs="Calibri"/>
+          <w:i/>
+          <w:iCs/>
+          <w:u w:val="single"/>
+          <w:lang w:val="en-US"/>
+        </w:rPr>
+        <w:t>. In addition, this study applied the open-source dataset of measured building electricity as an aggregated group across all grid regions, potentially underrepresenting climate-specific construction and operational characteristics. Future analyses should therefore integrate regionally calibrated models to more accurately capture geographic variability in building performance and grid interactions.</w:t>
+      </w:r>
+      <w:r>
+        <w:rPr>
+          <w:rFonts w:ascii="Calibri" w:eastAsia="Calibri" w:hAnsi="Calibri" w:cs="Calibri"/>
         </w:rPr>
         <w:t>”</w:t>
+      </w:r>
+      <w:r>
+        <w:rPr>
+          <w:rFonts w:ascii="Calibri" w:eastAsia="Calibri" w:hAnsi="Calibri" w:cs="Calibri"/>
+        </w:rPr>
+        <w:t xml:space="preserve"> </w:t>
       </w:r>
     </w:p>
     <w:p>
@@ -3026,7 +3856,8 @@
           <w:bCs/>
           <w:color w:val="4C94D8" w:themeColor="text2" w:themeTint="80"/>
         </w:rPr>
-        <w:t>Section 6. "Conclusion" clearly summarizes the study findings; however, it largely repeats results rather than synthesizing them into broader insights. Therefore, the authors are encouraged to more explicitly highlight the key takeaways and their significance beyond the specific case studies.</w:t>
+        <w:lastRenderedPageBreak/>
+        <w:t>Although the authors have highlighted main limitations of their work in section 5.4. "Limitations of this Study," but they are recommended to briefly identify key avenues for future work in section 6. "Conclusion".</w:t>
       </w:r>
     </w:p>
     <w:p>
@@ -3035,6 +3866,8 @@
         <w:jc w:val="both"/>
         <w:rPr>
           <w:rFonts w:ascii="Calibri" w:eastAsia="Calibri" w:hAnsi="Calibri" w:cs="Calibri"/>
+          <w:b/>
+          <w:bCs/>
         </w:rPr>
       </w:pPr>
       <w:r>
@@ -3049,166 +3882,6 @@
         <w:rPr>
           <w:rFonts w:ascii="Calibri" w:eastAsia="Calibri" w:hAnsi="Calibri" w:cs="Calibri"/>
         </w:rPr>
-        <w:t xml:space="preserve">Thanks for the comments. We modified </w:t>
-      </w:r>
-      <w:r>
-        <w:rPr>
-          <w:rFonts w:ascii="Calibri" w:eastAsia="Calibri" w:hAnsi="Calibri" w:cs="Calibri"/>
-        </w:rPr>
-        <w:t xml:space="preserve">Section 6. “Conclusion” </w:t>
-      </w:r>
-      <w:r>
-        <w:rPr>
-          <w:rFonts w:ascii="Calibri" w:eastAsia="Calibri" w:hAnsi="Calibri" w:cs="Calibri"/>
-        </w:rPr>
-        <w:t>to more concisely synthesize the study summary and focus on the implication of the analysis and takeaway messages</w:t>
-      </w:r>
-      <w:r>
-        <w:rPr>
-          <w:rFonts w:ascii="Calibri" w:eastAsia="Calibri" w:hAnsi="Calibri" w:cs="Calibri"/>
-        </w:rPr>
-        <w:t xml:space="preserve">. We also added the future work planned that aims to address the limitations of the study as suggested by the comment below. </w:t>
-      </w:r>
-    </w:p>
-    <w:p>
-      <w:pPr>
-        <w:spacing w:before="240"/>
-        <w:jc w:val="both"/>
-        <w:rPr>
-          <w:rFonts w:ascii="Calibri" w:eastAsia="Calibri" w:hAnsi="Calibri" w:cs="Calibri"/>
-          <w:i/>
-          <w:iCs/>
-          <w:u w:val="single"/>
-          <w:lang w:val="en-US"/>
-        </w:rPr>
-      </w:pPr>
-      <w:r>
-        <w:rPr>
-          <w:rFonts w:ascii="Calibri" w:eastAsia="Calibri" w:hAnsi="Calibri" w:cs="Calibri"/>
-        </w:rPr>
-        <w:t>The highlighted takeaway message from the conclusion is: “</w:t>
-      </w:r>
-      <w:r>
-        <w:rPr>
-          <w:rFonts w:ascii="Calibri" w:eastAsia="Calibri" w:hAnsi="Calibri" w:cs="Calibri"/>
-          <w:i/>
-          <w:iCs/>
-          <w:u w:val="single"/>
-          <w:lang w:val="en-US"/>
-        </w:rPr>
-        <w:t xml:space="preserve">A profound implication of these findings is that with a growing trend of increasing onsite renewable generation in buildings as a retrofit measure, our study results highlight a critical discrepancy that net-zero energy buildings do not necessarily guarantee a building is net-zero carbon in operation. Especially in solar-dominant regions where grid emission rates vary significantly in time. The problem is especially pronounced when evaluating avoided emissions for grid exports, which needs to be assessed separately from operational impact. Due to the intermittency of the utility export, the use of temporally coarse emission factors introduces substantial uncertainty and can misrepresent environmental benefits. The same implication also applies when quantifying avoided emissions for efficiency retrofit and load shift retrofit measures where the intervention effect also varies in time. </w:t>
-      </w:r>
-      <w:r>
-        <w:rPr>
-          <w:rFonts w:ascii="Calibri" w:eastAsia="Calibri" w:hAnsi="Calibri" w:cs="Calibri"/>
-          <w:i/>
-          <w:iCs/>
-          <w:u w:val="single"/>
-          <w:lang w:val="en-US"/>
-        </w:rPr>
-        <w:t>“</w:t>
-      </w:r>
-    </w:p>
-    <w:p>
-      <w:pPr>
-        <w:spacing w:before="240" w:after="240"/>
-        <w:jc w:val="both"/>
-        <w:rPr>
-          <w:rFonts w:ascii="Calibri" w:eastAsia="Calibri" w:hAnsi="Calibri" w:cs="Calibri"/>
-          <w:lang w:val="en-US"/>
-        </w:rPr>
-      </w:pPr>
-      <w:r>
-        <w:rPr>
-          <w:rFonts w:ascii="Calibri" w:eastAsia="Calibri" w:hAnsi="Calibri" w:cs="Calibri"/>
-        </w:rPr>
-        <w:lastRenderedPageBreak/>
-        <w:t xml:space="preserve">The </w:t>
-      </w:r>
-      <w:r>
-        <w:rPr>
-          <w:rFonts w:ascii="Calibri" w:eastAsia="Calibri" w:hAnsi="Calibri" w:cs="Calibri"/>
-        </w:rPr>
-        <w:t>added future work to the conclusion</w:t>
-      </w:r>
-      <w:r>
-        <w:rPr>
-          <w:rFonts w:ascii="Calibri" w:eastAsia="Calibri" w:hAnsi="Calibri" w:cs="Calibri"/>
-        </w:rPr>
-        <w:t xml:space="preserve"> is shown below: “</w:t>
-      </w:r>
-      <w:r>
-        <w:rPr>
-          <w:rFonts w:ascii="Calibri" w:eastAsia="Calibri" w:hAnsi="Calibri" w:cs="Calibri"/>
-          <w:i/>
-          <w:iCs/>
-          <w:u w:val="single"/>
-          <w:lang w:val="en-US"/>
-        </w:rPr>
-        <w:t>Future work should incorporate dynamic building energy-use projections that account for climate change, evolving occupancy patterns, and behavioral shifts, which were treated as static in this analysis. In addition, this study applied the open-source dataset of measured building electricity as an aggregated group across all grid regions, potentially underrepresenting climate-specific construction and operational characteristics. Future analyses should therefore integrate regionally calibrated models to more accurately capture geographic variability in building performance and grid interactions.</w:t>
-      </w:r>
-      <w:r>
-        <w:rPr>
-          <w:rFonts w:ascii="Calibri" w:eastAsia="Calibri" w:hAnsi="Calibri" w:cs="Calibri"/>
-        </w:rPr>
-        <w:t>”</w:t>
-      </w:r>
-      <w:r>
-        <w:rPr>
-          <w:rFonts w:ascii="Calibri" w:eastAsia="Calibri" w:hAnsi="Calibri" w:cs="Calibri"/>
-        </w:rPr>
-        <w:t xml:space="preserve"> </w:t>
-      </w:r>
-    </w:p>
-    <w:p>
-      <w:pPr>
-        <w:pStyle w:val="ListParagraph"/>
-        <w:numPr>
-          <w:ilvl w:val="0"/>
-          <w:numId w:val="1"/>
-        </w:numPr>
-        <w:spacing w:before="240" w:after="240"/>
-        <w:ind w:left="360"/>
-        <w:jc w:val="both"/>
-        <w:rPr>
-          <w:rFonts w:ascii="Calibri" w:eastAsia="Calibri" w:hAnsi="Calibri" w:cs="Calibri"/>
-          <w:b/>
-          <w:bCs/>
-          <w:color w:val="4C94D8" w:themeColor="text2" w:themeTint="80"/>
-        </w:rPr>
-      </w:pPr>
-      <w:r>
-        <w:rPr>
-          <w:rFonts w:ascii="Calibri" w:eastAsia="Calibri" w:hAnsi="Calibri" w:cs="Calibri"/>
-          <w:b/>
-          <w:bCs/>
-          <w:color w:val="4C94D8" w:themeColor="text2" w:themeTint="80"/>
-        </w:rPr>
-        <w:t>Although the authors have highlighted main limitations of their work in section 5.4. "Limitations of this Study," but they are recommended to briefly identify key avenues for future work in section 6. "Conclusion".</w:t>
-      </w:r>
-    </w:p>
-    <w:p>
-      <w:pPr>
-        <w:spacing w:before="240" w:after="240"/>
-        <w:jc w:val="both"/>
-        <w:rPr>
-          <w:rFonts w:ascii="Calibri" w:eastAsia="Calibri" w:hAnsi="Calibri" w:cs="Calibri"/>
-          <w:b/>
-          <w:bCs/>
-        </w:rPr>
-      </w:pPr>
-      <w:r>
-        <w:rPr>
-          <w:rFonts w:ascii="Calibri" w:eastAsia="Calibri" w:hAnsi="Calibri" w:cs="Calibri"/>
-          <w:b/>
-          <w:bCs/>
-        </w:rPr>
-        <w:t xml:space="preserve">Response: </w:t>
-      </w:r>
-      <w:r>
-        <w:rPr>
-          <w:rFonts w:ascii="Calibri" w:eastAsia="Calibri" w:hAnsi="Calibri" w:cs="Calibri"/>
-        </w:rPr>
         <w:t xml:space="preserve">Thanks </w:t>
       </w:r>
       <w:r>
@@ -3221,13 +3894,19 @@
         <w:rPr>
           <w:rFonts w:ascii="Calibri" w:eastAsia="Calibri" w:hAnsi="Calibri" w:cs="Calibri"/>
         </w:rPr>
-        <w:t>comments together with the previous comments regarding the Section 6. “Conclusion”. As responded above, we have edited the original section and added potential future work</w:t>
-      </w:r>
-      <w:r>
-        <w:rPr>
-          <w:rFonts w:ascii="Calibri" w:eastAsia="Calibri" w:hAnsi="Calibri" w:cs="Calibri"/>
-        </w:rPr>
-        <w:t>.</w:t>
+        <w:t xml:space="preserve">comments together with the previous comments regarding </w:t>
+      </w:r>
+      <w:r>
+        <w:rPr>
+          <w:rFonts w:ascii="Calibri" w:eastAsia="Calibri" w:hAnsi="Calibri" w:cs="Calibri"/>
+        </w:rPr>
+        <w:t>the improvement of</w:t>
+      </w:r>
+      <w:r>
+        <w:rPr>
+          <w:rFonts w:ascii="Calibri" w:eastAsia="Calibri" w:hAnsi="Calibri" w:cs="Calibri"/>
+        </w:rPr>
+        <w:t xml:space="preserve"> Section 6. “Conclusion”. </w:t>
       </w:r>
     </w:p>
     <w:p>
@@ -3296,23 +3975,7 @@
           <w:rFonts w:ascii="Calibri" w:eastAsia="Calibri" w:hAnsi="Calibri" w:cs="Calibri"/>
           <w:lang w:val="en-US"/>
         </w:rPr>
-        <w:t xml:space="preserve">revised the highlights based on the suggestion to align with the results provided in the abstract </w:t>
-      </w:r>
-      <w:proofErr w:type="gramStart"/>
-      <w:r>
-        <w:rPr>
-          <w:rFonts w:ascii="Calibri" w:eastAsia="Calibri" w:hAnsi="Calibri" w:cs="Calibri"/>
-          <w:lang w:val="en-US"/>
-        </w:rPr>
-        <w:t>and also</w:t>
-      </w:r>
-      <w:proofErr w:type="gramEnd"/>
-      <w:r>
-        <w:rPr>
-          <w:rFonts w:ascii="Calibri" w:eastAsia="Calibri" w:hAnsi="Calibri" w:cs="Calibri"/>
-          <w:lang w:val="en-US"/>
-        </w:rPr>
-        <w:t xml:space="preserve"> the results section of the paper. </w:t>
+        <w:t xml:space="preserve">revised the highlights based on the suggestion to align with the results provided in the abstract and also the results section of the paper. </w:t>
       </w:r>
     </w:p>
     <w:p>
@@ -3373,7 +4036,31 @@
         <w:rPr>
           <w:rFonts w:ascii="Calibri" w:eastAsia="Calibri" w:hAnsi="Calibri" w:cs="Calibri"/>
         </w:rPr>
-        <w:t>separated the original Section 1.1 “Decarbonization pathway” and merged contents describing general decarbonization goals and pathways to the previous section 1. “Introduction” for more general background, and merged contents describing retrofit assessments and potential intermittency to the following section (originally named as Section 1.2 “Temporal accuracy”), which is now renamed as Section 1.1 “Temporal sensitivity impact on decarbonization pathway”.</w:t>
+        <w:t xml:space="preserve">separated the original Section 1.1 “Decarbonization pathway” and merged contents describing decarbonization goals and pathways to </w:t>
+      </w:r>
+      <w:r>
+        <w:rPr>
+          <w:rFonts w:ascii="Calibri" w:eastAsia="Calibri" w:hAnsi="Calibri" w:cs="Calibri"/>
+        </w:rPr>
+        <w:t>the more general background introduction</w:t>
+      </w:r>
+      <w:r>
+        <w:rPr>
+          <w:rFonts w:ascii="Calibri" w:eastAsia="Calibri" w:hAnsi="Calibri" w:cs="Calibri"/>
+        </w:rPr>
+        <w:t xml:space="preserve">, and merged contents describing retrofit assessments and </w:t>
+      </w:r>
+      <w:r>
+        <w:rPr>
+          <w:rFonts w:ascii="Calibri" w:eastAsia="Calibri" w:hAnsi="Calibri" w:cs="Calibri"/>
+        </w:rPr>
+        <w:t xml:space="preserve">time-sensitivity concern </w:t>
+      </w:r>
+      <w:r>
+        <w:rPr>
+          <w:rFonts w:ascii="Calibri" w:eastAsia="Calibri" w:hAnsi="Calibri" w:cs="Calibri"/>
+        </w:rPr>
+        <w:t>to the following section (originally named as Section 1.2 “Temporal accuracy”), which is now renamed as Section 1.1 “Temporal sensitivity impact on decarbonization pathway”.</w:t>
       </w:r>
       <w:r>
         <w:rPr>
@@ -3406,36 +4093,66 @@
           <w:bCs/>
           <w:color w:val="4C94D8" w:themeColor="text2" w:themeTint="80"/>
         </w:rPr>
+        <w:t>The rationale for exclusively using Long-Run Marginal Emission Rates (LRMER) and excluding Short-Run Marginal Emission Rates (SRMER) is inadequately justified. The argument that SRMER may "over-predict" emissions for future profiles is insufficient. Provide a more robust justification with citations, or alternatively, include a sensitivity analysis in the supplementary material showing why LRMER was chosen for this accounting-focused study, contrasting it with potential results using SRMER.</w:t>
+      </w:r>
+    </w:p>
+    <w:p>
+      <w:pPr>
+        <w:jc w:val="both"/>
+        <w:rPr>
+          <w:rFonts w:ascii="Calibri" w:eastAsia="Calibri" w:hAnsi="Calibri" w:cs="Calibri"/>
+        </w:rPr>
+      </w:pPr>
+      <w:r>
+        <w:rPr>
+          <w:rFonts w:ascii="Calibri" w:eastAsia="Calibri" w:hAnsi="Calibri" w:cs="Calibri"/>
+          <w:b/>
+          <w:bCs/>
+        </w:rPr>
+        <w:t xml:space="preserve">Response: </w:t>
+      </w:r>
+      <w:r>
+        <w:rPr>
+          <w:rFonts w:ascii="Calibri" w:eastAsia="Calibri" w:hAnsi="Calibri" w:cs="Calibri"/>
+        </w:rPr>
+        <w:t xml:space="preserve">Thanks for the comments. </w:t>
+      </w:r>
+      <w:r>
+        <w:rPr>
+          <w:rFonts w:ascii="Calibri" w:eastAsia="Calibri" w:hAnsi="Calibri" w:cs="Calibri"/>
+        </w:rPr>
+        <w:t xml:space="preserve">We agreed that it is a limitation to our study methodology and we haven’t addressed the assumptions sufficiently in the original version of the paper. </w:t>
+      </w:r>
+      <w:r>
+        <w:rPr>
+          <w:rFonts w:ascii="Calibri" w:eastAsia="Calibri" w:hAnsi="Calibri" w:cs="Calibri"/>
+        </w:rPr>
+        <w:t xml:space="preserve">To improve the </w:t>
+      </w:r>
+      <w:r>
+        <w:rPr>
+          <w:rFonts w:ascii="Calibri" w:eastAsia="Calibri" w:hAnsi="Calibri" w:cs="Calibri"/>
+        </w:rPr>
         <w:lastRenderedPageBreak/>
-        <w:t>The rationale for exclusively using Long-Run Marginal Emission Rates (LRMER) and excluding Short-Run Marginal Emission Rates (SRMER) is inadequately justified. The argument that SRMER may "over-predict" emissions for future profiles is insufficient. Provide a more robust justification with citations, or alternatively, include a sensitivity analysis in the supplementary material showing why LRMER was chosen for this accounting-focused study, contrasting it with potential results using SRMER.</w:t>
-      </w:r>
-    </w:p>
-    <w:p>
-      <w:pPr>
-        <w:jc w:val="both"/>
-        <w:rPr>
-          <w:rFonts w:ascii="Calibri" w:eastAsia="Calibri" w:hAnsi="Calibri" w:cs="Calibri"/>
-        </w:rPr>
-      </w:pPr>
-      <w:r>
-        <w:rPr>
-          <w:rFonts w:ascii="Calibri" w:eastAsia="Calibri" w:hAnsi="Calibri" w:cs="Calibri"/>
-          <w:b/>
-          <w:bCs/>
-        </w:rPr>
-        <w:t xml:space="preserve">Response: </w:t>
-      </w:r>
-      <w:r>
-        <w:rPr>
-          <w:rFonts w:ascii="Calibri" w:eastAsia="Calibri" w:hAnsi="Calibri" w:cs="Calibri"/>
-        </w:rPr>
-        <w:t xml:space="preserve">Thanks for the comments. </w:t>
-      </w:r>
-      <w:r>
-        <w:rPr>
-          <w:rFonts w:ascii="Calibri" w:eastAsia="Calibri" w:hAnsi="Calibri" w:cs="Calibri"/>
-        </w:rPr>
-        <w:t xml:space="preserve">We agreed that it is a limitation to our study methodology and we haven’t addressed the assumptions sufficiently in the original version of the paper. Based on the suggestion, we believe adding additional literature review on the comparison between SRMER and LRMER on Section 1.2 “Average and marginal carbon emission rates”. </w:t>
+        <w:t>manuscript b</w:t>
+      </w:r>
+      <w:r>
+        <w:rPr>
+          <w:rFonts w:ascii="Calibri" w:eastAsia="Calibri" w:hAnsi="Calibri" w:cs="Calibri"/>
+        </w:rPr>
+        <w:t xml:space="preserve">ased on the suggestion, we </w:t>
+      </w:r>
+      <w:r>
+        <w:rPr>
+          <w:rFonts w:ascii="Calibri" w:eastAsia="Calibri" w:hAnsi="Calibri" w:cs="Calibri"/>
+        </w:rPr>
+        <w:t xml:space="preserve">added </w:t>
+      </w:r>
+      <w:r>
+        <w:rPr>
+          <w:rFonts w:ascii="Calibri" w:eastAsia="Calibri" w:hAnsi="Calibri" w:cs="Calibri"/>
+        </w:rPr>
+        <w:t xml:space="preserve">additional literature review on the comparison between SRMER and LRMER on Section 1.2 “Average and marginal carbon emission rates”. </w:t>
       </w:r>
     </w:p>
     <w:p>
@@ -3521,7 +4238,7 @@
         </w:rPr>
         <w:t xml:space="preserve">vol. 119, Nov. 28, 2022. doi: </w:t>
       </w:r>
-      <w:hyperlink r:id="rId7" w:history="1">
+      <w:hyperlink r:id="rId11" w:history="1">
         <w:r>
           <w:rPr>
             <w:rStyle w:val="Hyperlink"/>
@@ -3580,7 +4297,7 @@
         </w:rPr>
         <w:t xml:space="preserve"> </w:t>
       </w:r>
-      <w:hyperlink r:id="rId8" w:history="1">
+      <w:hyperlink r:id="rId12" w:history="1">
         <w:r>
           <w:rPr>
             <w:rStyle w:val="Hyperlink"/>
@@ -3622,7 +4339,7 @@
         </w:rPr>
         <w:t xml:space="preserve">Energy, vol. 125, Jul. 15, 2014. doi: </w:t>
       </w:r>
-      <w:hyperlink r:id="rId9" w:history="1">
+      <w:hyperlink r:id="rId13" w:history="1">
         <w:r>
           <w:rPr>
             <w:rStyle w:val="Hyperlink"/>
@@ -3680,13 +4397,34 @@
           <w:bCs/>
         </w:rPr>
       </w:pPr>
-      <w:r>
-        <w:rPr>
-          <w:rFonts w:ascii="Calibri" w:eastAsia="Calibri" w:hAnsi="Calibri" w:cs="Calibri"/>
-          <w:b/>
-          <w:bCs/>
-        </w:rPr>
-        <w:t xml:space="preserve">Response: </w:t>
+      <w:commentRangeStart w:id="13"/>
+      <w:r>
+        <w:rPr>
+          <w:rFonts w:ascii="Calibri" w:eastAsia="Calibri" w:hAnsi="Calibri" w:cs="Calibri"/>
+          <w:b/>
+          <w:bCs/>
+        </w:rPr>
+        <w:t>Response</w:t>
+      </w:r>
+      <w:commentRangeEnd w:id="13"/>
+      <w:r>
+        <w:rPr>
+          <w:rStyle w:val="CommentReference"/>
+          <w:rFonts w:ascii="Calibri" w:eastAsia="Calibri" w:hAnsi="Calibri" w:cs="Calibri"/>
+          <w:b/>
+          <w:bCs/>
+          <w:sz w:val="22"/>
+          <w:szCs w:val="22"/>
+        </w:rPr>
+        <w:commentReference w:id="13"/>
+      </w:r>
+      <w:r>
+        <w:rPr>
+          <w:rFonts w:ascii="Calibri" w:eastAsia="Calibri" w:hAnsi="Calibri" w:cs="Calibri"/>
+          <w:b/>
+          <w:bCs/>
+        </w:rPr>
+        <w:t xml:space="preserve">: </w:t>
       </w:r>
       <w:r>
         <w:rPr>
@@ -3699,6 +4437,12 @@
           <w:rFonts w:ascii="Calibri" w:eastAsia="Calibri" w:hAnsi="Calibri" w:cs="Calibri"/>
         </w:rPr>
         <w:t xml:space="preserve">for the comment. </w:t>
+      </w:r>
+      <w:r>
+        <w:rPr>
+          <w:rFonts w:ascii="Calibri" w:eastAsia="Calibri" w:hAnsi="Calibri" w:cs="Calibri"/>
+        </w:rPr>
+        <w:t xml:space="preserve">We made sure that all figures are contained in the manuscript and correctly referenced throughout the text. </w:t>
       </w:r>
     </w:p>
     <w:p>
@@ -3725,51 +4469,72 @@
           <w:bCs/>
           <w:color w:val="4C94D8" w:themeColor="text2" w:themeTint="80"/>
         </w:rPr>
-        <w:t xml:space="preserve">The description of the "ground truth" is confusing. The manuscript uses hourly emission factors as the reference but then admits these are themselves projections based on historical weather data (Section 5.1). This is a significant limitation that undermines the premise of a "ground truth." You must explicitly reframe this in the methodology. State </w:t>
-      </w:r>
-      <w:r>
-        <w:rPr>
-          <w:rFonts w:ascii="Calibri" w:eastAsia="Calibri" w:hAnsi="Calibri" w:cs="Calibri"/>
-          <w:b/>
-          <w:bCs/>
-          <w:color w:val="4C94D8" w:themeColor="text2" w:themeTint="80"/>
+        <w:t>The description of the "ground truth" is confusing. The manuscript uses hourly emission factors as the reference but then admits these are themselves projections based on historical weather data (Section 5.1). This is a significant limitation that undermines the premise of a "ground truth." You must explicitly reframe this in the methodology. State clearly that the hourly projection is used as a *high-resolution reference benchmark* for comparing lower-resolution averages, while openly discussing its limitations regarding weather synchronicity in Section 5.1.</w:t>
+      </w:r>
+    </w:p>
+    <w:p>
+      <w:pPr>
+        <w:jc w:val="both"/>
+        <w:rPr>
+          <w:rFonts w:ascii="Calibri" w:eastAsia="Calibri" w:hAnsi="Calibri" w:cs="Calibri"/>
+        </w:rPr>
+      </w:pPr>
+      <w:r>
+        <w:rPr>
+          <w:rFonts w:ascii="Calibri" w:eastAsia="Calibri" w:hAnsi="Calibri" w:cs="Calibri"/>
+          <w:b/>
+          <w:bCs/>
+        </w:rPr>
+        <w:t xml:space="preserve">Response: </w:t>
+      </w:r>
+      <w:r>
+        <w:rPr>
+          <w:rFonts w:ascii="Calibri" w:eastAsia="Calibri" w:hAnsi="Calibri" w:cs="Calibri"/>
+        </w:rPr>
+        <w:t xml:space="preserve">Thanks </w:t>
+      </w:r>
+      <w:r>
+        <w:rPr>
+          <w:rFonts w:ascii="Calibri" w:eastAsia="Calibri" w:hAnsi="Calibri" w:cs="Calibri"/>
+        </w:rPr>
+        <w:t xml:space="preserve">for the suggested edits, we agreed that the use of ‘ground truth’ when referring </w:t>
+      </w:r>
+      <w:r>
+        <w:rPr>
+          <w:rFonts w:ascii="Calibri" w:eastAsia="Calibri" w:hAnsi="Calibri" w:cs="Calibri"/>
+        </w:rPr>
+        <w:t xml:space="preserve">to hourly emission rates can be confusing as they only serve as the most realistic estimation of future grid conditions. Therefore, we </w:t>
+      </w:r>
+      <w:r>
+        <w:rPr>
+          <w:rFonts w:ascii="Calibri" w:eastAsia="Calibri" w:hAnsi="Calibri" w:cs="Calibri"/>
+        </w:rPr>
+        <w:t>modified all references to hourly emission factors as</w:t>
+      </w:r>
+      <w:r>
+        <w:rPr>
+          <w:rFonts w:ascii="Calibri" w:eastAsia="Calibri" w:hAnsi="Calibri" w:cs="Calibri"/>
+        </w:rPr>
+        <w:t xml:space="preserve"> ‘high-resolution reference benchmark’ or ‘reference benchmark’ in the main text and the abstract.</w:t>
+      </w:r>
+      <w:r>
+        <w:rPr>
+          <w:rFonts w:ascii="Calibri" w:eastAsia="Calibri" w:hAnsi="Calibri" w:cs="Calibri"/>
+        </w:rPr>
+        <w:t xml:space="preserve"> Additionally, we moved up the </w:t>
+      </w:r>
+      <w:r>
+        <w:rPr>
+          <w:rFonts w:ascii="Calibri" w:eastAsia="Calibri" w:hAnsi="Calibri" w:cs="Calibri"/>
         </w:rPr>
         <w:lastRenderedPageBreak/>
-        <w:t>clearly that the hourly projection is used as a *high-resolution reference benchmark* for comparing lower-resolution averages, while openly discussing its limitations regarding weather synchronicity in Section 5.1.</w:t>
-      </w:r>
-    </w:p>
-    <w:p>
-      <w:pPr>
-        <w:jc w:val="both"/>
-        <w:rPr>
-          <w:rFonts w:ascii="Calibri" w:eastAsia="Calibri" w:hAnsi="Calibri" w:cs="Calibri"/>
-        </w:rPr>
-      </w:pPr>
-      <w:r>
-        <w:rPr>
-          <w:rFonts w:ascii="Calibri" w:eastAsia="Calibri" w:hAnsi="Calibri" w:cs="Calibri"/>
-          <w:b/>
-          <w:bCs/>
-        </w:rPr>
-        <w:t xml:space="preserve">Response: </w:t>
-      </w:r>
-      <w:r>
-        <w:rPr>
-          <w:rFonts w:ascii="Calibri" w:eastAsia="Calibri" w:hAnsi="Calibri" w:cs="Calibri"/>
-        </w:rPr>
-        <w:t xml:space="preserve">Thanks </w:t>
-      </w:r>
-      <w:r>
-        <w:rPr>
-          <w:rFonts w:ascii="Calibri" w:eastAsia="Calibri" w:hAnsi="Calibri" w:cs="Calibri"/>
-        </w:rPr>
-        <w:t xml:space="preserve">for the suggested edits, we agreed that the use of ‘ground truth’ when referring </w:t>
-      </w:r>
-      <w:r>
-        <w:rPr>
-          <w:rFonts w:ascii="Calibri" w:eastAsia="Calibri" w:hAnsi="Calibri" w:cs="Calibri"/>
-        </w:rPr>
-        <w:t>to hourly emission rates can be confusing as they only serve as the most realistic estimation of future grid conditions. Therefore, we substitute the definition to ‘high-resolution reference benchmark’ or ‘reference benchmark’ in the main text and the abstract.</w:t>
+        <w:t>discussion of weather synchronization from Section 5.1 to Section 3.2 “Cambium 2024 dataset” to more conveniently discuss its associated limitations</w:t>
+      </w:r>
+      <w:r>
+        <w:rPr>
+          <w:rFonts w:ascii="Calibri" w:eastAsia="Calibri" w:hAnsi="Calibri" w:cs="Calibri"/>
+        </w:rPr>
+        <w:t xml:space="preserve">, as the following comment 7 suggested. </w:t>
       </w:r>
     </w:p>
     <w:p>
@@ -3832,42 +4597,97 @@
         <w:rPr>
           <w:rFonts w:ascii="Calibri" w:eastAsia="Calibri" w:hAnsi="Calibri" w:cs="Calibri"/>
         </w:rPr>
-        <w:t xml:space="preserve">We originally attempted to develop a unified figure showing error distributions of selected sites, but the scale difference between CAISO and PJM East makes it challenging to compare results on the same figure. Therefore, we would like to remain the origin format that report findings and results separately for each grid region. </w:t>
-      </w:r>
-    </w:p>
-    <w:p>
-      <w:pPr>
-        <w:spacing w:before="240"/>
-        <w:jc w:val="both"/>
-        <w:rPr>
-          <w:rFonts w:ascii="Calibri" w:eastAsia="Calibri" w:hAnsi="Calibri" w:cs="Calibri"/>
-        </w:rPr>
-      </w:pPr>
-      <w:r>
-        <w:rPr>
-          <w:rFonts w:ascii="Calibri" w:eastAsia="Calibri" w:hAnsi="Calibri" w:cs="Calibri"/>
-        </w:rPr>
-        <w:t xml:space="preserve">However, we also agree with the reviewer that the original formatting of the result section is also repetitive and lengthy, especially </w:t>
-      </w:r>
-      <w:r>
-        <w:rPr>
-          <w:rFonts w:ascii="Calibri" w:eastAsia="Calibri" w:hAnsi="Calibri" w:cs="Calibri"/>
-        </w:rPr>
-        <w:t>with all three grid regions plotting the accounting results of using average emission factors and marginal emission factors. Therefore, in the updated version, we only kept both assessment results for CAISO grid region as an example (Figure 5 and Figure 6</w:t>
-      </w:r>
-      <w:proofErr w:type="gramStart"/>
-      <w:r>
-        <w:rPr>
-          <w:rFonts w:ascii="Calibri" w:eastAsia="Calibri" w:hAnsi="Calibri" w:cs="Calibri"/>
-        </w:rPr>
-        <w:t>), but</w:t>
-      </w:r>
-      <w:proofErr w:type="gramEnd"/>
-      <w:r>
-        <w:rPr>
-          <w:rFonts w:ascii="Calibri" w:eastAsia="Calibri" w:hAnsi="Calibri" w:cs="Calibri"/>
-        </w:rPr>
-        <w:t xml:space="preserve"> removed the marginal emission factors results for the other two grid regions to the supplementary material (Figure 8 and Figure 10). </w:t>
+        <w:t xml:space="preserve">We originally attempted to develop a unified figure showing error distributions of selected sites, but the scale difference between CAISO and PJM East makes it challenging to compare results on the same figure. </w:t>
+      </w:r>
+      <w:r>
+        <w:rPr>
+          <w:rFonts w:ascii="Calibri" w:eastAsia="Calibri" w:hAnsi="Calibri" w:cs="Calibri"/>
+        </w:rPr>
+        <w:t xml:space="preserve">Additionally, we would like to demonstrate how increasing onsite solar generation influences accounting results and so we feel necessary to keep the 0% PV offset for the context. </w:t>
+      </w:r>
+      <w:r>
+        <w:rPr>
+          <w:rFonts w:ascii="Calibri" w:eastAsia="Calibri" w:hAnsi="Calibri" w:cs="Calibri"/>
+        </w:rPr>
+        <w:t>However, we agree with the reviewer that the original formatting of the result section is repetitive and lengthy</w:t>
+      </w:r>
+      <w:r>
+        <w:rPr>
+          <w:rFonts w:ascii="Calibri" w:eastAsia="Calibri" w:hAnsi="Calibri" w:cs="Calibri"/>
+        </w:rPr>
+        <w:t xml:space="preserve">. </w:t>
+      </w:r>
+      <w:r>
+        <w:rPr>
+          <w:rFonts w:ascii="Calibri" w:eastAsia="Calibri" w:hAnsi="Calibri" w:cs="Calibri"/>
+        </w:rPr>
+        <w:t xml:space="preserve">Therefore, in the updated version, we only kept </w:t>
+      </w:r>
+      <w:r>
+        <w:rPr>
+          <w:rFonts w:ascii="Calibri" w:eastAsia="Calibri" w:hAnsi="Calibri" w:cs="Calibri"/>
+        </w:rPr>
+        <w:t>both operational and avoided</w:t>
+      </w:r>
+      <w:r>
+        <w:rPr>
+          <w:rFonts w:ascii="Calibri" w:eastAsia="Calibri" w:hAnsi="Calibri" w:cs="Calibri"/>
+        </w:rPr>
+        <w:t xml:space="preserve"> assessment results for CAISO grid region as an example (Figure 5 and Figure 6</w:t>
+      </w:r>
+      <w:r>
+        <w:rPr>
+          <w:rFonts w:ascii="Calibri" w:eastAsia="Calibri" w:hAnsi="Calibri" w:cs="Calibri"/>
+        </w:rPr>
+        <w:t>) but</w:t>
+      </w:r>
+      <w:r>
+        <w:rPr>
+          <w:rFonts w:ascii="Calibri" w:eastAsia="Calibri" w:hAnsi="Calibri" w:cs="Calibri"/>
+        </w:rPr>
+        <w:t xml:space="preserve"> </w:t>
+      </w:r>
+      <w:r>
+        <w:rPr>
+          <w:rFonts w:ascii="Calibri" w:eastAsia="Calibri" w:hAnsi="Calibri" w:cs="Calibri"/>
+        </w:rPr>
+        <w:t>moved</w:t>
+      </w:r>
+      <w:r>
+        <w:rPr>
+          <w:rFonts w:ascii="Calibri" w:eastAsia="Calibri" w:hAnsi="Calibri" w:cs="Calibri"/>
+        </w:rPr>
+        <w:t xml:space="preserve"> the </w:t>
+      </w:r>
+      <w:r>
+        <w:rPr>
+          <w:rFonts w:ascii="Calibri" w:eastAsia="Calibri" w:hAnsi="Calibri" w:cs="Calibri"/>
+        </w:rPr>
+        <w:t xml:space="preserve">avoided </w:t>
+      </w:r>
+      <w:r>
+        <w:rPr>
+          <w:rFonts w:ascii="Calibri" w:eastAsia="Calibri" w:hAnsi="Calibri" w:cs="Calibri"/>
+        </w:rPr>
+        <w:t xml:space="preserve">emission factors results for the other two grid regions to the supplementary material (Figure 8 and Figure 10). </w:t>
+      </w:r>
+      <w:r>
+        <w:rPr>
+          <w:rFonts w:ascii="Calibri" w:eastAsia="Calibri" w:hAnsi="Calibri" w:cs="Calibri"/>
+          <w:highlight w:val="yellow"/>
+          <w:rPrChange w:id="14" w:author="Aoyu Zou" w:date="2026-01-29T12:35:00Z" w16du:dateUtc="2026-01-29T20:35:00Z">
+            <w:rPr>
+              <w:rFonts w:ascii="Calibri" w:eastAsia="Calibri" w:hAnsi="Calibri" w:cs="Calibri"/>
+            </w:rPr>
+          </w:rPrChange>
+        </w:rPr>
+        <w:t>Also, the original version includes insufficient summary for the other grid regions for generalized results, and thus we added a new section 4.4 “Other grid regions” to show the aggregated median fractional errors for operational and avoided emissions accounting results. The other changes can be found in the track change version of the manuscript revision.</w:t>
+      </w:r>
+      <w:r>
+        <w:rPr>
+          <w:rFonts w:ascii="Calibri" w:eastAsia="Calibri" w:hAnsi="Calibri" w:cs="Calibri"/>
+        </w:rPr>
+        <w:t xml:space="preserve"> </w:t>
       </w:r>
     </w:p>
     <w:p>
@@ -3894,27 +4714,7 @@
           <w:bCs/>
           <w:color w:val="4C94D8" w:themeColor="text2" w:themeTint="80"/>
         </w:rPr>
-        <w:t xml:space="preserve">The discussion on "Weather synchronization" (Section 5.1) is critical but currently buried. This is not just a limitation but a fundamental methodological constraint affecting the entire premise of using any time-resolved emission factor. Elevate the importance of this discussion. Integrate its core challenge earlier, perhaps in the methodology section when defining the reference </w:t>
-      </w:r>
-      <w:proofErr w:type="gramStart"/>
-      <w:r>
-        <w:rPr>
-          <w:rFonts w:ascii="Calibri" w:eastAsia="Calibri" w:hAnsi="Calibri" w:cs="Calibri"/>
-          <w:b/>
-          <w:bCs/>
-          <w:color w:val="4C94D8" w:themeColor="text2" w:themeTint="80"/>
-        </w:rPr>
-        <w:t>data, and</w:t>
-      </w:r>
-      <w:proofErr w:type="gramEnd"/>
-      <w:r>
-        <w:rPr>
-          <w:rFonts w:ascii="Calibri" w:eastAsia="Calibri" w:hAnsi="Calibri" w:cs="Calibri"/>
-          <w:b/>
-          <w:bCs/>
-          <w:color w:val="4C94D8" w:themeColor="text2" w:themeTint="80"/>
-        </w:rPr>
-        <w:t xml:space="preserve"> expand on its implications for real-world policy application of your recommendations.</w:t>
+        <w:t>The discussion on "Weather synchronization" (Section 5.1) is critical but currently buried. This is not just a limitation but a fundamental methodological constraint affecting the entire premise of using any time-resolved emission factor. Elevate the importance of this discussion. Integrate its core challenge earlier, perhaps in the methodology section when defining the reference data, and expand on its implications for real-world policy application of your recommendations.</w:t>
       </w:r>
     </w:p>
     <w:p>
@@ -4010,29 +4810,7 @@
           <w:u w:val="single"/>
           <w:lang w:val="en-US"/>
         </w:rPr>
-        <w:t xml:space="preserve">A key practical limitation </w:t>
-      </w:r>
-      <w:proofErr w:type="gramStart"/>
-      <w:r>
-        <w:rPr>
-          <w:rFonts w:ascii="Calibri" w:eastAsia="Calibri" w:hAnsi="Calibri" w:cs="Calibri"/>
-          <w:i/>
-          <w:iCs/>
-          <w:u w:val="single"/>
-          <w:lang w:val="en-US"/>
-        </w:rPr>
-        <w:t>and also</w:t>
-      </w:r>
-      <w:proofErr w:type="gramEnd"/>
-      <w:r>
-        <w:rPr>
-          <w:rFonts w:ascii="Calibri" w:eastAsia="Calibri" w:hAnsi="Calibri" w:cs="Calibri"/>
-          <w:i/>
-          <w:iCs/>
-          <w:u w:val="single"/>
-          <w:lang w:val="en-US"/>
-        </w:rPr>
-        <w:t xml:space="preserve"> constraint in applying hourly emission factors as the benchmark reference is their sensitivity to weather assumptions. Hourly grid emission rates are typically derived from production-cost or dispatch models calibrated using meteorological conditions from </w:t>
+        <w:t xml:space="preserve">A key practical limitation and also constraint in applying hourly emission factors as the benchmark reference is their sensitivity to weather assumptions. Hourly grid emission rates are typically derived from production-cost or dispatch models calibrated using meteorological conditions from a specific historical year (or a limited set of years, such as those extracted from the Cambium dataset, which uses actual meteorological data from 2012). As a result, the temporal profile of renewable generation, load, and marginal unit dispatch embedded in these hourly factors reflects weather patterns that may not align with the actual weather experienced by buildings during the analysis period. This mismatch can introduce systematic discrepancies when hourly emission factors are paired with measured </w:t>
       </w:r>
       <w:r>
         <w:rPr>
@@ -4043,7 +4821,7 @@
           <w:lang w:val="en-US"/>
         </w:rPr>
         <w:lastRenderedPageBreak/>
-        <w:t>a specific historical year (or a limited set of years, such as those extracted from the Cambium dataset, which uses actual meteorological data from 2012). As a result, the temporal profile of renewable generation, load, and marginal unit dispatch embedded in these hourly factors reflects weather patterns that may not align with the actual weather experienced by buildings during the analysis period. This mismatch can introduce systematic discrepancies when hourly emission factors are paired with measured building electricity consumption from a different year or region, particularly under extreme or anomalous weather conditions.</w:t>
+        <w:t>building electricity consumption from a different year or region, particularly under extreme or anomalous weather conditions.</w:t>
       </w:r>
       <w:r>
         <w:rPr>
@@ -4215,7 +4993,57 @@
           <w:iCs/>
           <w:u w:val="single"/>
         </w:rPr>
-        <w:t xml:space="preserve">explicitly mandate the use of season-hour or month-hour average emission factors for operational carbon accounting and prohibit the use of annual averages. </w:t>
+        <w:t xml:space="preserve">explicitly mandate the use of season-hour or month-hour average emission factors for operational carbon accounting and </w:t>
+      </w:r>
+      <w:commentRangeStart w:id="15"/>
+      <w:r>
+        <w:rPr>
+          <w:rFonts w:ascii="Calibri" w:eastAsia="Calibri" w:hAnsi="Calibri" w:cs="Calibri"/>
+          <w:i/>
+          <w:iCs/>
+          <w:highlight w:val="yellow"/>
+          <w:u w:val="single"/>
+          <w:rPrChange w:id="16" w:author="Aoyu Zou" w:date="2026-01-29T12:36:00Z" w16du:dateUtc="2026-01-29T20:36:00Z">
+            <w:rPr>
+              <w:rFonts w:ascii="Calibri" w:eastAsia="Calibri" w:hAnsi="Calibri" w:cs="Calibri"/>
+              <w:i/>
+              <w:iCs/>
+              <w:u w:val="single"/>
+            </w:rPr>
+          </w:rPrChange>
+        </w:rPr>
+        <w:t>prohibit</w:t>
+      </w:r>
+      <w:r>
+        <w:rPr>
+          <w:rFonts w:ascii="Calibri" w:eastAsia="Calibri" w:hAnsi="Calibri" w:cs="Calibri"/>
+          <w:i/>
+          <w:iCs/>
+          <w:u w:val="single"/>
+        </w:rPr>
+        <w:t xml:space="preserve"> </w:t>
+      </w:r>
+      <w:commentRangeEnd w:id="15"/>
+      <w:r>
+        <w:rPr>
+          <w:rStyle w:val="CommentReference"/>
+          <w:rFonts w:ascii="Calibri" w:eastAsia="Calibri" w:hAnsi="Calibri" w:cs="Calibri"/>
+          <w:i/>
+          <w:iCs/>
+          <w:sz w:val="22"/>
+          <w:szCs w:val="22"/>
+          <w:u w:val="single"/>
+        </w:rPr>
+        <w:commentReference w:id="15"/>
+      </w:r>
+      <w:r>
+        <w:rPr>
+          <w:rFonts w:ascii="Calibri" w:eastAsia="Calibri" w:hAnsi="Calibri" w:cs="Calibri"/>
+          <w:i/>
+          <w:iCs/>
+          <w:u w:val="single"/>
+        </w:rPr>
+        <w:t xml:space="preserve">the use of annual averages. </w:t>
       </w:r>
       <w:r>
         <w:rPr>
@@ -4244,15 +5072,70 @@
           <w:lang w:val="en-US"/>
         </w:rPr>
       </w:pPr>
-      <w:r>
-        <w:rPr>
-          <w:rFonts w:ascii="Calibri" w:eastAsia="Calibri" w:hAnsi="Calibri" w:cs="Calibri"/>
-          <w:i/>
-          <w:iCs/>
-          <w:u w:val="single"/>
-          <w:lang w:val="en-US"/>
-        </w:rPr>
-        <w:t>We further recommend that those standards explicitly decouple net-zero carbon buildings (NZCBs) from net-zero energy buildings (NZEBs). This decoupling action should include: (1) clear separation in reporting between lifecycle impacts associated with operational energy use (Module B6) and those associated with exported utilities (Module D2); and (2) mandatory use of season-hour or month-hour emission factors to assess environmental impact of each kWh of exported utility.</w:t>
+      <w:commentRangeStart w:id="17"/>
+      <w:r>
+        <w:rPr>
+          <w:rFonts w:ascii="Calibri" w:eastAsia="Calibri" w:hAnsi="Calibri" w:cs="Calibri"/>
+          <w:i/>
+          <w:iCs/>
+          <w:u w:val="single"/>
+          <w:lang w:val="en-US"/>
+        </w:rPr>
+        <w:t>We</w:t>
+      </w:r>
+      <w:commentRangeEnd w:id="17"/>
+      <w:r>
+        <w:rPr>
+          <w:rStyle w:val="CommentReference"/>
+          <w:rFonts w:ascii="Calibri" w:eastAsia="Calibri" w:hAnsi="Calibri" w:cs="Calibri"/>
+          <w:i/>
+          <w:iCs/>
+          <w:sz w:val="22"/>
+          <w:szCs w:val="22"/>
+          <w:u w:val="single"/>
+          <w:lang w:val="en-US"/>
+        </w:rPr>
+        <w:commentReference w:id="17"/>
+      </w:r>
+      <w:r>
+        <w:rPr>
+          <w:rFonts w:ascii="Calibri" w:eastAsia="Calibri" w:hAnsi="Calibri" w:cs="Calibri"/>
+          <w:i/>
+          <w:iCs/>
+          <w:u w:val="single"/>
+          <w:lang w:val="en-US"/>
+        </w:rPr>
+        <w:t xml:space="preserve"> further recommend that those standards explicitly decouple net-zero carbon buildings (NZCBs) from net-zero energy buildings (NZEBs). This decoupling action should include: (1) clear separation in reporting between lifecycle impacts associated with operational energy use (Module B6) and those associated with exported utilities (Module D2); and (2) </w:t>
+      </w:r>
+      <w:r>
+        <w:rPr>
+          <w:rFonts w:ascii="Calibri" w:eastAsia="Calibri" w:hAnsi="Calibri" w:cs="Calibri"/>
+          <w:i/>
+          <w:iCs/>
+          <w:highlight w:val="yellow"/>
+          <w:u w:val="single"/>
+          <w:lang w:val="en-US"/>
+          <w:rPrChange w:id="18" w:author="Aoyu Zou" w:date="2026-01-29T12:41:00Z" w16du:dateUtc="2026-01-29T20:41:00Z">
+            <w:rPr>
+              <w:rFonts w:ascii="Calibri" w:eastAsia="Calibri" w:hAnsi="Calibri" w:cs="Calibri"/>
+              <w:i/>
+              <w:iCs/>
+              <w:u w:val="single"/>
+              <w:lang w:val="en-US"/>
+            </w:rPr>
+          </w:rPrChange>
+        </w:rPr>
+        <w:t>mandatory</w:t>
+      </w:r>
+      <w:r>
+        <w:rPr>
+          <w:rFonts w:ascii="Calibri" w:eastAsia="Calibri" w:hAnsi="Calibri" w:cs="Calibri"/>
+          <w:i/>
+          <w:iCs/>
+          <w:u w:val="single"/>
+          <w:lang w:val="en-US"/>
+        </w:rPr>
+        <w:t xml:space="preserve"> use of season-hour or month-hour emission factors to assess environmental impact of each kWh of exported utility.</w:t>
       </w:r>
     </w:p>
     <w:p>
@@ -4279,8 +5162,17 @@
           <w:bCs/>
           <w:color w:val="4C94D8" w:themeColor="text2" w:themeTint="80"/>
         </w:rPr>
+        <w:t xml:space="preserve">The limitation regarding Battery Energy Storage Systems (BESS) is correctly identified but handled too lightly. Given that BESS is a cornerstone for managing temporal grid variability and a key tool for NZCBs, its exclusion is significant. Expand this limitation section. Discuss how BESS integration would likely *increase* the error when using coarse emission factors, </w:t>
+      </w:r>
+      <w:r>
+        <w:rPr>
+          <w:rFonts w:ascii="Calibri" w:eastAsia="Calibri" w:hAnsi="Calibri" w:cs="Calibri"/>
+          <w:b/>
+          <w:bCs/>
+          <w:color w:val="4C94D8" w:themeColor="text2" w:themeTint="80"/>
+        </w:rPr>
         <w:lastRenderedPageBreak/>
-        <w:t>The limitation regarding Battery Energy Storage Systems (BESS) is correctly identified but handled too lightly. Given that BESS is a cornerstone for managing temporal grid variability and a key tool for NZCBs, its exclusion is significant. Expand this limitation section. Discuss how BESS integration would likely *increase* the error when using coarse emission factors, thereby strengthening your core argument for higher temporal resolution. Propose this as essential future work.</w:t>
+        <w:t>thereby strengthening your core argument for higher temporal resolution. Propose this as essential future work.</w:t>
       </w:r>
     </w:p>
     <w:p>
@@ -4405,7 +5297,7 @@
         </w:rPr>
         <w:t xml:space="preserve"> </w:t>
       </w:r>
-      <w:hyperlink r:id="rId10" w:history="1">
+      <w:hyperlink r:id="rId14" w:history="1">
         <w:r>
           <w:rPr>
             <w:rStyle w:val="Hyperlink"/>
@@ -4531,13 +5423,61 @@
         <w:rPr>
           <w:rFonts w:ascii="Calibri" w:eastAsia="Calibri" w:hAnsi="Calibri" w:cs="Calibri"/>
         </w:rPr>
-        <w:t xml:space="preserve">We have modified the conclusion section that emphasize more on the study contribution and impact. Additionally, we also added </w:t>
-      </w:r>
-      <w:r>
-        <w:rPr>
-          <w:rFonts w:ascii="Calibri" w:eastAsia="Calibri" w:hAnsi="Calibri" w:cs="Calibri"/>
-        </w:rPr>
-        <w:t xml:space="preserve">future work to imply the limitation of the study analysis. </w:t>
+        <w:t>We have modified the conclusion section</w:t>
+      </w:r>
+      <w:r>
+        <w:rPr>
+          <w:rFonts w:ascii="Calibri" w:eastAsia="Calibri" w:hAnsi="Calibri" w:cs="Calibri"/>
+        </w:rPr>
+        <w:t xml:space="preserve">, which now </w:t>
+      </w:r>
+      <w:r>
+        <w:rPr>
+          <w:rFonts w:ascii="Calibri" w:eastAsia="Calibri" w:hAnsi="Calibri" w:cs="Calibri"/>
+        </w:rPr>
+        <w:t>emphasize</w:t>
+      </w:r>
+      <w:r>
+        <w:rPr>
+          <w:rFonts w:ascii="Calibri" w:eastAsia="Calibri" w:hAnsi="Calibri" w:cs="Calibri"/>
+        </w:rPr>
+        <w:t>s</w:t>
+      </w:r>
+      <w:r>
+        <w:rPr>
+          <w:rFonts w:ascii="Calibri" w:eastAsia="Calibri" w:hAnsi="Calibri" w:cs="Calibri"/>
+        </w:rPr>
+        <w:t xml:space="preserve"> more on the study contribution and impact. Additionally, we also added </w:t>
+      </w:r>
+      <w:r>
+        <w:rPr>
+          <w:rFonts w:ascii="Calibri" w:eastAsia="Calibri" w:hAnsi="Calibri" w:cs="Calibri"/>
+        </w:rPr>
+        <w:t xml:space="preserve">future work </w:t>
+      </w:r>
+      <w:r>
+        <w:rPr>
+          <w:rFonts w:ascii="Calibri" w:eastAsia="Calibri" w:hAnsi="Calibri" w:cs="Calibri"/>
+        </w:rPr>
+        <w:t xml:space="preserve">including investigation of battery energy storage system </w:t>
+      </w:r>
+      <w:r>
+        <w:rPr>
+          <w:rFonts w:ascii="Calibri" w:eastAsia="Calibri" w:hAnsi="Calibri" w:cs="Calibri"/>
+        </w:rPr>
+        <w:t xml:space="preserve">to </w:t>
+      </w:r>
+      <w:r>
+        <w:rPr>
+          <w:rFonts w:ascii="Calibri" w:eastAsia="Calibri" w:hAnsi="Calibri" w:cs="Calibri"/>
+        </w:rPr>
+        <w:t>address</w:t>
+      </w:r>
+      <w:r>
+        <w:rPr>
+          <w:rFonts w:ascii="Calibri" w:eastAsia="Calibri" w:hAnsi="Calibri" w:cs="Calibri"/>
+        </w:rPr>
+        <w:t xml:space="preserve"> the limitation of the study analysis. </w:t>
       </w:r>
     </w:p>
     <w:p>
@@ -4566,7 +5506,7 @@
           <w:u w:val="single"/>
           <w:lang w:val="en-US"/>
         </w:rPr>
-        <w:t xml:space="preserve">Practitioners often use annual or seasonal average emissions rates to estimate building operational and avoided carbon emissions, yet standards provide limited guidance on the accuracy of these simplifications. This study demonstrates that this gap can significantly impact net-zero carbon building assessment, retrofit valuation, utility export quantification. </w:t>
+        <w:t xml:space="preserve">Practitioners often use annual or seasonal average emissions rates to estimate building operational and avoided carbon emissions, yet standards provide limited guidance on the accuracy of these simplifications. This study demonstrates that this gap can significantly impact net-zero carbon building assessment, retrofit valuation, utility export quantification. Distinct from prior work that relies largely on simulations or single-building case studies, our analysis integrates measured hourly electricity consumption from over 600 real commercial buildings and evaluates performance across all contiguous U.S. grid regions. Using hourly emissions rates as a high-resolution benchmark, we systematically quantified the deviation and uncertainty introduced by five </w:t>
       </w:r>
       <w:r>
         <w:rPr>
@@ -4577,7 +5517,7 @@
           <w:lang w:val="en-US"/>
         </w:rPr>
         <w:lastRenderedPageBreak/>
-        <w:t xml:space="preserve">Distinct from prior work that relies largely on simulations or single-building case studies, our analysis integrates measured hourly electricity consumption from over 600 real commercial buildings and evaluates performance across all contiguous U.S. grid regions. Using hourly emissions rates as a high-resolution benchmark, we systematically quantified the deviation and uncertainty introduced by five commonly used lower-resolution alternatives, from annual averages to month-hour averages. The results show that annual and seasonal averages substantially oversimplify grid dynamics, with median deviations exceeding 100% under projected 2050 grid scenarios. In contrast, season-hour and month-hour emission factors consistently achieve median deviations below 5%. Considering accuracy and practicality, we recommend that standards and guidelines formally adopt season-hour or month-hour emission factors as the minimum temporal resolution requirement for operational and avoided carbon emissions accounting. </w:t>
+        <w:t xml:space="preserve">commonly used lower-resolution alternatives, from annual averages to month-hour averages. The results show that annual and seasonal averages substantially oversimplify grid dynamics, with median deviations exceeding 100% under projected 2050 grid scenarios. In contrast, season-hour and month-hour emission factors consistently achieve median deviations below 5%. Considering accuracy and practicality, we recommend that standards and guidelines formally adopt season-hour or month-hour emission factors as the minimum temporal resolution requirement for operational and avoided carbon emissions accounting. </w:t>
       </w:r>
     </w:p>
     <w:p>
@@ -4633,7 +5573,17 @@
           <w:u w:val="single"/>
           <w:lang w:val="en-US"/>
         </w:rPr>
-        <w:t>Future work should incorporate dynamic building energy-use projections that account for climate change, evolving occupancy patterns, and behavioral shifts, which were treated as static in this analysis. In addition, this study applied the open-source dataset of measured building electricity as an aggregated group across all grid regions, potentially underrepresenting climate-specific construction and operational characteristics. Future analyses should therefore integrate regionally calibrated models to more accurately capture geographic variability in building performance and grid interactions.</w:t>
+        <w:t>Future work should incorporate dynamic building energy-use projections that account for climate change, evolving occupancy patterns, behavioral shifts, and the use of battery energy storage system for load shift application.</w:t>
+      </w:r>
+      <w:r>
+        <w:rPr>
+          <w:rFonts w:ascii="Calibri" w:eastAsia="Calibri" w:hAnsi="Calibri" w:cs="Calibri"/>
+          <w:i/>
+          <w:iCs/>
+          <w:u w:val="single"/>
+          <w:lang w:val="en-US"/>
+        </w:rPr>
+        <w:t xml:space="preserve"> In addition, this study applied the open-source dataset of measured building electricity as an aggregated group across all grid regions, potentially underrepresenting climate-specific construction and operational characteristics. Future analyses should therefore integrate regionally calibrated models to more accurately capture geographic variability in building performance and grid interactions.</w:t>
       </w:r>
       <w:r>
         <w:rPr>
@@ -4726,43 +5676,22 @@
           <w:bCs/>
           <w:color w:val="4C94D8" w:themeColor="text2" w:themeTint="80"/>
         </w:rPr>
-        <w:t xml:space="preserve">The graphical abstract is </w:t>
-      </w:r>
-      <w:proofErr w:type="gramStart"/>
-      <w:r>
-        <w:rPr>
-          <w:rFonts w:ascii="Calibri" w:eastAsia="Calibri" w:hAnsi="Calibri" w:cs="Calibri"/>
-          <w:b/>
-          <w:bCs/>
-          <w:color w:val="4C94D8" w:themeColor="text2" w:themeTint="80"/>
-        </w:rPr>
-        <w:t>informative</w:t>
-      </w:r>
-      <w:proofErr w:type="gramEnd"/>
-      <w:r>
-        <w:rPr>
-          <w:rFonts w:ascii="Calibri" w:eastAsia="Calibri" w:hAnsi="Calibri" w:cs="Calibri"/>
-          <w:b/>
-          <w:bCs/>
-          <w:color w:val="4C94D8" w:themeColor="text2" w:themeTint="80"/>
-        </w:rPr>
-        <w:t xml:space="preserve"> but the "Policy implications" box is empty. This is a missed opportunity. The graphical abstract should visually summarize the key recommendation (e.g., "Standards must require season-hour resolution"). Revise it to complete the narrative flow from problem to solution.</w:t>
-      </w:r>
-    </w:p>
-    <w:p>
-      <w:pPr>
-        <w:jc w:val="both"/>
-        <w:rPr>
-          <w:rFonts w:ascii="Calibri" w:eastAsia="Calibri" w:hAnsi="Calibri" w:cs="Calibri"/>
-        </w:rPr>
-      </w:pPr>
-      <w:r>
-        <w:rPr>
-          <w:rFonts w:ascii="Calibri" w:eastAsia="Calibri" w:hAnsi="Calibri" w:cs="Calibri"/>
-          <w:b/>
-          <w:bCs/>
-        </w:rPr>
-        <w:lastRenderedPageBreak/>
+        <w:t>The graphical abstract is informative but the "Policy implications" box is empty. This is a missed opportunity. The graphical abstract should visually summarize the key recommendation (e.g., "Standards must require season-hour resolution"). Revise it to complete the narrative flow from problem to solution.</w:t>
+      </w:r>
+    </w:p>
+    <w:p>
+      <w:pPr>
+        <w:jc w:val="both"/>
+        <w:rPr>
+          <w:rFonts w:ascii="Calibri" w:eastAsia="Calibri" w:hAnsi="Calibri" w:cs="Calibri"/>
+        </w:rPr>
+      </w:pPr>
+      <w:r>
+        <w:rPr>
+          <w:rFonts w:ascii="Calibri" w:eastAsia="Calibri" w:hAnsi="Calibri" w:cs="Calibri"/>
+          <w:b/>
+          <w:bCs/>
+        </w:rPr>
         <w:t xml:space="preserve">Response: </w:t>
       </w:r>
       <w:r>
@@ -4775,7 +5704,31 @@
         <w:rPr>
           <w:rFonts w:ascii="Calibri" w:eastAsia="Calibri" w:hAnsi="Calibri" w:cs="Calibri"/>
         </w:rPr>
-        <w:t xml:space="preserve"> We updated the graphical abstract with more emphasize on the policy impact and takeaway message as suggested by the reviewer. The update the figure is shown below: </w:t>
+        <w:t xml:space="preserve"> We updated the graphical abstract with</w:t>
+      </w:r>
+      <w:r>
+        <w:rPr>
+          <w:rFonts w:ascii="Calibri" w:eastAsia="Calibri" w:hAnsi="Calibri" w:cs="Calibri"/>
+        </w:rPr>
+        <w:t xml:space="preserve"> </w:t>
+      </w:r>
+      <w:r>
+        <w:rPr>
+          <w:rFonts w:ascii="Calibri" w:eastAsia="Calibri" w:hAnsi="Calibri" w:cs="Calibri"/>
+        </w:rPr>
+        <w:t>more emphasize on the policy impact and takeaway message as suggested by the reviewer. The update</w:t>
+      </w:r>
+      <w:r>
+        <w:rPr>
+          <w:rFonts w:ascii="Calibri" w:eastAsia="Calibri" w:hAnsi="Calibri" w:cs="Calibri"/>
+        </w:rPr>
+        <w:t>d</w:t>
+      </w:r>
+      <w:r>
+        <w:rPr>
+          <w:rFonts w:ascii="Calibri" w:eastAsia="Calibri" w:hAnsi="Calibri" w:cs="Calibri"/>
+        </w:rPr>
+        <w:t xml:space="preserve"> figure is shown below: </w:t>
       </w:r>
     </w:p>
     <w:p>
@@ -4795,6 +5748,7 @@
           <w:noProof/>
           <w14:ligatures w14:val="standardContextual"/>
         </w:rPr>
+        <w:lastRenderedPageBreak/>
         <w:drawing>
           <wp:inline distT="0" distB="0" distL="0" distR="0" wp14:anchorId="3CBA4A72" wp14:editId="3AA70736">
             <wp:extent cx="5943600" cy="3343275"/>
@@ -4811,7 +5765,7 @@
                     <pic:cNvPicPr/>
                   </pic:nvPicPr>
                   <pic:blipFill>
-                    <a:blip r:embed="rId11" cstate="print">
+                    <a:blip r:embed="rId15" cstate="print">
                       <a:extLst>
                         <a:ext uri="{28A0092B-C50C-407E-A947-70E740481C1C}">
                           <a14:useLocalDpi xmlns:a14="http://schemas.microsoft.com/office/drawing/2010/main" val="0"/>
@@ -4853,13 +5807,113 @@
 </w:document>
 </file>
 
+<file path=word/comments.xml><?xml version="1.0" encoding="utf-8"?>
+<w:comments xmlns:wpc="http://schemas.microsoft.com/office/word/2010/wordprocessingCanvas" xmlns:cx="http://schemas.microsoft.com/office/drawing/2014/chartex" xmlns:cx1="http://schemas.microsoft.com/office/drawing/2015/9/8/chartex" xmlns:cx2="http://schemas.microsoft.com/office/drawing/2015/10/21/chartex" xmlns:cx3="http://schemas.microsoft.com/office/drawing/2016/5/9/chartex" xmlns:cx4="http://schemas.microsoft.com/office/drawing/2016/5/10/chartex" xmlns:cx5="http://schemas.microsoft.com/office/drawing/2016/5/11/chartex" xmlns:cx6="http://schemas.microsoft.com/office/drawing/2016/5/12/chartex" xmlns:cx7="http://schemas.microsoft.com/office/drawing/2016/5/13/chartex" xmlns:cx8="http://schemas.microsoft.com/office/drawing/2016/5/14/chartex" xmlns:mc="http://schemas.openxmlformats.org/markup-compatibility/2006" xmlns:aink="http://schemas.microsoft.com/office/drawing/2016/ink" xmlns:am3d="http://schemas.microsoft.com/office/drawing/2017/model3d" xmlns:o="urn:schemas-microsoft-com:office:office" xmlns:oel="http://schemas.microsoft.com/office/2019/extlst" xmlns:r="http://schemas.openxmlformats.org/officeDocument/2006/relationships" xmlns:m="http://schemas.openxmlformats.org/officeDocument/2006/math" xmlns:v="urn:schemas-microsoft-com:vml" xmlns:wp14="http://schemas.microsoft.com/office/word/2010/wordprocessingDrawing" xmlns:wp="http://schemas.openxmlformats.org/drawingml/2006/wordprocessingDrawing" xmlns:w10="urn:schemas-microsoft-com:office:word" xmlns:w="http://schemas.openxmlformats.org/wordprocessingml/2006/main" xmlns:w14="http://schemas.microsoft.com/office/word/2010/wordml" xmlns:w15="http://schemas.microsoft.com/office/word/2012/wordml" xmlns:w16cex="http://schemas.microsoft.com/office/word/2018/wordml/cex" xmlns:w16cid="http://schemas.microsoft.com/office/word/2016/wordml/cid" xmlns:w16="http://schemas.microsoft.com/office/word/2018/wordml" xmlns:w16du="http://schemas.microsoft.com/office/word/2023/wordml/word16du" xmlns:w16sdtdh="http://schemas.microsoft.com/office/word/2020/wordml/sdtdatahash" xmlns:w16sdtfl="http://schemas.microsoft.com/office/word/2024/wordml/sdtformatlock" xmlns:w16se="http://schemas.microsoft.com/office/word/2015/wordml/symex" xmlns:wpg="http://schemas.microsoft.com/office/word/2010/wordprocessingGroup" xmlns:wpi="http://schemas.microsoft.com/office/word/2010/wordprocessingInk" xmlns:wne="http://schemas.microsoft.com/office/word/2006/wordml" xmlns:wps="http://schemas.microsoft.com/office/word/2010/wordprocessingShape" mc:Ignorable="w14 w15 w16se w16cid w16 w16cex w16sdtdh w16sdtfl w16du wp14">
+  <w:comment w:id="12" w:author="Aoyu Zou" w:date="2026-01-29T12:36:00Z" w:initials="AZ">
+    <w:p>
+      <w:r>
+        <w:rPr>
+          <w:rStyle w:val="CommentReference"/>
+        </w:rPr>
+        <w:annotationRef/>
+      </w:r>
+      <w:r>
+        <w:rPr>
+          <w:sz w:val="20"/>
+          <w:szCs w:val="20"/>
+        </w:rPr>
+        <w:t>18 pt boxplots across geas</w:t>
+      </w:r>
+    </w:p>
+  </w:comment>
+  <w:comment w:id="13" w:author="Aoyu Zou" w:date="2026-01-29T12:48:00Z" w:initials="AZ">
+    <w:p>
+      <w:r>
+        <w:rPr>
+          <w:rStyle w:val="CommentReference"/>
+        </w:rPr>
+        <w:annotationRef/>
+      </w:r>
+      <w:r>
+        <w:rPr>
+          <w:sz w:val="20"/>
+          <w:szCs w:val="20"/>
+        </w:rPr>
+        <w:t>methodology figure added here</w:t>
+      </w:r>
+    </w:p>
+  </w:comment>
+  <w:comment w:id="15" w:author="Aoyu Zou" w:date="2026-01-29T12:40:00Z" w:initials="AZ">
+    <w:p>
+      <w:r>
+        <w:rPr>
+          <w:rStyle w:val="CommentReference"/>
+        </w:rPr>
+        <w:annotationRef/>
+      </w:r>
+      <w:r>
+        <w:rPr>
+          <w:sz w:val="20"/>
+          <w:szCs w:val="20"/>
+        </w:rPr>
+        <w:t>disincentivize (add a penalty to cases which use annual average to discourage this practice)</w:t>
+      </w:r>
+    </w:p>
+  </w:comment>
+  <w:comment w:id="17" w:author="Aoyu Zou" w:date="2026-01-29T12:40:00Z" w:initials="AZ">
+    <w:p>
+      <w:r>
+        <w:rPr>
+          <w:rStyle w:val="CommentReference"/>
+        </w:rPr>
+        <w:annotationRef/>
+      </w:r>
+      <w:r>
+        <w:rPr>
+          <w:sz w:val="20"/>
+          <w:szCs w:val="20"/>
+        </w:rPr>
+        <w:t>real time applications require real time actual emissions data (e.g. wattttime)</w:t>
+      </w:r>
+    </w:p>
+  </w:comment>
+</w:comments>
+</file>
+
+<file path=word/commentsExtended.xml><?xml version="1.0" encoding="utf-8"?>
+<w15:commentsEx xmlns:wpc="http://schemas.microsoft.com/office/word/2010/wordprocessingCanvas" xmlns:cx="http://schemas.microsoft.com/office/drawing/2014/chartex" xmlns:cx1="http://schemas.microsoft.com/office/drawing/2015/9/8/chartex" xmlns:cx2="http://schemas.microsoft.com/office/drawing/2015/10/21/chartex" xmlns:cx3="http://schemas.microsoft.com/office/drawing/2016/5/9/chartex" xmlns:cx4="http://schemas.microsoft.com/office/drawing/2016/5/10/chartex" xmlns:cx5="http://schemas.microsoft.com/office/drawing/2016/5/11/chartex" xmlns:cx6="http://schemas.microsoft.com/office/drawing/2016/5/12/chartex" xmlns:cx7="http://schemas.microsoft.com/office/drawing/2016/5/13/chartex" xmlns:cx8="http://schemas.microsoft.com/office/drawing/2016/5/14/chartex" xmlns:mc="http://schemas.openxmlformats.org/markup-compatibility/2006" xmlns:aink="http://schemas.microsoft.com/office/drawing/2016/ink" xmlns:am3d="http://schemas.microsoft.com/office/drawing/2017/model3d" xmlns:o="urn:schemas-microsoft-com:office:office" xmlns:oel="http://schemas.microsoft.com/office/2019/extlst" xmlns:r="http://schemas.openxmlformats.org/officeDocument/2006/relationships" xmlns:m="http://schemas.openxmlformats.org/officeDocument/2006/math" xmlns:v="urn:schemas-microsoft-com:vml" xmlns:wp14="http://schemas.microsoft.com/office/word/2010/wordprocessingDrawing" xmlns:wp="http://schemas.openxmlformats.org/drawingml/2006/wordprocessingDrawing" xmlns:w10="urn:schemas-microsoft-com:office:word" xmlns:w="http://schemas.openxmlformats.org/wordprocessingml/2006/main" xmlns:w14="http://schemas.microsoft.com/office/word/2010/wordml" xmlns:w15="http://schemas.microsoft.com/office/word/2012/wordml" xmlns:w16cex="http://schemas.microsoft.com/office/word/2018/wordml/cex" xmlns:w16cid="http://schemas.microsoft.com/office/word/2016/wordml/cid" xmlns:w16="http://schemas.microsoft.com/office/word/2018/wordml" xmlns:w16du="http://schemas.microsoft.com/office/word/2023/wordml/word16du" xmlns:w16sdtdh="http://schemas.microsoft.com/office/word/2020/wordml/sdtdatahash" xmlns:w16sdtfl="http://schemas.microsoft.com/office/word/2024/wordml/sdtformatlock" xmlns:w16se="http://schemas.microsoft.com/office/word/2015/wordml/symex" xmlns:wpg="http://schemas.microsoft.com/office/word/2010/wordprocessingGroup" xmlns:wpi="http://schemas.microsoft.com/office/word/2010/wordprocessingInk" xmlns:wne="http://schemas.microsoft.com/office/word/2006/wordml" xmlns:wps="http://schemas.microsoft.com/office/word/2010/wordprocessingShape" mc:Ignorable="w14 w15 w16se w16cid w16 w16cex w16sdtdh w16sdtfl w16du wp14">
+  <w15:commentEx w15:paraId="342B132D" w15:done="0"/>
+  <w15:commentEx w15:paraId="7F788341" w15:done="0"/>
+  <w15:commentEx w15:paraId="25BFAF28" w15:done="0"/>
+  <w15:commentEx w15:paraId="34CA9832" w15:done="0"/>
+</w15:commentsEx>
+</file>
+
+<file path=word/commentsExtensible.xml><?xml version="1.0" encoding="utf-8"?>
+<w16cex:commentsExtensible xmlns:wpc="http://schemas.microsoft.com/office/word/2010/wordprocessingCanvas" xmlns:cx="http://schemas.microsoft.com/office/drawing/2014/chartex" xmlns:cx1="http://schemas.microsoft.com/office/drawing/2015/9/8/chartex" xmlns:cx2="http://schemas.microsoft.com/office/drawing/2015/10/21/chartex" xmlns:cx3="http://schemas.microsoft.com/office/drawing/2016/5/9/chartex" xmlns:cx4="http://schemas.microsoft.com/office/drawing/2016/5/10/chartex" xmlns:cx5="http://schemas.microsoft.com/office/drawing/2016/5/11/chartex" xmlns:cx6="http://schemas.microsoft.com/office/drawing/2016/5/12/chartex" xmlns:cx7="http://schemas.microsoft.com/office/drawing/2016/5/13/chartex" xmlns:cx8="http://schemas.microsoft.com/office/drawing/2016/5/14/chartex" xmlns:cr="http://schemas.microsoft.com/office/comments/2020/reactions" xmlns:mc="http://schemas.openxmlformats.org/markup-compatibility/2006" xmlns:aink="http://schemas.microsoft.com/office/drawing/2016/ink" xmlns:am3d="http://schemas.microsoft.com/office/drawing/2017/model3d" xmlns:o="urn:schemas-microsoft-com:office:office" xmlns:oel="http://schemas.microsoft.com/office/2019/extlst" xmlns:r="http://schemas.openxmlformats.org/officeDocument/2006/relationships" xmlns:m="http://schemas.openxmlformats.org/officeDocument/2006/math" xmlns:v="urn:schemas-microsoft-com:vml" xmlns:wp14="http://schemas.microsoft.com/office/word/2010/wordprocessingDrawing" xmlns:wp="http://schemas.openxmlformats.org/drawingml/2006/wordprocessingDrawing" xmlns:w10="urn:schemas-microsoft-com:office:word" xmlns:w="http://schemas.openxmlformats.org/wordprocessingml/2006/main" xmlns:w14="http://schemas.microsoft.com/office/word/2010/wordml" xmlns:w15="http://schemas.microsoft.com/office/word/2012/wordml" xmlns:w16cex="http://schemas.microsoft.com/office/word/2018/wordml/cex" xmlns:w16cid="http://schemas.microsoft.com/office/word/2016/wordml/cid" xmlns:w16="http://schemas.microsoft.com/office/word/2018/wordml" xmlns:w16du="http://schemas.microsoft.com/office/word/2023/wordml/word16du" xmlns:w16sdtdh="http://schemas.microsoft.com/office/word/2020/wordml/sdtdatahash" xmlns:w16sdtfl="http://schemas.microsoft.com/office/word/2024/wordml/sdtformatlock" xmlns:w16se="http://schemas.microsoft.com/office/word/2015/wordml/symex" xmlns:wpg="http://schemas.microsoft.com/office/word/2010/wordprocessingGroup" xmlns:wpi="http://schemas.microsoft.com/office/word/2010/wordprocessingInk" xmlns:wne="http://schemas.microsoft.com/office/word/2006/wordml" xmlns:wps="http://schemas.microsoft.com/office/word/2010/wordprocessingShape" mc:Ignorable="w14 w15 w16se w16cid w16 w16cex w16sdtdh w16sdtfl cr w16du wp14">
+  <w16cex:commentExtensible w16cex:durableId="2B7C60C7" w16cex:dateUtc="2026-01-29T20:36:00Z"/>
+  <w16cex:commentExtensible w16cex:durableId="6696059B" w16cex:dateUtc="2026-01-29T20:48:00Z"/>
+  <w16cex:commentExtensible w16cex:durableId="66FABBE4" w16cex:dateUtc="2026-01-29T20:40:00Z"/>
+  <w16cex:commentExtensible w16cex:durableId="1F7A746B" w16cex:dateUtc="2026-01-29T20:40:00Z"/>
+</w16cex:commentsExtensible>
+</file>
+
+<file path=word/commentsIds.xml><?xml version="1.0" encoding="utf-8"?>
+<w16cid:commentsIds xmlns:wpc="http://schemas.microsoft.com/office/word/2010/wordprocessingCanvas" xmlns:cx="http://schemas.microsoft.com/office/drawing/2014/chartex" xmlns:cx1="http://schemas.microsoft.com/office/drawing/2015/9/8/chartex" xmlns:cx2="http://schemas.microsoft.com/office/drawing/2015/10/21/chartex" xmlns:cx3="http://schemas.microsoft.com/office/drawing/2016/5/9/chartex" xmlns:cx4="http://schemas.microsoft.com/office/drawing/2016/5/10/chartex" xmlns:cx5="http://schemas.microsoft.com/office/drawing/2016/5/11/chartex" xmlns:cx6="http://schemas.microsoft.com/office/drawing/2016/5/12/chartex" xmlns:cx7="http://schemas.microsoft.com/office/drawing/2016/5/13/chartex" xmlns:cx8="http://schemas.microsoft.com/office/drawing/2016/5/14/chartex" xmlns:mc="http://schemas.openxmlformats.org/markup-compatibility/2006" xmlns:aink="http://schemas.microsoft.com/office/drawing/2016/ink" xmlns:am3d="http://schemas.microsoft.com/office/drawing/2017/model3d" xmlns:o="urn:schemas-microsoft-com:office:office" xmlns:oel="http://schemas.microsoft.com/office/2019/extlst" xmlns:r="http://schemas.openxmlformats.org/officeDocument/2006/relationships" xmlns:m="http://schemas.openxmlformats.org/officeDocument/2006/math" xmlns:v="urn:schemas-microsoft-com:vml" xmlns:wp14="http://schemas.microsoft.com/office/word/2010/wordprocessingDrawing" xmlns:wp="http://schemas.openxmlformats.org/drawingml/2006/wordprocessingDrawing" xmlns:w10="urn:schemas-microsoft-com:office:word" xmlns:w="http://schemas.openxmlformats.org/wordprocessingml/2006/main" xmlns:w14="http://schemas.microsoft.com/office/word/2010/wordml" xmlns:w15="http://schemas.microsoft.com/office/word/2012/wordml" xmlns:w16cex="http://schemas.microsoft.com/office/word/2018/wordml/cex" xmlns:w16cid="http://schemas.microsoft.com/office/word/2016/wordml/cid" xmlns:w16="http://schemas.microsoft.com/office/word/2018/wordml" xmlns:w16du="http://schemas.microsoft.com/office/word/2023/wordml/word16du" xmlns:w16sdtdh="http://schemas.microsoft.com/office/word/2020/wordml/sdtdatahash" xmlns:w16sdtfl="http://schemas.microsoft.com/office/word/2024/wordml/sdtformatlock" xmlns:w16se="http://schemas.microsoft.com/office/word/2015/wordml/symex" xmlns:wpg="http://schemas.microsoft.com/office/word/2010/wordprocessingGroup" xmlns:wpi="http://schemas.microsoft.com/office/word/2010/wordprocessingInk" xmlns:wne="http://schemas.microsoft.com/office/word/2006/wordml" xmlns:wps="http://schemas.microsoft.com/office/word/2010/wordprocessingShape" mc:Ignorable="w14 w15 w16se w16cid w16 w16cex w16sdtdh w16sdtfl w16du wp14">
+  <w16cid:commentId w16cid:paraId="342B132D" w16cid:durableId="2B7C60C7"/>
+  <w16cid:commentId w16cid:paraId="7F788341" w16cid:durableId="6696059B"/>
+  <w16cid:commentId w16cid:paraId="25BFAF28" w16cid:durableId="66FABBE4"/>
+  <w16cid:commentId w16cid:paraId="34CA9832" w16cid:durableId="1F7A746B"/>
+</w16cid:commentsIds>
+</file>
+
 <file path=word/numbering.xml><?xml version="1.0" encoding="utf-8"?>
 <w:numbering xmlns:wpc="http://schemas.microsoft.com/office/word/2010/wordprocessingCanvas" xmlns:cx="http://schemas.microsoft.com/office/drawing/2014/chartex" xmlns:cx1="http://schemas.microsoft.com/office/drawing/2015/9/8/chartex" xmlns:cx2="http://schemas.microsoft.com/office/drawing/2015/10/21/chartex" xmlns:cx3="http://schemas.microsoft.com/office/drawing/2016/5/9/chartex" xmlns:cx4="http://schemas.microsoft.com/office/drawing/2016/5/10/chartex" xmlns:cx5="http://schemas.microsoft.com/office/drawing/2016/5/11/chartex" xmlns:cx6="http://schemas.microsoft.com/office/drawing/2016/5/12/chartex" xmlns:cx7="http://schemas.microsoft.com/office/drawing/2016/5/13/chartex" xmlns:cx8="http://schemas.microsoft.com/office/drawing/2016/5/14/chartex" xmlns:mc="http://schemas.openxmlformats.org/markup-compatibility/2006" xmlns:aink="http://schemas.microsoft.com/office/drawing/2016/ink" xmlns:am3d="http://schemas.microsoft.com/office/drawing/2017/model3d" xmlns:o="urn:schemas-microsoft-com:office:office" xmlns:oel="http://schemas.microsoft.com/office/2019/extlst" xmlns:r="http://schemas.openxmlformats.org/officeDocument/2006/relationships" xmlns:m="http://schemas.openxmlformats.org/officeDocument/2006/math" xmlns:v="urn:schemas-microsoft-com:vml" xmlns:wp14="http://schemas.microsoft.com/office/word/2010/wordprocessingDrawing" xmlns:wp="http://schemas.openxmlformats.org/drawingml/2006/wordprocessingDrawing" xmlns:w10="urn:schemas-microsoft-com:office:word" xmlns:w="http://schemas.openxmlformats.org/wordprocessingml/2006/main" xmlns:w14="http://schemas.microsoft.com/office/word/2010/wordml" xmlns:w15="http://schemas.microsoft.com/office/word/2012/wordml" xmlns:w16cex="http://schemas.microsoft.com/office/word/2018/wordml/cex" xmlns:w16cid="http://schemas.microsoft.com/office/word/2016/wordml/cid" xmlns:w16="http://schemas.microsoft.com/office/word/2018/wordml" xmlns:w16du="http://schemas.microsoft.com/office/word/2023/wordml/word16du" xmlns:w16sdtdh="http://schemas.microsoft.com/office/word/2020/wordml/sdtdatahash" xmlns:w16sdtfl="http://schemas.microsoft.com/office/word/2024/wordml/sdtformatlock" xmlns:w16se="http://schemas.microsoft.com/office/word/2015/wordml/symex" xmlns:wpg="http://schemas.microsoft.com/office/word/2010/wordprocessingGroup" xmlns:wpi="http://schemas.microsoft.com/office/word/2010/wordprocessingInk" xmlns:wne="http://schemas.microsoft.com/office/word/2006/wordml" xmlns:wps="http://schemas.microsoft.com/office/word/2010/wordprocessingShape" mc:Ignorable="w14 w15 w16se w16cid w16 w16cex w16sdtdh w16sdtfl w16du wp14">
   <w:abstractNum w:abstractNumId="0" w15:restartNumberingAfterBreak="0">
     <w:nsid w:val="08892977"/>
     <w:multiLevelType w:val="hybridMultilevel"/>
-    <w:tmpl w:val="EC609DC8"/>
-    <w:lvl w:ilvl="0" w:tplc="897E3AC8">
+    <w:tmpl w:val="2106526E"/>
+    <w:lvl w:ilvl="0" w:tplc="C414A994">
       <w:start w:val="1"/>
       <w:numFmt w:val="decimal"/>
       <w:lvlText w:val="%1."/>
@@ -4868,7 +5922,7 @@
         <w:ind w:left="498"/>
       </w:pPr>
       <w:rPr>
-        <w:rFonts w:ascii="Times New Roman" w:eastAsia="Times New Roman" w:hAnsi="Times New Roman" w:cs="Times New Roman"/>
+        <w:rFonts w:ascii="Calibri" w:eastAsia="Times New Roman" w:hAnsi="Calibri" w:cs="Calibri" w:hint="default"/>
         <w:b w:val="0"/>
         <w:i w:val="0"/>
         <w:strike w:val="0"/>
@@ -5255,6 +6309,14 @@
     <w:abstractNumId w:val="0"/>
   </w:num>
 </w:numbering>
+</file>
+
+<file path=word/people.xml><?xml version="1.0" encoding="utf-8"?>
+<w15:people xmlns:wpc="http://schemas.microsoft.com/office/word/2010/wordprocessingCanvas" xmlns:cx="http://schemas.microsoft.com/office/drawing/2014/chartex" xmlns:cx1="http://schemas.microsoft.com/office/drawing/2015/9/8/chartex" xmlns:cx2="http://schemas.microsoft.com/office/drawing/2015/10/21/chartex" xmlns:cx3="http://schemas.microsoft.com/office/drawing/2016/5/9/chartex" xmlns:cx4="http://schemas.microsoft.com/office/drawing/2016/5/10/chartex" xmlns:cx5="http://schemas.microsoft.com/office/drawing/2016/5/11/chartex" xmlns:cx6="http://schemas.microsoft.com/office/drawing/2016/5/12/chartex" xmlns:cx7="http://schemas.microsoft.com/office/drawing/2016/5/13/chartex" xmlns:cx8="http://schemas.microsoft.com/office/drawing/2016/5/14/chartex" xmlns:mc="http://schemas.openxmlformats.org/markup-compatibility/2006" xmlns:aink="http://schemas.microsoft.com/office/drawing/2016/ink" xmlns:am3d="http://schemas.microsoft.com/office/drawing/2017/model3d" xmlns:o="urn:schemas-microsoft-com:office:office" xmlns:oel="http://schemas.microsoft.com/office/2019/extlst" xmlns:r="http://schemas.openxmlformats.org/officeDocument/2006/relationships" xmlns:m="http://schemas.openxmlformats.org/officeDocument/2006/math" xmlns:v="urn:schemas-microsoft-com:vml" xmlns:wp14="http://schemas.microsoft.com/office/word/2010/wordprocessingDrawing" xmlns:wp="http://schemas.openxmlformats.org/drawingml/2006/wordprocessingDrawing" xmlns:w10="urn:schemas-microsoft-com:office:word" xmlns:w="http://schemas.openxmlformats.org/wordprocessingml/2006/main" xmlns:w14="http://schemas.microsoft.com/office/word/2010/wordml" xmlns:w15="http://schemas.microsoft.com/office/word/2012/wordml" xmlns:w16cex="http://schemas.microsoft.com/office/word/2018/wordml/cex" xmlns:w16cid="http://schemas.microsoft.com/office/word/2016/wordml/cid" xmlns:w16="http://schemas.microsoft.com/office/word/2018/wordml" xmlns:w16du="http://schemas.microsoft.com/office/word/2023/wordml/word16du" xmlns:w16sdtdh="http://schemas.microsoft.com/office/word/2020/wordml/sdtdatahash" xmlns:w16sdtfl="http://schemas.microsoft.com/office/word/2024/wordml/sdtformatlock" xmlns:w16se="http://schemas.microsoft.com/office/word/2015/wordml/symex" xmlns:wpg="http://schemas.microsoft.com/office/word/2010/wordprocessingGroup" xmlns:wpi="http://schemas.microsoft.com/office/word/2010/wordprocessingInk" xmlns:wne="http://schemas.microsoft.com/office/word/2006/wordml" xmlns:wps="http://schemas.microsoft.com/office/word/2010/wordprocessingShape" mc:Ignorable="w14 w15 w16se w16cid w16 w16cex w16sdtdh w16sdtfl w16du wp14">
+  <w15:person w15:author="Aoyu Zou">
+    <w15:presenceInfo w15:providerId="Windows Live" w15:userId="545b6b98f2c5945c"/>
+  </w15:person>
+</w15:people>
 </file>
 
 <file path=word/styles.xml><?xml version="1.0" encoding="utf-8"?>
@@ -6303,6 +7365,100 @@
       <w:u w:val="single"/>
     </w:rPr>
   </w:style>
+  <w:style w:type="paragraph" w:styleId="Revision">
+    <w:name w:val="Revision"/>
+    <w:hidden/>
+    <w:uiPriority w:val="99"/>
+    <w:semiHidden/>
+    <w:rsid w:val="00E90592"/>
+    <w:pPr>
+      <w:spacing w:after="0" w:line="240" w:lineRule="auto"/>
+    </w:pPr>
+    <w:rPr>
+      <w:rFonts w:ascii="Arial" w:eastAsia="Arial" w:hAnsi="Arial" w:cs="Arial"/>
+      <w:kern w:val="0"/>
+      <w:sz w:val="22"/>
+      <w:szCs w:val="22"/>
+      <w:lang w:val="en" w:eastAsia="en-US"/>
+      <w14:ligatures w14:val="none"/>
+    </w:rPr>
+  </w:style>
+  <w:style w:type="character" w:styleId="CommentReference">
+    <w:name w:val="annotation reference"/>
+    <w:basedOn w:val="DefaultParagraphFont"/>
+    <w:uiPriority w:val="99"/>
+    <w:semiHidden/>
+    <w:unhideWhenUsed/>
+    <w:rsid w:val="00CA063D"/>
+    <w:rPr>
+      <w:sz w:val="16"/>
+      <w:szCs w:val="16"/>
+    </w:rPr>
+  </w:style>
+  <w:style w:type="paragraph" w:styleId="CommentText">
+    <w:name w:val="annotation text"/>
+    <w:basedOn w:val="Normal"/>
+    <w:link w:val="CommentTextChar"/>
+    <w:uiPriority w:val="99"/>
+    <w:semiHidden/>
+    <w:unhideWhenUsed/>
+    <w:rsid w:val="00CA063D"/>
+    <w:pPr>
+      <w:spacing w:line="240" w:lineRule="auto"/>
+    </w:pPr>
+    <w:rPr>
+      <w:sz w:val="20"/>
+      <w:szCs w:val="20"/>
+    </w:rPr>
+  </w:style>
+  <w:style w:type="character" w:customStyle="1" w:styleId="CommentTextChar">
+    <w:name w:val="Comment Text Char"/>
+    <w:basedOn w:val="DefaultParagraphFont"/>
+    <w:link w:val="CommentText"/>
+    <w:uiPriority w:val="99"/>
+    <w:semiHidden/>
+    <w:rsid w:val="00CA063D"/>
+    <w:rPr>
+      <w:rFonts w:ascii="Arial" w:eastAsia="Arial" w:hAnsi="Arial" w:cs="Arial"/>
+      <w:kern w:val="0"/>
+      <w:sz w:val="20"/>
+      <w:szCs w:val="20"/>
+      <w:lang w:val="en" w:eastAsia="en-US"/>
+      <w14:ligatures w14:val="none"/>
+    </w:rPr>
+  </w:style>
+  <w:style w:type="paragraph" w:styleId="CommentSubject">
+    <w:name w:val="annotation subject"/>
+    <w:basedOn w:val="CommentText"/>
+    <w:next w:val="CommentText"/>
+    <w:link w:val="CommentSubjectChar"/>
+    <w:uiPriority w:val="99"/>
+    <w:semiHidden/>
+    <w:unhideWhenUsed/>
+    <w:rsid w:val="00CA063D"/>
+    <w:rPr>
+      <w:b/>
+      <w:bCs/>
+    </w:rPr>
+  </w:style>
+  <w:style w:type="character" w:customStyle="1" w:styleId="CommentSubjectChar">
+    <w:name w:val="Comment Subject Char"/>
+    <w:basedOn w:val="CommentTextChar"/>
+    <w:link w:val="CommentSubject"/>
+    <w:uiPriority w:val="99"/>
+    <w:semiHidden/>
+    <w:rsid w:val="00CA063D"/>
+    <w:rPr>
+      <w:rFonts w:ascii="Arial" w:eastAsia="Arial" w:hAnsi="Arial" w:cs="Arial"/>
+      <w:b/>
+      <w:bCs/>
+      <w:kern w:val="0"/>
+      <w:sz w:val="20"/>
+      <w:szCs w:val="20"/>
+      <w:lang w:val="en" w:eastAsia="en-US"/>
+      <w14:ligatures w14:val="none"/>
+    </w:rPr>
+  </w:style>
 </w:styles>
 </file>
 

</xml_diff>